<commit_message>
Update manuscript abstract and introduction
</commit_message>
<xml_diff>
--- a/家鸡候选位点证据分级_当前中稿.docx
+++ b/家鸡候选位点证据分级_当前中稿.docx
@@ -25,25 +25,15 @@
         <w:pStyle w:val="FirstParagraph"/>
       </w:pPr>
       <w:r>
-        <w:t xml:space="preserve">家鸡复杂性状研究已进入后关联阶段。QTL、GWAS、选择扫描、重测序和多组学研究不断扩大候选位点清单，但候选信号数量增加并不等于因果机制明确，也不等于可以直接用于育种。对于生长、饲料效率、产蛋持续性、肉质、抗病性和地方适应等多基因经济性状而言，一个候选信号能否进入育种决策，取决于其是否经过变异解析、重复验证、机制解释、功能验证和目标群体评估。本文提出一个面向家鸡候选位点的证据成熟度框架，将候选证据分为 C、B、B+ 和 A 四个阶段。C 级主要指单一关联或候选线索；B 级表示具有一定重复性或机制支持；B+ 表示高验证优先级，但不等同于准应用等级；A 级要求形成较完整的“变异或靶点—分子功能—表型”证据链，并通常需要内源编辑、自然突变或导入、体内模型、救援实验等强功能证据。与此同时，本文将目标育种群体效应、预测增益、多性状平衡、动物福利、监管和经济可行性单独作为产业适用性轴处理，以避免把功能证据强度与商业应用成熟度混为一谈。基于这一思路，本文比较生长与饲料效率、繁殖产蛋与蛋品质、抗病免疫、特色表型和地方适应等方向的代表性案例，指出当前家鸡 variant-level A 证据主要集中于主效、寡基因或结构变异控制的可见表型；多数复杂经济性状现实上仍处于 B/B+ 或 C/B 阶段。因此，复杂经济性状的长期改良仍应以基因组选择和多性状选择指数为主，标记辅助选择和基因编辑应聚焦少数强证据主效位点、明确风险位点或关键功能靶点。</w:t>
-      </w:r>
-    </w:p>
-    <w:p>
-      <w:pPr>
-        <w:pStyle w:val="BodyText"/>
-      </w:pPr>
-      <w:r>
-        <w:rPr>
-          <w:b/>
-          <w:bCs/>
-        </w:rPr>
-        <w:t xml:space="preserve">关键词：</w:t>
-      </w:r>
-      <w:r>
-        <w:t xml:space="preserve"> </w:t>
-      </w:r>
-      <w:r>
-        <w:t xml:space="preserve">家鸡；复杂性状；候选位点；证据成熟度；功能验证；精准育种</w:t>
+        <w:t>家鸡复杂性状研究已通过 QTL、GWAS、选择扫描和多组学整合积累大量候选位点。但后关联阶段的核心问题已不再是发现更多信号，而是判断已有信号处在何种证据阶段。本文提出家鸡候选位点证据成熟度与育种转化框架，将证据划分为四阶：候选线索（C）、有重复或机制支持的候选（B）、高验证优先级（B+），以及具有完整“变异—分子功能—表型”链条和强功能验证的因果证据（A）。本文的方法学贡献在于将 ClinGen、ACMG/AMP 等临床基因组学中已有的变异解释和证据分级体系适配到家鸡复杂性状和育种转化语境；同时设立独立的 T0/T1/T2 产业适用性轴，纳入群体效应、多性状平衡、动物福利、监管和经济可行性等评估维度，并与 C/B/B+/A 证据轴形成 4×3 评估矩阵。应用该框架揭示出家鸡候选位点的现实证据格局：variant-level A 证据主要集中于 SLCO1B3 蓝壳、BCDO2 黄肤、EDN3 纤维黑变和 SOX5 豌豆冠等主效可见表型；生长、饲料效率、产蛋持续性、肉质和复杂抗病性等多基因经济性状多处于 B/B+ 或 C/B 阶段；抗病性状则呈现 gene/target-level A 证据多于 variant-level A 自然变异证据的非对称格局，如 ANP32A（禽流感宿主因子）和 TVB/NHE1（禽白血病病毒（ALV）受体）。在工具选择上，基因组选择和多性状选择指数主要应用于复杂经济性状长期改良；标记辅助选择主要应用于 variant-level A + T2 主效位点；基因编辑主要应用于少数 gene/target-level A 关键靶点，并前置评估监管、福利和病原逃逸风险。</w:t>
+      </w:r>
+    </w:p>
+    <w:p>
+      <w:pPr>
+        <w:pStyle w:val="BodyText"/>
+      </w:pPr>
+      <w:r>
+        <w:t>关键词： 家鸡；候选位点；证据成熟度；后关联分析；功能验证；基因组选择；基因编辑</w:t>
       </w:r>
     </w:p>
     <w:bookmarkEnd w:id="20"/>
@@ -61,55 +51,47 @@
         <w:pStyle w:val="FirstParagraph"/>
       </w:pPr>
       <w:r>
-        <w:t xml:space="preserve">家鸡是重要的农业动物，也是发育生物学、农业遗传学和比较生物学中的经典研究对象。围绕生长速度、胴体组成、饲料效率、繁殖产蛋、蛋品质、抗病免疫和地方适应等复杂性状，家鸡遗传研究已经从早期候选基因和连锁定位，进入全基因组关联分析、重测序、多组学整合、泛基因组、单细胞图谱和基因编辑共同参与的后关联阶段。随着候选区域和候选基因数量迅速增加，真正困难的问题已经不再只是继续发现更多信号，而是判断这些信号到底有多可靠，能否被解释、被验证，并最终服务于育种决策。</w:t>
-      </w:r>
-    </w:p>
-    <w:p>
-      <w:pPr>
-        <w:pStyle w:val="BodyText"/>
-      </w:pPr>
-      <w:r>
-        <w:t xml:space="preserve">QTL、GWAS、选择扫描和多组学研究为家鸡复杂性状提供了大量候选区域，但这些结果的第一层含义通常只是“这里可能存在遗传信号”。显著 SNP 附近存在功能相关基因，并不意味着该基因就是因果基因；高低表型组之间存在差异表达，也不能直接证明该基因驱动表型差异；通路富集、染色质开放或细胞类型表达证据可以增强解释力，但通常不能替代功能验证。换言之，家鸡复杂性状研究需要从“发现了什么候选信号”，进一步转向“这些候选信号处在什么证据阶段”。</w:t>
-      </w:r>
-    </w:p>
-    <w:p>
-      <w:pPr>
-        <w:pStyle w:val="BodyText"/>
-      </w:pPr>
-      <w:r>
-        <w:t xml:space="preserve">少数经典案例说明了成熟证据链应达到的深度。蓝壳、黄肤、纤维黑变等主效或寡基因表型中，部分位点已经能够把具体变异、组织表达或调控后果与表型联系起来。这类案例的价值不只是解释某个可见表型，更重要的是为“强证据”提供参照。相比之下，许多与生长、饲料效率、产蛋持续性、肉质、抗病性和地方适应相关的候选信号，虽然具有统计关联或机制线索，却仍缺少明确因果变异、独立重复、内源功能验证或目标育种群体验证。把这些信号直接写成可用于育种的功能标记，容易造成证据外推。</w:t>
-      </w:r>
-    </w:p>
-    <w:p>
-      <w:pPr>
-        <w:pStyle w:val="BodyText"/>
-      </w:pPr>
-      <w:r>
-        <w:t xml:space="preserve">后关联阶段的新资源为候选信号证据升级提供了条件。长读长测序、泛基因组和图泛基因组有助于发现结构变异、拷贝数变异、转座子插入和参考缺失序列；ChickenGTEx、染色质开放、三维基因组和单细胞图谱可以把候选信号放入组织、细胞类型和调控网络语境中；报告基因、等位基因特异表达、细胞模型、PGC 介导编辑和体内模型则进一步连接候选变异、分子功能和表型后果。不过，这些资源在证据链中的位置并不相同：有的扩大候选空间，有的提高变异分辨率，有的增强机制解释，有的才真正接近功能验证。若不区分这些层次，就容易把统计关联、表达相关和功能因果混在一起。</w:t>
-      </w:r>
-    </w:p>
-    <w:p>
-      <w:pPr>
-        <w:pStyle w:val="BodyText"/>
-      </w:pPr>
-      <w:r>
-        <w:t xml:space="preserve">从育种转化角度看，候选位点的证据强度应决定其进入选择体系的方式。标记辅助选择更适合效应明确、检测方便且与目标表型稳定相关的主效变异或品种特征管理；对于生长、饲料效率、产蛋持续性、肉质和抗病性等多基因复杂经济性状，基因组选择通常比单个位点选择更符合其遗传结构。基因编辑和 PGC 相关体系为机制明确的关键位点提供了更直接的功能验证和定向改造路径，但编辑证据仍需经过目标群体、多性状、动物福利和监管评估后，才能进入实际育种决策。因此，MAS、GS 和基因编辑并非前后替代关系，而应分别对应不同证据等级和育种任务。</w:t>
-      </w:r>
-    </w:p>
-    <w:p>
-      <w:pPr>
-        <w:pStyle w:val="BodyText"/>
-      </w:pPr>
-      <w:r>
-        <w:t xml:space="preserve">本文尝试提出一个面向家鸡候选位点的证据成熟度框架，将候选证据划分为 C、B、B+ 和 A 四个阶段，并从变异明确度、统计重复性与稳健性、分子机制支持和功能验证强度四个方面进行判断。与此同时，本文将目标育种群体效应、预测增益、多性状平衡、动物福利、监管路径和经济可行性单独作为 T0/T1/T2 产业适用性轴处理。这样做的目的，是把“是否具有较强功能证据”和“是否已经适合产业应用”分开讨论，避免把有候选信号、有机制线索或有编辑效果直接等同于育种可用。</w:t>
-      </w:r>
-    </w:p>
-    <w:p>
-      <w:pPr>
-        <w:pStyle w:val="BodyText"/>
-      </w:pPr>
-      <w:r>
-        <w:t xml:space="preserve">需要说明的是，按证据强度分层并非本文首创。人类遗传学和动物遗传学中已经存在变异解释、基因功能解析、QTL/GWAS 数据整合和 post-GWAS 功能研究等相关思路。本文的增量不在于发明新的证据哲学，而在于将这种证据分层思想转译到家鸡复杂性状和育种转化语境中，明确区分统计发现、机制解释、功能验证和目标群体适用性。本文不试图穷尽所有家鸡候选基因，也不是系统综述或 meta 分析，而是围绕“证据分级—验证投入—育种工具选择”展开的框架型叙述综述。本文希望回答一个更接近育种决策的问题：在大量 GWAS、QTL、选择信号和多组学候选结果已经出现之后，哪些证据只能作为候选线索，哪些证据值得优先功能验证，哪些结果才具备进一步进入目标育种群体验证和转化评估的基础。</w:t>
+        <w:t>家鸡复杂性状研究已通过 QTL、GWAS、选择扫描、重测序和多组学整合积累大量候选区域；截至 Release 58（2025 年 12 月 29 日），Chicken QTLdb 已公开近 3 万条 QTL/eQTL/association 数据（Hu et al., 2016；Animal QTLdb, accessed May 31, 2026）。瓶颈已从信号发现转向：如何从候选信号建立可用于育种决策的因果证据。</w:t>
+      </w:r>
+    </w:p>
+    <w:p>
+      <w:pPr>
+        <w:pStyle w:val="BodyText"/>
+      </w:pPr>
+      <w:r>
+        <w:t>这一瓶颈来自关联证据与因果归属之间的系统性断层（详见第 2 章）。少数主效可见表型，如黄肤、豌豆冠、纤维黑变和蓝壳，已形成较清楚的“变异—分子功能—表型”链条，可作为强证据参照（Eriksson et al., 2008；Wright et al., 2009；Dorshorst et al., 2011；Wang et al., 2013）；多数复杂经济性状仍缺少同等验证深度（详见第 4 章）。</w:t>
+      </w:r>
+    </w:p>
+    <w:p>
+      <w:pPr>
+        <w:pStyle w:val="BodyText"/>
+      </w:pPr>
+      <w:r>
+        <w:t>针对这一证据深度的不对称分布，本文借鉴并扩展现有的证据分级思路。证据强度分层并非本文首创。ClinGen、ACMG/AMP 和 GRADE 已为变异解释、证据权重和干预效果评级提供成熟参照（Guyatt et al., 2008；Rehm et al., 2015；Richards et al., 2015）。本文的核心贡献是将这些体系的核心思路（变异解释、证据权重和应用阶段化）适配到家鸡复杂性状和育种转化语境，并用 T 轴把功能证据强度与产业应用成熟度分开评价。</w:t>
+      </w:r>
+    </w:p>
+    <w:p>
+      <w:pPr>
+        <w:pStyle w:val="BodyText"/>
+      </w:pPr>
+      <w:r>
+        <w:t>本文将候选证据划分为 C、B、B+ 和 A 四阶，同时设置 T0/T1/T2 产业适用性轴，纳入目标群体效应、多性状平衡、福利、监管和经济可行性。C/B/B+/A 轴回答“证据有多强”，T 轴回答“是否值得用、能否用”。具体判据见第 3 章；不同性状的应用见第 4 章；功能验证路径见第 5 章；工具匹配见第 6 章。</w:t>
+      </w:r>
+    </w:p>
+    <w:p>
+      <w:pPr>
+        <w:pStyle w:val="BodyText"/>
+      </w:pPr>
+      <w:r>
+        <w:t>本文采用 narrative review。检索以 PubMed、Web of Science 和 China National Knowledge Infrastructure（CNKI）为主，范围为 2000 年 1 月至 2024 年 12 月，部分关键文献延伸至 2025 年；关键词为 chicken/poultry 与 GWAS、QTL、causal variant、functional validation、genomic selection、marker-assisted selection（MAS）、gene editing 等组合。文献按性状和证据类型整理，优先纳入具有功能验证或机制证据的代表性位点；本文不做系统综述或 meta 分析。</w:t>
+      </w:r>
+    </w:p>
+    <w:p>
+      <w:pPr>
+        <w:pStyle w:val="BodyText"/>
+      </w:pPr>
+      <w:r>
+        <w:t>本文希望回答三个更接近育种决策的问题：(1) 哪些证据只能作为候选线索；(2) 哪些证据值得优先进入功能验证；(3) 哪些结果具备进入目标育种群体验证和转化评估的基础。本文将通过四类性状评估表明：variant-level A 证据主要集中于主效可见表型；多数复杂经济性状的现实证据上限受性状结构和表型可测量性约束，长期改良仍应以基因组选择（GS）和多性状选择指数为主。</w:t>
       </w:r>
     </w:p>
     <w:bookmarkEnd w:id="21"/>
@@ -7061,6 +7043,86 @@
     <w:bookmarkEnd w:id="46"/>
     <w:bookmarkEnd w:id="47"/>
     <w:bookmarkEnd w:id="48"/>
+    <w:p>
+      <w:pPr>
+        <w:pStyle w:val="Heading2"/>
+      </w:pPr>
+      <w:r>
+        <w:t>参考文献</w:t>
+      </w:r>
+    </w:p>
+    <w:p>
+      <w:pPr>
+        <w:pStyle w:val="BodyText"/>
+      </w:pPr>
+      <w:r>
+        <w:t>Animal QTLdb. Chicken QTLdb summary data by year and release. Release 58 (Dec. 29, 2025). https://www.animalgenome.org/cgi-bin/QTLdb/GG/summary?statu=&amp;summ=year. Accessed May 31, 2026.</w:t>
+      </w:r>
+    </w:p>
+    <w:p>
+      <w:pPr>
+        <w:pStyle w:val="BodyText"/>
+      </w:pPr>
+      <w:r>
+        <w:t>Dorshorst, B., Molin, A.-M., Rubin, C.-J., et al. 2011. A complex genomic rearrangement involving the endothelin 3 locus causes dermal hyperpigmentation in the chicken. PLoS Genetics 7:e1002412. https://doi.org/10.1371/journal.pgen.1002412.</w:t>
+      </w:r>
+    </w:p>
+    <w:p>
+      <w:pPr>
+        <w:pStyle w:val="BodyText"/>
+      </w:pPr>
+      <w:r>
+        <w:t>Eriksson, J., Larson, G., Gunnarsson, U., et al. 2008. Identification of the yellow skin gene reveals a hybrid origin of the domestic chicken. PLoS Genetics 4:e1000010. https://doi.org/10.1371/journal.pgen.1000010.</w:t>
+      </w:r>
+    </w:p>
+    <w:p>
+      <w:pPr>
+        <w:pStyle w:val="BodyText"/>
+      </w:pPr>
+      <w:r>
+        <w:t>Guyatt, G. H., Oxman, A. D., Vist, G. E., et al. 2008. GRADE: an emerging consensus on rating quality of evidence and strength of recommendations. BMJ 336:924–926. https://doi.org/10.1136/bmj.39489.470347.AD.</w:t>
+      </w:r>
+    </w:p>
+    <w:p>
+      <w:pPr>
+        <w:pStyle w:val="BodyText"/>
+      </w:pPr>
+      <w:r>
+        <w:t>Hu, Z.-L., Park, C. A., and Reecy, J. M. 2016. Developmental progress and current status of the Animal QTLdb. Nucleic Acids Research 44:D827–D833. https://doi.org/10.1093/nar/gkv1233.</w:t>
+      </w:r>
+    </w:p>
+    <w:p>
+      <w:pPr>
+        <w:pStyle w:val="BodyText"/>
+      </w:pPr>
+      <w:r>
+        <w:t>Rehm, H. L., Berg, J. S., Brooks, L. D., et al. 2015. ClinGen--the Clinical Genome Resource. New England Journal of Medicine 372:2235–2242. https://doi.org/10.1056/NEJMsr1406261.</w:t>
+      </w:r>
+    </w:p>
+    <w:p>
+      <w:pPr>
+        <w:pStyle w:val="BodyText"/>
+      </w:pPr>
+      <w:r>
+        <w:t>Richards, S., Aziz, N., Bale, S., et al. 2015. Standards and guidelines for the interpretation of sequence variants: a joint consensus recommendation of the American College of Medical Genetics and Genomics and the Association for Molecular Pathology. Genetics in Medicine 17:405–423. https://doi.org/10.1038/gim.2015.30.</w:t>
+      </w:r>
+    </w:p>
+    <w:p>
+      <w:pPr>
+        <w:pStyle w:val="BodyText"/>
+      </w:pPr>
+      <w:r>
+        <w:t>Wang, Z., Qu, L., Yao, J., et al. 2013. An EAV-HP insertion in 5′ flanking region of SLCO1B3 causes blue eggshell in the chicken. PLoS Genetics 9:e1003183. https://doi.org/10.1371/journal.pgen.1003183.</w:t>
+      </w:r>
+    </w:p>
+    <w:p>
+      <w:pPr>
+        <w:pStyle w:val="BodyText"/>
+      </w:pPr>
+      <w:r>
+        <w:t>Wright, D., Boije, H., Meadows, J. R. S., et al. 2009. Copy number variation in intron 1 of SOX5 causes the pea-comb phenotype in chickens. PLoS Genetics 5:e1000512. https://doi.org/10.1371/journal.pgen.1000512.</w:t>
+      </w:r>
+    </w:p>
     <w:sectPr/>
   </w:body>
 </w:document>

</xml_diff>

<commit_message>
Revise chapter 2 evidence boundaries and citations
</commit_message>
<xml_diff>
--- a/家鸡候选位点证据分级_当前中稿.docx
+++ b/家鸡候选位点证据分级_当前中稿.docx
@@ -109,7 +109,7 @@
         <w:pStyle w:val="FirstParagraph"/>
       </w:pPr>
       <w:r>
-        <w:t xml:space="preserve">家鸡复杂性状研究中，QTL、GWAS、选择扫描、转录组、表观组、单细胞图谱和多组学整合不断产生新的候选区域、候选基因和候选通路。这些结果对理解复杂性状遗传基础非常重要，但它们提供的通常是不同层级的证据，而不是同一种结论。一个统计关联区域、一个差异表达基因、一个开放染色质片段或一个细胞模型阳性结果，都可能为后续研究提供入口，却不能自动等同于因果变异或可用于育种的功能标记。候选清单的长度并不等于证据的厚度；某个性状已经积累了大量 GWAS 命中，和已经获得一个高可信因果位点，是两个不同问题。因此，在候选信号产生之后的精细定位、机制解析与功能验证阶段，也就是本文所说的后关联阶段，最需要解决的问题不是继续扩大候选基因列表，而是明确不同证据类型各自能说明什么、不能说明什么。</w:t>
+        <w:t>本章具体分析候选信号转化为因果证据时遇到的几类典型边界问题：统计关联（QTL、GWAS、选择信号）、机制证据（差异表达、多组学共定位、功能注释）和功能实验（体外 vs 体内）。其共同特征是各自能说明什么、不能说明什么有清楚的范围限制。候选清单的长度并不等于证据的厚度：某个性状已经积累了大量 GWAS 命中，和已经获得一个高可信因果位点，是两个不同问题。</w:t>
       </w:r>
     </w:p>
     <w:bookmarkStart w:id="22" w:name="gwasqtl-和选择信号的证据边界"/>
@@ -126,7 +126,7 @@
         <w:pStyle w:val="FirstParagraph"/>
       </w:pPr>
       <w:r>
-        <w:t xml:space="preserve">QTL 和 GWAS 的主要价值在于发现性状相关的遗传区域。QTL 依赖实验群体中的重组事件，能够提示某一染色体区段与目标性状有关；GWAS 利用自然群体或育种群体中的历史重组，可以在更高分辨率上定位与表型相关的标记。选择扫描则能够识别在驯化、品种形成或人工选择过程中受到选择的基因组区域。这些方法共同构成了候选位点发现的基础。</w:t>
+        <w:t>QTL 和 GWAS 的主要价值在于发现性状相关的遗传区域。QTL 依赖实验群体中的重组事件，能够提示某一染色体区段与目标性状有关；GWAS 利用自然群体或育种群体中的历史重组，可以在更高分辨率上定位与表型相关的标记。选择扫描则能够识别在驯化、品种形成或人工选择过程中受到选择的基因组区域。这些方法共同构成了候选位点发现的基础（Hu et al., 2016）。</w:t>
       </w:r>
     </w:p>
     <w:p>
@@ -142,7 +142,7 @@
         <w:pStyle w:val="BodyText"/>
       </w:pPr>
       <w:r>
-        <w:t xml:space="preserve">更复杂的变异形式进一步说明了“显著 SNP 不等于因果变异”。家鸡中若干强效表型并非由最显著 SNP 本身解释，而是涉及结构变异、拷贝数变化或组织特异性调控变异。例如，豌豆冠与 SOX5 第 1 内含子中的重复序列扩增有关；黄肤与 BCDO2 在皮肤中的组织特异性调控变异有关；部分性连锁羽速性状也涉及 Z 染色体 PRLR/SPEF2 相关区域的复杂变异。这些案例说明，当显著 SNP 只是与更复杂的功能变异处于连锁不平衡时，原始关联峰可能偏离真实因果位点。仅依赖常规 SNP 关联，往往难以识别这类变异结构，也难以判断真正发挥作用的是 SNP 本身，还是其背后的结构变异、单倍型或参考基因组缺失序列。</w:t>
+        <w:t>更复杂的变异形式进一步说明了“显著 SNP 不等于因果变异”。家鸡中若干强效表型并非由最显著 SNP 本身解释，而是涉及结构变异、拷贝数变化或组织特异性调控变异。例如，豌豆冠与 SOX5 第 1 内含子中的重复序列扩增有关，黄肤与 BCDO2 在皮肤中的组织特异性调控变异有关，部分性连锁羽速性状也涉及 Z 染色体 PRLR/SPEF2 相关区域的复杂变异（Eriksson et al., 2008；Elferink et al., 2008；Wright et al., 2009）。这些案例说明，当显著 SNP 只是与更复杂的功能变异处于连锁不平衡时，原始关联峰可能偏离真实因果位点。仅依赖常规 SNP 关联，往往难以识别这类变异结构，也难以判断真正发挥作用的是 SNP 本身，还是其背后的结构变异、单倍型或参考基因组缺失序列，即与参考基因组相比的非参考序列（non-reference sequences）（Rice et al., 2023）。</w:t>
       </w:r>
     </w:p>
     <w:p>
@@ -158,15 +158,7 @@
         <w:pStyle w:val="BodyText"/>
       </w:pPr>
       <w:r>
-        <w:t xml:space="preserve">产蛋性状中的若干重复信号可以说明统计证据的价值和边界。PRLR 附近区域、NCAPG-FAM184B 区段以及鸡 Z 染色体（GGAZ）上部分区域在多个产蛋相关 GWAS 中反复出现，提示这些区域具有较高的验证优先级。可是，在具体因果变异、靶组织、作用阶段和目标育种群体效应尚未明确之前，它们更适合作为精细定位、跨群体验证和 GS 加权先验的对象，而不是直接作为功能标记进入 MAS。</w:t>
-      </w:r>
-    </w:p>
-    <w:p>
-      <w:pPr>
-        <w:pStyle w:val="BodyText"/>
-      </w:pPr>
-      <w:r>
-        <w:t xml:space="preserve">因此，QTL、GWAS 和选择扫描通常应被视为证据链的起点。它们可以提出候选区域，帮助确定后续精细定位和功能验证方向，但不能单独完成从“关联”到“因果”的转换。只有当关联信号在独立群体或相关性状中重复出现，并进一步与明确变异、分子机制和功能后果相连接时，候选位点的证据成熟度才会真正提高。即使在某一群体中已经获得较强证据，该证据也不能自动推广到所有品系或育种群体；因果异质性和跨群体迁移性本身就需要单独评估。</w:t>
+        <w:t>因此，QTL、GWAS 和选择扫描通常应被视为证据链的起点。它们可以提出候选区域，帮助确定后续精细定位和功能验证方向，但不能单独完成从“关联”到“因果”的转换。只有当关联信号在独立群体或相关性状中重复出现，并进一步与明确变异、分子机制和功能后果相连接时，候选位点的证据成熟度才会真正提高。即使在某一群体中已经获得较强证据，该证据也不能自动推广到所有品系或育种群体；因果异质性（causal heterogeneity）和跨群体迁移性（cross-population transferability）本身就需要单独评估。</w:t>
       </w:r>
     </w:p>
     <w:bookmarkEnd w:id="22"/>
@@ -184,7 +176,7 @@
         <w:pStyle w:val="FirstParagraph"/>
       </w:pPr>
       <w:r>
-        <w:t xml:space="preserve">转录组和多组学研究常被用于解释候选区域中的可能作用基因。高低表型组之间的差异表达、目标组织中的高表达、通路富集、染色质开放、转录因子结合位点、三维互作和单细胞表达模式，都可以增强候选基因的生物学合理性。这些证据的价值在于帮助研究者判断候选信号可能在哪个组织、哪个细胞类型、哪个发育阶段或哪个调控网络中发挥作用。</w:t>
+        <w:t>转录组和多组学研究常被用于解释候选区域中的可能作用基因。高低表型组之间的差异表达、目标组织中的高表达、通路富集、染色质可及性、转录因子结合位点、三维互作和单细胞表达模式，都可以增强候选基因的生物学合理性。这些证据的价值在于帮助研究者判断候选信号可能在哪个组织、哪个细胞类型、哪个发育阶段或哪个调控网络中发挥作用。</w:t>
       </w:r>
     </w:p>
     <w:p>
@@ -200,31 +192,31 @@
         <w:pStyle w:val="BodyText"/>
       </w:pPr>
       <w:r>
-        <w:t xml:space="preserve">功能注释资源也需要谨慎使用。候选 SNP 落在开放染色质区域、增强子区域或目标细胞类型表达基因附近，可以提高其作为调控变异的可能性，但空间重叠并不等于同一遗传信号。真正有力的机制证据应尽量证明关联信号与表达、剪接、甲基化或染色质状态之间存在一致的遗传基础。coloc、SMR/HEIDI、eCAVIAR 等共定位框架，可以部分检验关联信号与分子表型是否可能共享同一因果变异；等位基因特异表达、等位基因特异染色质开放或方向一致的调控效应，也通常比单纯“附近有开放染色质”更有说服力。不过，这些方法本身仍受样本量、组织覆盖、连锁不平衡结构、检验功效和分子表型质量限制，不能直接解释为因果证明。</w:t>
-      </w:r>
-    </w:p>
-    <w:p>
-      <w:pPr>
-        <w:pStyle w:val="BodyText"/>
-      </w:pPr>
-      <w:r>
-        <w:t xml:space="preserve">PHIP 非编码变异和 rs734209466–IGFBP2/IGFBP5 调控链可以作为较强机制证据的例子。前者提示非编码变异可能通过转录因子结合和 PHIP 表达影响颗粒细胞相关功能；后者提示等位基因特异增强子和三维调控可能参与 IGFBP2/IGFBP5 表达及脂前体细胞表型调节。这类研究明显强于普通 GWAS 邻近基因注释，也能显著提高候选位点的验证优先级。可是，只要还缺少内源编辑、体内因果验证、跨群体重复或目标育种群体稳定性评估，它们仍应被解释为中高强度机制证据，而不是直接上升为强因果证据或应用位点。</w:t>
-      </w:r>
-    </w:p>
-    <w:p>
-      <w:pPr>
-        <w:pStyle w:val="BodyText"/>
-      </w:pPr>
-      <w:r>
-        <w:t xml:space="preserve">单细胞图谱可以提高候选信号的细胞类型定位精度，但这种提升增加的是解释分辨率，而不是因果性。单细胞证据可以回答某个候选基因可能在哪类细胞中表达、在什么发育阶段活跃、与哪些细胞状态相关，却不能直接回答候选变异是否驱动性状分化。它在证据链中适合作为一致性证据出现，不适合作为升级到因果结论的独立依据。只有当单细胞表达模式与遗传关联、分子 QTL、等位基因特异调控或扰动实验形成一致证据链时，它才更适合作为候选位点证据升级的依据。</w:t>
-      </w:r>
-    </w:p>
-    <w:p>
-      <w:pPr>
-        <w:pStyle w:val="BodyText"/>
-      </w:pPr>
-      <w:r>
-        <w:t xml:space="preserve">表型测量质量也会限制多组学证据能够达到的上限。无论上游分子证据多复杂，最终判定仍依赖表型本身是否稳定、可重复、可比较。蛋品质、饲料效率、肉质、抗病终点和地方适应指标的测定重复性差异，会直接影响关联信号的可靠性，也会系统性压缩下游分子证据可能达到的因果强度。如果表型定义不一致、测量误差较大或环境控制不足，即使获得差异表达或功能注释支持，证据等级也不宜过度提高。</w:t>
+        <w:t>功能注释资源也需要谨慎使用。候选 SNP 落在染色质可及区域、增强子区域或目标细胞类型表达基因附近，可以提高其作为调控变异的可能性，但空间重叠并不等于同一遗传信号。真正有力的机制证据应尽量证明关联信号与表达、剪接、甲基化、染色质可及性或染色质修饰之间存在一致的遗传基础。coloc、SMR/HEIDI、eCAVIAR 等共定位框架，可以部分检验关联信号与分子表型是否可能共享同一因果变异（Giambartolomei et al., 2014；Zhu et al., 2016；Hormozdiari et al., 2016）；等位基因特异表达、等位基因特异染色质开放或方向一致的调控效应，也通常比单纯“附近有开放染色质”更有说服力。不过，这些方法本身仍受样本量、组织覆盖、连锁不平衡结构、检验功效和分子表型质量限制，不能直接解释为因果证明。</w:t>
+      </w:r>
+    </w:p>
+    <w:p>
+      <w:pPr>
+        <w:pStyle w:val="BodyText"/>
+      </w:pPr>
+      <w:r>
+        <w:t>这一标准在具体案例中如何兑现，可以从 PHIP 非编码变异和 rs734209466–IGFBP2/IGFBP5 调控链看到。前者提示非编码变异可能通过转录因子结合和 PHIP 表达影响颗粒细胞相关功能；后者提示等位基因特异增强子和三维调控可能参与 IGFBP2/IGFBP5 表达及脂前体细胞表型调节（Shen et al., 2024；Wang et al., 2025）。这类研究明显强于普通 GWAS 邻近基因注释，也能显著提高候选位点的验证优先级。可是，只要还缺少内源编辑、体内因果验证、跨群体重复或目标育种群体稳定性评估，它们仍应被解释为机制证据较强的候选位点。其具体评级（rs734209466–IGFBP2/IGFBP5 在 4.1 节评为 B+，PHIP 在 4.2 节评为 B）取决于变异层证据互证程度的差异，这一差异将在第 4 章相关案例段中具体说明。</w:t>
+      </w:r>
+    </w:p>
+    <w:p>
+      <w:pPr>
+        <w:pStyle w:val="BodyText"/>
+      </w:pPr>
+      <w:r>
+        <w:t>除了机制层面的多组学共定位证据外，单细胞图谱也提供了一种新的解析维度，但其证据贡献需要单独评估。单细胞图谱可以提高候选信号的细胞类型定位精度，但这种提升增加的是解释分辨率，而不是因果性。单细胞证据可以回答某个候选基因可能在哪类细胞中表达、在什么发育阶段活跃、与哪些细胞状态相关，却不能直接回答候选变异是否驱动性状分化。它在证据链中适合作为一致性证据出现，不适合作为升级到因果结论的独立依据。只有当单细胞表达模式与遗传关联、分子 QTL、等位基因特异调控或扰动实验形成一致证据链时，它才更适合作为候选位点证据升级的依据。</w:t>
+      </w:r>
+    </w:p>
+    <w:p>
+      <w:pPr>
+        <w:pStyle w:val="BodyText"/>
+      </w:pPr>
+      <w:r>
+        <w:t>上述所有多组学证据的可达上限还受到一个更基础因素的制约：表型测量质量。无论上游分子证据多复杂，最终判定仍依赖表型本身是否稳定、可重复、可比较。蛋品质、饲料效率、肉质、抗病终点和地方适应指标的测定重复性差异，会直接影响关联信号的可靠性，也会系统性压缩下游分子证据可能达到的因果强度。如果表型定义不一致、测量误差较大或环境控制不足，即使获得差异表达或功能注释支持，证据等级也不宜过度提高。</w:t>
       </w:r>
     </w:p>
     <w:p>
@@ -250,39 +242,39 @@
         <w:pStyle w:val="FirstParagraph"/>
       </w:pPr>
       <w:r>
-        <w:t xml:space="preserve">功能实验是候选位点证据升级的关键环节，但不同实验体系提供的证据强度并不相同。报告基因实验可以检验某段序列是否具有调控活性；过表达、敲低或细胞模型可以判断某个基因是否影响细胞表型；CRISPRa/i 可以测试调控方向；体外病毒复制实验可以初步评估宿主因子对病原复制的影响。这些实验比单纯关联或表达证据更进一步，但这类实验结果多数仍属于中等强度功能证据。</w:t>
-      </w:r>
-    </w:p>
-    <w:p>
-      <w:pPr>
-        <w:pStyle w:val="BodyText"/>
-      </w:pPr>
-      <w:r>
-        <w:t xml:space="preserve">报告基因实验的边界尤其需要写清楚。它通常把候选序列从原生染色质环境中剥离，放入人工载体或简化的调控上下文中检验转录调控潜力。阳性结果说明该序列有能力驱动或改变转录，但不能说明它在目标组织、目标发育阶段、目标染色质状态和目标遗传背景下实际上承担相同调控功能。类似地，过表达或敲低实验能够显示某个基因具有影响细胞状态的能力，却不能证明自然群体中的某个等位变异正是通过该基因驱动表型差异。细胞模型阳性也不能直接外推为体内表型成立，尤其是对于产蛋、饲料效率、抗病性、肉质和适应性这类多组织、多阶段、多环境共同参与的复杂性状。</w:t>
-      </w:r>
-    </w:p>
-    <w:p>
-      <w:pPr>
-        <w:pStyle w:val="BodyText"/>
-      </w:pPr>
-      <w:r>
-        <w:t xml:space="preserve">更强的功能证据通常需要把候选变异、内源分子效应和体内表型连接起来。内源编辑、自然突变或等位基因导入、PGC 介导编辑、体内模型、救援实验以及在目标群体中的等位基因效应验证，能够更直接地回答候选变异或靶点是否影响表型。对于自然变异位点，理想证据链应包括明确变异、可靠分型、稳定关联、目标组织中的分子效应、功能扰动结果和体内表型后果。对于编辑靶点，强功能证据可以证明基因或靶点影响某一表型，但仍不能自动证明自然群体中存在可直接利用的功能等位变异。</w:t>
-      </w:r>
-    </w:p>
-    <w:p>
-      <w:pPr>
-        <w:pStyle w:val="BodyText"/>
-      </w:pPr>
-      <w:r>
-        <w:t xml:space="preserve">功能与应用的区分对抗病和基因编辑研究尤其重要。以宿主因子编辑研究为例，编辑后表现出抗病表型可以证明该基因具有功能作用，但是否能进入育种应用，受病原逃逸、补偿通路、多性状影响、动物福利、监管路径和产业接受度等独立因素约束。换言之，强功能证据回答的是“靶点是否有功能”，而育种应用还需要单独回答“在目标群体中是否值得用、能否用、用多少”。因此，功能验证强度和育种转化成熟度应作为两个不同问题处理：前者回答生物学因果性，后者回答育种转化适用性。这也是本文将证据成熟度与产业适用性分开评价的原因。</w:t>
-      </w:r>
-    </w:p>
-    <w:p>
-      <w:pPr>
-        <w:pStyle w:val="BodyText"/>
-      </w:pPr>
-      <w:r>
-        <w:t xml:space="preserve">综上，候选信号从发现到应用至少要经历几个层次：统计关联提出线索，多组学和功能注释提供机制语境，体外实验提供初步功能支持，内源或体内证据增强因果判断，目标群体验证和多性状评估决定育种适用性。只有区分这些层次，才能避免把候选线索提前包装成因果位点，也能更合理地分配后续验证投入。基于这一逻辑，下一节将把候选位点证据拆分为变异明确度、统计重复性与稳健性、分子机制支持和功能验证强度四个维度，并将目标群体、多性状、福利、监管和经济可行性作为独立产业适用性轴处理。</w:t>
+        <w:t>功能实验是候选位点证据升级的关键环节，但不同实验体系提供的证据强度并不相同。报告基因实验可以检验某段序列是否具有调控活性；MPRA 可高通量测试大量候选调控片段；过表达、敲低或细胞模型可以判断某个基因是否影响细胞表型；CRISPRa/i 可以测试调控方向；体外病毒复制实验可以初步评估宿主因子对病原复制的影响（Inoue and Ahituv, 2015；Kampmann, 2018）。这些实验比单纯关联或表达证据更进一步，但这类实验结果多数仍属于中等强度功能证据。</w:t>
+      </w:r>
+    </w:p>
+    <w:p>
+      <w:pPr>
+        <w:pStyle w:val="BodyText"/>
+      </w:pPr>
+      <w:r>
+        <w:t>报告基因实验的边界尤其需要写清楚。它通常把候选序列从原生染色质环境中剥离，放入人工载体或简化的调控上下文中检验转录调控潜力。例如，rs734209466–IGFBP2/IGFBP5 研究中的 luciferase 报告基因实验证明了等位基因特异增强子活性，但这类证据仍需要与内源表达、三维互作和细胞表型共同解释（Shen et al., 2024）。阳性结果说明该序列有能力驱动或改变转录，但不能说明它在目标组织、目标发育阶段、目标染色质可及性和目标遗传背景下实际上承担相同调控功能。类似地，过表达或敲低实验能够显示某个基因具有影响细胞状态的能力，却不能证明自然群体中的某个等位变异正是通过该基因驱动表型差异。细胞模型阳性也不能直接外推为体内表型成立，尤其是对于产蛋、饲料效率、抗病性、肉质和适应性这类多组织、多阶段、多环境共同参与的复杂性状。</w:t>
+      </w:r>
+    </w:p>
+    <w:p>
+      <w:pPr>
+        <w:pStyle w:val="BodyText"/>
+      </w:pPr>
+      <w:r>
+        <w:t>更强的功能证据通常需要把候选变异、内源分子效应和体内表型连接起来。内源编辑、自然突变或等位基因导入、PGC 介导编辑、体内模型、救援实验以及在目标群体中的等位基因效应验证，能够更直接地回答候选变异或靶点是否影响表型。鸡 PGC 的长期培养和生殖系传递为家鸡内源编辑提供了关键技术基础（van de Lavoir et al., 2006；Whyte et al., 2015），ANP32A 编辑鸡则展示了 PGC 介导编辑如何把宿主因子、病毒复制和体内抗感染表型连接起来（Idoko-Akoh et al., 2023）。对于自然变异位点，理想证据链应包括明确变异、可靠分型、稳定关联、目标组织中的分子效应、功能扰动结果和体内表型后果。对于编辑靶点，强功能证据可以证明基因或靶点影响某一表型，但仍不能自动证明自然群体中存在可直接利用的功能等位变异。</w:t>
+      </w:r>
+    </w:p>
+    <w:p>
+      <w:pPr>
+        <w:pStyle w:val="BodyText"/>
+      </w:pPr>
+      <w:r>
+        <w:t>功能与应用的区分对抗病和基因编辑研究尤其重要。以 ANP32A 宿主因子编辑研究为例，编辑后表现出抗病表型可以证明该基因具有功能作用，但是否能进入育种应用，仍受病原逃逸、补偿通路、多性状影响、动物福利、监管路径和产业接受度等独立因素约束（Idoko-Akoh et al., 2023）。换言之，强功能证据回答的是“靶点是否有功能”，而育种应用还需要单独回答“在目标群体中是否值得用、能否用、用多少”。因此，功能验证强度和育种转化成熟度应作为两个不同问题处理：前者回答生物学因果性，后者回答育种转化适用性。这也是本文将证据成熟度与产业适用性分开评价的原因。</w:t>
+      </w:r>
+    </w:p>
+    <w:p>
+      <w:pPr>
+        <w:pStyle w:val="BodyText"/>
+      </w:pPr>
+      <w:r>
+        <w:t>综上，候选信号从发现到应用至少要经历几个层次：统计关联提出线索，多组学和功能注释提供机制语境，体外实验提供初步功能支持，内源或体内证据增强因果判断，目标群体验证和多性状评估决定育种适用性。只有区分这些层次，才能避免把候选线索提前包装成因果位点，也能更合理地分配后续验证投入。基于这一逻辑，第 3 章将把候选位点证据拆分为变异明确度、统计重复性与稳健性、分子机制支持和功能验证强度四个维度，并将目标群体、多性状、福利、监管和经济可行性作为独立产业适用性轴处理。</w:t>
       </w:r>
     </w:p>
     <w:bookmarkEnd w:id="24"/>
@@ -7072,6 +7064,14 @@
         <w:pStyle w:val="BodyText"/>
       </w:pPr>
       <w:r>
+        <w:t>Elferink, M. G., Vallee, A. A., Jungerius, A. P., Crooijmans, R. P. M. A., and Groenen, M. A. M. 2008. Partial duplication of the PRLR and SPEF2 genes at the late feathering locus in chicken. BMC Genomics 9:391. https://doi.org/10.1186/1471-2164-9-391.</w:t>
+      </w:r>
+    </w:p>
+    <w:p>
+      <w:pPr>
+        <w:pStyle w:val="BodyText"/>
+      </w:pPr>
+      <w:r>
         <w:t>Eriksson, J., Larson, G., Gunnarsson, U., et al. 2008. Identification of the yellow skin gene reveals a hybrid origin of the domestic chicken. PLoS Genetics 4:e1000010. https://doi.org/10.1371/journal.pgen.1000010.</w:t>
       </w:r>
     </w:p>
@@ -7080,39 +7080,119 @@
         <w:pStyle w:val="BodyText"/>
       </w:pPr>
       <w:r>
-        <w:t>Guyatt, G. H., Oxman, A. D., Vist, G. E., et al. 2008. GRADE: an emerging consensus on rating quality of evidence and strength of recommendations. BMJ 336:924–926. https://doi.org/10.1136/bmj.39489.470347.AD.</w:t>
-      </w:r>
-    </w:p>
-    <w:p>
-      <w:pPr>
-        <w:pStyle w:val="BodyText"/>
-      </w:pPr>
-      <w:r>
-        <w:t>Hu, Z.-L., Park, C. A., and Reecy, J. M. 2016. Developmental progress and current status of the Animal QTLdb. Nucleic Acids Research 44:D827–D833. https://doi.org/10.1093/nar/gkv1233.</w:t>
-      </w:r>
-    </w:p>
-    <w:p>
-      <w:pPr>
-        <w:pStyle w:val="BodyText"/>
-      </w:pPr>
-      <w:r>
-        <w:t>Rehm, H. L., Berg, J. S., Brooks, L. D., et al. 2015. ClinGen--the Clinical Genome Resource. New England Journal of Medicine 372:2235–2242. https://doi.org/10.1056/NEJMsr1406261.</w:t>
-      </w:r>
-    </w:p>
-    <w:p>
-      <w:pPr>
-        <w:pStyle w:val="BodyText"/>
-      </w:pPr>
-      <w:r>
-        <w:t>Richards, S., Aziz, N., Bale, S., et al. 2015. Standards and guidelines for the interpretation of sequence variants: a joint consensus recommendation of the American College of Medical Genetics and Genomics and the Association for Molecular Pathology. Genetics in Medicine 17:405–423. https://doi.org/10.1038/gim.2015.30.</w:t>
-      </w:r>
-    </w:p>
-    <w:p>
-      <w:pPr>
-        <w:pStyle w:val="BodyText"/>
-      </w:pPr>
-      <w:r>
-        <w:t>Wang, Z., Qu, L., Yao, J., et al. 2013. An EAV-HP insertion in 5′ flanking region of SLCO1B3 causes blue eggshell in the chicken. PLoS Genetics 9:e1003183. https://doi.org/10.1371/journal.pgen.1003183.</w:t>
+        <w:t>Giambartolomei, C., Vukcevic, D., Schadt, E. E., et al. 2014. Bayesian test for colocalisation between pairs of genetic association studies using summary statistics. PLoS Genetics 10:e1004383. https://doi.org/10.1371/journal.pgen.1004383.</w:t>
+      </w:r>
+    </w:p>
+    <w:p>
+      <w:pPr>
+        <w:pStyle w:val="BodyText"/>
+      </w:pPr>
+      <w:r>
+        <w:t>Guyatt, G. H., Oxman, A. D., Vist, G. E., et al. 2008. GRADE: an emerging consensus on rating quality of evidence and strength of recommendations. BMJ 336:924-926. https://doi.org/10.1136/bmj.39489.470347.AD.</w:t>
+      </w:r>
+    </w:p>
+    <w:p>
+      <w:pPr>
+        <w:pStyle w:val="BodyText"/>
+      </w:pPr>
+      <w:r>
+        <w:t>Hormozdiari, F., van de Bunt, M., Segre, A. V., et al. 2016. Colocalization of GWAS and eQTL signals detects target genes. American Journal of Human Genetics 99:1245-1260. https://doi.org/10.1016/j.ajhg.2016.10.003.</w:t>
+      </w:r>
+    </w:p>
+    <w:p>
+      <w:pPr>
+        <w:pStyle w:val="BodyText"/>
+      </w:pPr>
+      <w:r>
+        <w:t>Hu, Z.-L., Park, C. A., and Reecy, J. M. 2016. Developmental progress and current status of the Animal QTLdb. Nucleic Acids Research 44:D827-D833. https://doi.org/10.1093/nar/gkv1233.</w:t>
+      </w:r>
+    </w:p>
+    <w:p>
+      <w:pPr>
+        <w:pStyle w:val="BodyText"/>
+      </w:pPr>
+      <w:r>
+        <w:t>Idoko-Akoh, A., Goldhill, D. H., Sheppard, C. M., et al. 2023. Creating resistance to avian influenza infection through genome editing of the ANP32 gene family. Nature Communications 14:6136. https://doi.org/10.1038/s41467-023-41476-3.</w:t>
+      </w:r>
+    </w:p>
+    <w:p>
+      <w:pPr>
+        <w:pStyle w:val="BodyText"/>
+      </w:pPr>
+      <w:r>
+        <w:t>Inoue, F., and Ahituv, N. 2015. Decoding enhancers using massively parallel reporter assays. Genomics 106:159-164. https://doi.org/10.1016/j.ygeno.2015.06.005.</w:t>
+      </w:r>
+    </w:p>
+    <w:p>
+      <w:pPr>
+        <w:pStyle w:val="BodyText"/>
+      </w:pPr>
+      <w:r>
+        <w:t>Kampmann, M. 2018. CRISPRi and CRISPRa screens in mammalian cells for precision biology and medicine. ACS Chemical Biology 13:406-416. https://doi.org/10.1021/acschembio.7b00657.</w:t>
+      </w:r>
+    </w:p>
+    <w:p>
+      <w:pPr>
+        <w:pStyle w:val="BodyText"/>
+      </w:pPr>
+      <w:r>
+        <w:t>Rehm, H. L., Berg, J. S., Brooks, L. D., et al. 2015. ClinGen--the Clinical Genome Resource. New England Journal of Medicine 372:2235-2242. https://doi.org/10.1056/NEJMsr1406261.</w:t>
+      </w:r>
+    </w:p>
+    <w:p>
+      <w:pPr>
+        <w:pStyle w:val="BodyText"/>
+      </w:pPr>
+      <w:r>
+        <w:t>Rice, E. S., Alberdi, A., Alfieri, J., et al. 2023. A pangenome graph reference of 30 chicken genomes allows genotyping of large and complex structural variants. BMC Biology 21:267. https://doi.org/10.1186/s12915-023-01758-0.</w:t>
+      </w:r>
+    </w:p>
+    <w:p>
+      <w:pPr>
+        <w:pStyle w:val="BodyText"/>
+      </w:pPr>
+      <w:r>
+        <w:t>Richards, S., Aziz, N., Bale, S., et al. 2015. Standards and guidelines for the interpretation of sequence variants: a joint consensus recommendation of the American College of Medical Genetics and Genomics and the Association for Molecular Pathology. Genetics in Medicine 17:405-423. https://doi.org/10.1038/gim.2015.30.</w:t>
+      </w:r>
+    </w:p>
+    <w:p>
+      <w:pPr>
+        <w:pStyle w:val="BodyText"/>
+      </w:pPr>
+      <w:r>
+        <w:t>Shen, L., Bai, X., Zhao, L., et al. 2024. Integrative 3D genomics with multi-omics analysis and functional validation of genetic regulatory mechanisms of abdominal fat deposition in chickens. Nature Communications 15:9274. https://doi.org/10.1038/s41467-024-53692-6.</w:t>
+      </w:r>
+    </w:p>
+    <w:p>
+      <w:pPr>
+        <w:pStyle w:val="BodyText"/>
+      </w:pPr>
+      <w:r>
+        <w:t>van de Lavoir, M.-C., Diamond, J. H., Leighton, P. A., et al. 2006. Germline transmission of genetically modified primordial germ cells. Nature 441:766-769. https://doi.org/10.1038/nature04831.</w:t>
+      </w:r>
+    </w:p>
+    <w:p>
+      <w:pPr>
+        <w:pStyle w:val="BodyText"/>
+      </w:pPr>
+      <w:r>
+        <w:t>Wang, D., Zhu, Y., Dong, J., Zhi, Y., Wei, G., Kang, X., and Liu, X. 2025. Exploring the functional variations of key candidate genes affecting egg production by hypothalamic-pituitary-ovarian axis in chickens. Poultry Science 104:105027. https://doi.org/10.1016/j.psj.2025.105027.</w:t>
+      </w:r>
+    </w:p>
+    <w:p>
+      <w:pPr>
+        <w:pStyle w:val="BodyText"/>
+      </w:pPr>
+      <w:r>
+        <w:t>Wang, Z., Qu, L., Yao, J., et al. 2013. An EAV-HP insertion in 5 flanking region of SLCO1B3 causes blue eggshell in the chicken. PLoS Genetics 9:e1003183. https://doi.org/10.1371/journal.pgen.1003183.</w:t>
+      </w:r>
+    </w:p>
+    <w:p>
+      <w:pPr>
+        <w:pStyle w:val="BodyText"/>
+      </w:pPr>
+      <w:r>
+        <w:t>Whyte, J., Glover, J. D., Woodcock, M., et al. 2015. FGF, insulin, and SMAD signaling cooperate for avian primordial germ cell self-renewal. Stem Cell Reports 5:1171-1182. https://doi.org/10.1016/j.stemcr.2015.10.008.</w:t>
       </w:r>
     </w:p>
     <w:p>
@@ -7121,6 +7201,14 @@
       </w:pPr>
       <w:r>
         <w:t>Wright, D., Boije, H., Meadows, J. R. S., et al. 2009. Copy number variation in intron 1 of SOX5 causes the pea-comb phenotype in chickens. PLoS Genetics 5:e1000512. https://doi.org/10.1371/journal.pgen.1000512.</w:t>
+      </w:r>
+    </w:p>
+    <w:p>
+      <w:pPr>
+        <w:pStyle w:val="BodyText"/>
+      </w:pPr>
+      <w:r>
+        <w:t>Zhu, Z., Zhang, F., Hu, H., et al. 2016. Integration of summary data from GWAS and eQTL studies predicts complex trait gene targets. Nature Genetics 48:481-487. https://doi.org/10.1038/ng.3538.</w:t>
       </w:r>
     </w:p>
     <w:sectPr/>

</xml_diff>

<commit_message>
Polish chapter 2 citations and wording
</commit_message>
<xml_diff>
--- a/家鸡候选位点证据分级_当前中稿.docx
+++ b/家鸡候选位点证据分级_当前中稿.docx
@@ -109,7 +109,7 @@
         <w:pStyle w:val="FirstParagraph"/>
       </w:pPr>
       <w:r>
-        <w:t>本章具体分析候选信号转化为因果证据时遇到的几类典型边界问题：统计关联（QTL、GWAS、选择信号）、机制证据（差异表达、多组学共定位、功能注释）和功能实验（体外 vs 体内）。其共同特征是各自能说明什么、不能说明什么有清楚的范围限制。候选清单的长度并不等于证据的厚度：某个性状已经积累了大量 GWAS 命中，和已经获得一个高可信因果位点，是两个不同问题。</w:t>
+        <w:t>本章具体分析候选信号转化为因果证据时遇到的几类典型边界问题：统计关联（QTL、GWAS、选择信号）、机制证据（差异表达、多组学共定位、功能注释）和功能实验（体外 vs 体内）。这些证据类型有一个共同特征：各自有清楚的解释边界——能说明什么、不能说明什么。候选清单的长度并不等于证据的厚度：某个性状已经积累了大量 GWAS 命中，和已经获得一个高可信因果位点，是两个不同问题。</w:t>
       </w:r>
     </w:p>
     <w:bookmarkStart w:id="22" w:name="gwasqtl-和选择信号的证据边界"/>
@@ -142,7 +142,7 @@
         <w:pStyle w:val="BodyText"/>
       </w:pPr>
       <w:r>
-        <w:t>更复杂的变异形式进一步说明了“显著 SNP 不等于因果变异”。家鸡中若干强效表型并非由最显著 SNP 本身解释，而是涉及结构变异、拷贝数变化或组织特异性调控变异。例如，豌豆冠与 SOX5 第 1 内含子中的重复序列扩增有关，黄肤与 BCDO2 在皮肤中的组织特异性调控变异有关，部分性连锁羽速性状也涉及 Z 染色体 PRLR/SPEF2 相关区域的复杂变异（Eriksson et al., 2008；Elferink et al., 2008；Wright et al., 2009）。这些案例说明，当显著 SNP 只是与更复杂的功能变异处于连锁不平衡时，原始关联峰可能偏离真实因果位点。仅依赖常规 SNP 关联，往往难以识别这类变异结构，也难以判断真正发挥作用的是 SNP 本身，还是其背后的结构变异、单倍型或参考基因组缺失序列，即与参考基因组相比的非参考序列（non-reference sequences）（Rice et al., 2023）。</w:t>
+        <w:t>更复杂的变异形式进一步说明了“显著 SNP 不等于因果变异”。家鸡中若干强效表型并非由最显著 SNP 本身解释，而是涉及结构变异、拷贝数变化或组织特异性调控变异。例如，豌豆冠与 SOX5 第 1 内含子中的重复序列扩增有关，黄肤与 BCDO2 在皮肤中的组织特异性调控变异有关，部分性连锁羽速性状也涉及 Z 染色体 PRLR/SPEF2 相关区域的复杂变异（Wright et al., 2009；Eriksson et al., 2008；Elferink et al., 2008）。这些案例说明，当显著 SNP 只是与更复杂的功能变异处于连锁不平衡时，原始关联峰可能偏离真实因果位点。仅依赖常规 SNP 关联，往往难以识别这类变异结构，也难以判断真正发挥作用的是 SNP 本身，还是其背后的结构变异、单倍型或参考基因组缺失序列，即与参考基因组相比的非参考序列（non-reference sequences）（Rice et al., 2023）。</w:t>
       </w:r>
     </w:p>
     <w:p>
@@ -200,7 +200,7 @@
         <w:pStyle w:val="BodyText"/>
       </w:pPr>
       <w:r>
-        <w:t>这一标准在具体案例中如何兑现，可以从 PHIP 非编码变异和 rs734209466–IGFBP2/IGFBP5 调控链看到。前者提示非编码变异可能通过转录因子结合和 PHIP 表达影响颗粒细胞相关功能；后者提示等位基因特异增强子和三维调控可能参与 IGFBP2/IGFBP5 表达及脂前体细胞表型调节（Shen et al., 2024；Wang et al., 2025）。这类研究明显强于普通 GWAS 邻近基因注释，也能显著提高候选位点的验证优先级。可是，只要还缺少内源编辑、体内因果验证、跨群体重复或目标育种群体稳定性评估，它们仍应被解释为机制证据较强的候选位点。其具体评级（rs734209466–IGFBP2/IGFBP5 在 4.1 节评为 B+，PHIP 在 4.2 节评为 B）取决于变异层证据互证程度的差异，这一差异将在第 4 章相关案例段中具体说明。</w:t>
+        <w:t>这一标准在具体案例中如何兑现，可以从 PHIP 非编码变异和 rs734209466–IGFBP2/IGFBP5 调控链看到。前者提示非编码变异可能通过转录因子结合和 PHIP 表达影响颗粒细胞相关功能（Wang et al., 2025）；后者提示等位基因特异增强子和三维调控可能参与 IGFBP2/IGFBP5 表达及脂前体细胞表型调节（Shen et al., 2024）。这类研究明显强于普通 GWAS 邻近基因注释，也能显著提高候选位点的验证优先级。可是，只要还缺少内源编辑、体内因果验证、跨群体重复或目标育种群体稳定性评估，它们仍应被解释为机制证据较强的候选位点。其具体评级（rs734209466–IGFBP2/IGFBP5 在 4.1 节评为 B+，PHIP 在 4.2 节评为 B）取决于变异层证据互证程度的差异，这一差异将在第 4 章相关案例段中具体说明。</w:t>
       </w:r>
     </w:p>
     <w:p>

</xml_diff>

<commit_message>
Revise chapter 3 evidence framework
</commit_message>
<xml_diff>
--- a/家鸡候选位点证据分级_当前中稿.docx
+++ b/家鸡候选位点证据分级_当前中稿.docx
@@ -293,7 +293,7 @@
         <w:pStyle w:val="FirstParagraph"/>
       </w:pPr>
       <w:r>
-        <w:t xml:space="preserve">第 2 章讨论的是为什么候选信号不能直接等同于因果位点。本章进一步把这种判断转化为一个可操作的证据成熟度框架。这个框架的目的不是替代数量遗传评估，也不是建立已经被外部验证的正式指南，而是为家鸡复杂性状候选位点提供一种更清楚的讨论语言：一个信号目前是统计线索、机制候选、强验证对象，还是已经接近因果位点；它是否只具有生物学证据，还是已经具备进入具体育种场景的条件。</w:t>
+        <w:t>第 2 章讨论了候选信号不能直接等同于因果位点。本章进一步把这种判断转化为可操作的证据成熟度框架，为候选位点的证据强度和应用边界提供一种更清楚的讨论语言。</w:t>
       </w:r>
     </w:p>
     <w:p>
@@ -318,7 +318,7 @@
         <w:pStyle w:val="FirstParagraph"/>
       </w:pPr>
       <w:r>
-        <w:t xml:space="preserve">第一个维度是变异明确度。对于自然变异位点，关键问题是候选信号是否已经从宽泛的 QTL 区间、GWAS 峰或最近基因注释，推进到具体等位变异、结构变异、单倍型或较可信的候选变异集合。如果仍只是“显著 SNP 附近有某个基因”，则变异明确度较低；如果已经明确了具体插入、缺失、拷贝数变化、单倍型或等位变异，并且分型可靠、效应方向清楚，变异明确度才较高。对于基因编辑或靶点研究，此时变异明确度对应的问题是“靶点是否明确”，而非“是否存在可育种的自然等位变异”。</w:t>
+        <w:t>本节定义的四个证据维度，延续 ClinGen Gene-Disease Validity 框架的证据分层思想，并借鉴 ACMG/AMP 变异解释指南和 GRADE 体系中关于证据权重、硬性门槛（hard threshold）和应用阶段化（translational staging）的判断逻辑（Guyatt et al., 2008；Richards et al., 2015；Strande et al., 2017）。第一个维度是变异明确度。对于自然变异位点，关键问题是候选信号是否已经从宽泛的 QTL 区间、GWAS 峰或最近基因注释，推进到具体等位变异、结构变异、单倍型或较可信的候选变异集合。如果仍只是“显著 SNP 附近有某个基因”，则变异明确度较低；如果已经明确了具体插入、缺失、拷贝数变化、单倍型或等位变异，并且分型可靠、效应方向清楚，变异明确度才较高。对于基因编辑或靶点研究，此时变异明确度对应的问题是“靶点是否明确”，而非“是否存在可育种的自然等位变异”。</w:t>
       </w:r>
     </w:p>
     <w:p>
@@ -368,6 +368,14 @@
         <w:pStyle w:val="FirstParagraph"/>
       </w:pPr>
       <w:r>
+        <w:t>四个维度按“硬性门槛优先，总分辅助”的逻辑组合为四级评级。功能验证强度是 A 级的硬性门槛（hard threshold）：其他维度即使较强，缺少强功能验证也不能升为 A。变异明确度、统计重复性与稳健性、分子机制支持三者可以在 B 与 B+ 之间形成相对组合，但都不能替代功能验证作为 A 级判据。下面分别说明各级的典型判定特征。</w:t>
+      </w:r>
+    </w:p>
+    <w:p>
+      <w:pPr>
+        <w:pStyle w:val="BodyText"/>
+      </w:pPr>
+      <w:r>
         <w:t xml:space="preserve">C 级是默认等级，主要指候选线索。单一 GWAS、QTL、选择信号、RNA-seq 差异表达、通路富集、最近基因注释或低分辨率候选区，在缺少独立重复、明确变异、机制证据和功能验证时，均应首先归为 C 级。C 级证据不是没有价值，它的作用是提出假设、构建候选集合和指导后续验证。C 级位点也可以作为较低权重的功能先验、后续精细定位的备选池或机制研究的入口。但 C 级信号不宜直接写成因果基因，也不宜直接作为 MAS 或编辑靶点进入育种决策。</w:t>
       </w:r>
     </w:p>
@@ -408,19 +416,15 @@
         <w:pStyle w:val="BodyText"/>
       </w:pPr>
       <w:r>
-        <w:t xml:space="preserve">表 1 总结了 C、B、B+ 和 A 四级证据在四个维度上的典型表现。该表不是固定打分标准，而是用于提高判断透明度的操作性参照。实际评价时，应遵循“功能验证强度为 A 级硬门槛，其他维度可以增强证据链但不可替代硬门槛”的原则。</w:t>
-      </w:r>
-    </w:p>
-    <w:p>
-      <w:pPr>
-        <w:pStyle w:val="BodyText"/>
-      </w:pPr>
-      <w:r>
-        <w:rPr>
-          <w:b/>
-          <w:bCs/>
-        </w:rPr>
-        <w:t xml:space="preserve">表 1 家鸡候选位点 C、B、B+ 和 A 级证据的典型判定特征</w:t>
+        <w:t>表 1 总结了 C、B、B+ 和 A 四级证据在四个维度上的典型表现。该表仅承担“维度 × 等级”的判定参照功能，应用建议保留在正文讨论中。实际评价时，应遵循“功能验证强度为 A 级硬门槛，其他维度可以增强证据链但不可替代硬门槛”的原则。</w:t>
+      </w:r>
+    </w:p>
+    <w:p>
+      <w:pPr>
+        <w:pStyle w:val="BodyText"/>
+      </w:pPr>
+      <w:r>
+        <w:t>表 1 家鸡候选位点证据等级（C/B/B+/A）在四个证据维度上的典型判定特征</w:t>
       </w:r>
     </w:p>
     <w:tbl>
@@ -751,68 +755,6 @@
           </w:p>
         </w:tc>
       </w:tr>
-      <w:tr>
-        <w:tc>
-          <w:tcPr/>
-          <w:p>
-            <w:pPr>
-              <w:pStyle w:val="Compact"/>
-              <w:jc w:val="left"/>
-            </w:pPr>
-            <w:r>
-              <w:t xml:space="preserve">典型用途</w:t>
-            </w:r>
-          </w:p>
-        </w:tc>
-        <w:tc>
-          <w:tcPr/>
-          <w:p>
-            <w:pPr>
-              <w:pStyle w:val="Compact"/>
-              <w:jc w:val="left"/>
-            </w:pPr>
-            <w:r>
-              <w:t xml:space="preserve">候选清单、假设生成、低权重功能先验、后续精细定位入口。</w:t>
-            </w:r>
-          </w:p>
-        </w:tc>
-        <w:tc>
-          <w:tcPr/>
-          <w:p>
-            <w:pPr>
-              <w:pStyle w:val="Compact"/>
-              <w:jc w:val="left"/>
-            </w:pPr>
-            <w:r>
-              <w:t xml:space="preserve">精细定位、跨群体验证、机制实验、GS 功能先验。</w:t>
-            </w:r>
-          </w:p>
-        </w:tc>
-        <w:tc>
-          <w:tcPr/>
-          <w:p>
-            <w:pPr>
-              <w:pStyle w:val="Compact"/>
-              <w:jc w:val="left"/>
-            </w:pPr>
-            <w:r>
-              <w:t xml:space="preserve">优先功能验证对象；不等同于应用成熟。</w:t>
-            </w:r>
-          </w:p>
-        </w:tc>
-        <w:tc>
-          <w:tcPr/>
-          <w:p>
-            <w:pPr>
-              <w:pStyle w:val="Compact"/>
-              <w:jc w:val="left"/>
-            </w:pPr>
-            <w:r>
-              <w:t xml:space="preserve">功能标记、主效位点管理或编辑靶点评估的候选前提；仍需 T 轴评估应用成熟度。</w:t>
-            </w:r>
-          </w:p>
-        </w:tc>
-      </w:tr>
     </w:tbl>
     <w:bookmarkEnd w:id="27"/>
     <w:bookmarkStart w:id="28" w:name="t0t1t2产业适用性不能混入证据等级"/>
@@ -837,6 +779,14 @@
         <w:pStyle w:val="BodyText"/>
       </w:pPr>
       <w:r>
+        <w:t>T 轴评估涉及五个独立维度：(1) 目标育种群体中的等位基因频率与效应稳定性；(2) 多性状平衡，包括负面连锁与遗传相关性；(3) 动物福利与多代表型监测；(4) 监管路径与目标市场可接受性；(5) 经济权重与实施成本。这些维度共同决定 T0/T1/T2 评级；具体应用见第 6 章。</w:t>
+      </w:r>
+    </w:p>
+    <w:p>
+      <w:pPr>
+        <w:pStyle w:val="BodyText"/>
+      </w:pPr>
+      <w:r>
         <w:t xml:space="preserve">T 轴主要适用于 B+ 与 A 级证据。C 级与多数 B 级位点通常默认为 T0，因为它们尚未达到值得评估产业适用性的阶段。对这些位点，更合适的任务是精细定位、重复验证、机制解释和功能实验，而不是直接评价产业应用成熟度。当然，如果某个 B 级位点已经在目标群体中显示稳定预测价值，也可以报告其 T 轴状态，但必须明确这是育种预测价值，而非因果证据升级。</w:t>
       </w:r>
     </w:p>
@@ -862,6 +812,14 @@
       </w:pPr>
       <w:r>
         <w:t xml:space="preserve">T2 表示较高产业适用性。达到 T2 通常需要在目标育种体系中完成更充分评估，包括跨世代或跨环境稳定性、预测增益、实际选择反应、多性状平衡、遗传多样性、动物福利、监管可接受性和经济权重。经验上，T2 更接近已被纳入主流育种流程、商业品系常规决策或多场景稳定应用的状态。T2 应绑定具体应用场景，不可在性状、群体和育种目标层面泛化。一个位点可以对壳色管理达到较高应用成熟度，但不能因此自动对产蛋数、蛋壳强度或综合蛋品质达到同样成熟度。</w:t>
+      </w:r>
+    </w:p>
+    <w:p>
+      <w:pPr>
+        <w:pStyle w:val="BodyText"/>
+      </w:pPr>
+      <w:r>
+        <w:t>经验上，T2 至少要求：(1) 跨世代稳定性数据（不少于 2 代）；(2) 跨环境或跨场验证；(3) 与多性状选择指数的协调性评估；(4) 经济权重在该应用场景下的明确化。任一项缺失，原则上应保留在 T1 阶段。</w:t>
       </w:r>
     </w:p>
     <w:p>
@@ -887,39 +845,7 @@
         <w:pStyle w:val="FirstParagraph"/>
       </w:pPr>
       <w:r>
-        <w:t xml:space="preserve">A 级证据还需要进一步区分 variant-level A 和 gene/target-level A。二者都可以代表强功能证据，但解释对象和育种含义不同。</w:t>
-      </w:r>
-    </w:p>
-    <w:p>
-      <w:pPr>
-        <w:pStyle w:val="BodyText"/>
-      </w:pPr>
-      <w:r>
-        <w:t xml:space="preserve">variant-level A 指自然变异或单倍型层面的强证据。它要求候选变异或单倍型较明确，并且能够把变异、分子功能和表型后果连接起来。典型情况包括主效表型、寡基因表型或结构变异控制的可见性状。这类证据最接近功能标记或主效位点管理，因为它直接回答的是自然群体中哪个变异与表型形成有关。不过，即使是 variant-level A，也不等于无条件产业应用。是否应用仍取决于 T 轴：目标群体中是否存在该等位基因，效应是否稳定，是否影响其他性状，是否符合育种目标。</w:t>
-      </w:r>
-    </w:p>
-    <w:p>
-      <w:pPr>
-        <w:pStyle w:val="BodyText"/>
-      </w:pPr>
-      <w:r>
-        <w:t xml:space="preserve">gene/target-level A 指基因或靶点层面的强证据。它可以由编辑、敲除、敲入、体内模型或强扰动实验支持，说明某个基因或靶点对表型具有功能作用。抗病编辑研究中的宿主因子就是典型例子：编辑结果可以证明该靶点参与病毒复制或感染结局，但并不证明自然群体中存在可直接选择的功能等位变异，也不证明该靶点已经适合产业育种。对于 gene/target-level A，尤其需要在 T 轴中单独评估遗传背景、补偿通路、多性状影响、动物福利、病原逃逸、监管路径和产业接受度。</w:t>
-      </w:r>
-    </w:p>
-    <w:p>
-      <w:pPr>
-        <w:pStyle w:val="BodyText"/>
-      </w:pPr>
-      <w:r>
-        <w:t xml:space="preserve">一个位点的 variant-level 证据与 gene/target-level 证据应分别报告，不应合并为单一最高等级。某个基因可能在编辑或强扰动实验中达到 gene/target-level A，同时其自然变异证据仍只达到 B 或 B+；这种“非对称证据”本身就是重要信息。它说明该靶点具有明确生物学功能，但尚不能证明自然群体中已有可直接利用的功能等位变异，也不能证明该靶点已经具备产业应用成熟度。</w:t>
-      </w:r>
-    </w:p>
-    <w:p>
-      <w:pPr>
-        <w:pStyle w:val="BodyText"/>
-      </w:pPr>
-      <w:r>
-        <w:t xml:space="preserve">这个区分可以避免两个方向的误读。第一，不能把 gene/target-level A 误写成自然变异层面的功能标记。第二，也不能因为某个自然变异尚未达到产业应用成熟度，就否定其生物学强证据。variant-level A 解决的是“自然变异是否具有强证据”，gene/target-level A 解决的是“基因或靶点是否具有强功能作用”，T 轴解决的是“是否适合具体育种应用”。</w:t>
+        <w:t>在 3.2 节基础上，本节进一步展开 A 级证据的两种子类。variant-level A 解决的是“自然变异是否具有强证据”，最接近功能标记或主效位点管理；gene/target-level A 解决的是“基因或靶点是否具有强功能作用”，常出现在编辑或强扰动研究中。两者的关键区别在于：一个位点的 variant-level 证据与 gene/target-level 证据应分别报告，不应合并为单一最高等级。某个基因可能在编辑或强扰动实验中达到 gene/target-level A，同时其自然变异证据仍只达到 B 或 B+；这种非对称证据本身就是重要信息。它说明该靶点具有明确生物学功能，但尚不能证明自然群体中已有可直接利用的功能等位变异。这种非对称证据在家鸡抗病靶点研究中尤其常见，ANP32A 是典型例子（详见第 4.3 节）：编辑实验可提供 gene/target-level A 证据，但自然群体可育种变异层面仍可能仅达到 B–C。此时 T 轴必须独立处理：variant-level A 解决“自然变异是否具有强证据”，gene/target-level A 解决“基因或靶点是否具有强功能作用”，T 轴解决“是否适合具体育种应用”。</w:t>
       </w:r>
     </w:p>
     <w:bookmarkEnd w:id="29"/>
@@ -953,15 +879,15 @@
         <w:pStyle w:val="BodyText"/>
       </w:pPr>
       <w:r>
-        <w:t xml:space="preserve">如果未来将该框架用于数据库标注、指南制定或正式证据评级，就需要进一步验证其一致性。较合理的做法是预先注册评分规则，选择覆盖主效表型、生长、产蛋、饲料效率、抗病和地方适应等不同类型的代表性位点，由多名独立评估者盲法评分，并报告评估者间一致性和分歧仲裁过程。只有经过这类验证后，框架才有可能从启发式判断工具进一步发展为较稳定的评价体系。</w:t>
-      </w:r>
-    </w:p>
-    <w:p>
-      <w:pPr>
-        <w:pStyle w:val="BodyText"/>
-      </w:pPr>
-      <w:r>
-        <w:t xml:space="preserve">在本文中，该框架的用途更克制：它帮助组织已有文献，避免把候选线索提前包装成因果位点，也避免把功能验证结果直接等同于育种应用。下一章将以这一框架为基础，比较不同性状中代表性候选位点的证据成熟度，并说明为什么当前家鸡中真正达到 variant-level A 的案例主要集中在主效、寡基因或结构变异控制的表型，而多数复杂经济性状仍处于机制候选或验证优先阶段。</w:t>
+        <w:t>本框架尚未完成评估者间一致性（inter-rater reliability）的形式化验证，这是其当前的明确局限。未来的形式化路径包括：预先注册评分规则；选择覆盖主效表型、生长、产蛋、饲料效率、抗病和地方适应等不同性状类型的代表性位点（建议不少于 30 个）；由多名独立评估者（建议不少于 3 名）盲法评分；以 Cohen’s kappa 或 Fleiss’ kappa 等指标报告一致性，并对分歧位点进行仲裁分析（Fleiss, 1971；Strande et al., 2017；McHugh, 2012）。</w:t>
+      </w:r>
+    </w:p>
+    <w:p>
+      <w:pPr>
+        <w:pStyle w:val="BodyText"/>
+      </w:pPr>
+      <w:r>
+        <w:t>在本文中，该框架的用途更克制：它帮助组织已有文献，避免把候选线索提前包装成因果位点，也避免把功能验证结果直接等同于育种应用。下一章将应用该框架比较不同性状的代表性候选位点，并指出 variant-level A 在家鸡中的具体分布。</w:t>
       </w:r>
     </w:p>
     <w:bookmarkEnd w:id="30"/>
@@ -7080,6 +7006,14 @@
         <w:pStyle w:val="BodyText"/>
       </w:pPr>
       <w:r>
+        <w:t>Fleiss, J. L. 1971. Measuring nominal scale agreement among many raters. Psychological Bulletin 76:378-382. https://doi.org/10.1037/h0031619.</w:t>
+      </w:r>
+    </w:p>
+    <w:p>
+      <w:pPr>
+        <w:pStyle w:val="BodyText"/>
+      </w:pPr>
+      <w:r>
         <w:t>Giambartolomei, C., Vukcevic, D., Schadt, E. E., et al. 2014. Bayesian test for colocalisation between pairs of genetic association studies using summary statistics. PLoS Genetics 10:e1004383. https://doi.org/10.1371/journal.pgen.1004383.</w:t>
       </w:r>
     </w:p>
@@ -7136,6 +7070,14 @@
         <w:pStyle w:val="BodyText"/>
       </w:pPr>
       <w:r>
+        <w:t>McHugh, M. L. 2012. Interrater reliability: the kappa statistic. Biochemia Medica 22:276-282. https://doi.org/10.11613/BM.2012.031.</w:t>
+      </w:r>
+    </w:p>
+    <w:p>
+      <w:pPr>
+        <w:pStyle w:val="BodyText"/>
+      </w:pPr>
+      <w:r>
         <w:t>Rehm, H. L., Berg, J. S., Brooks, L. D., et al. 2015. ClinGen--the Clinical Genome Resource. New England Journal of Medicine 372:2235-2242. https://doi.org/10.1056/NEJMsr1406261.</w:t>
       </w:r>
     </w:p>
@@ -7161,6 +7103,14 @@
       </w:pPr>
       <w:r>
         <w:t>Shen, L., Bai, X., Zhao, L., et al. 2024. Integrative 3D genomics with multi-omics analysis and functional validation of genetic regulatory mechanisms of abdominal fat deposition in chickens. Nature Communications 15:9274. https://doi.org/10.1038/s41467-024-53692-6.</w:t>
+      </w:r>
+    </w:p>
+    <w:p>
+      <w:pPr>
+        <w:pStyle w:val="BodyText"/>
+      </w:pPr>
+      <w:r>
+        <w:t>Strande, N. T., Riggs, E. R., Buchanan, A. H., et al. 2017. Evaluating the clinical validity of gene-disease associations: an evidence-based framework developed by the Clinical Genome Resource. American Journal of Human Genetics 100:895-906. https://doi.org/10.1016/j.ajhg.2017.04.015.</w:t>
       </w:r>
     </w:p>
     <w:p>

</xml_diff>

<commit_message>
Polish chapter 3 framework wording
</commit_message>
<xml_diff>
--- a/家鸡候选位点证据分级_当前中稿.docx
+++ b/家鸡候选位点证据分级_当前中稿.docx
@@ -318,7 +318,15 @@
         <w:pStyle w:val="FirstParagraph"/>
       </w:pPr>
       <w:r>
-        <w:t>本节定义的四个证据维度，延续 ClinGen Gene-Disease Validity 框架的证据分层思想，并借鉴 ACMG/AMP 变异解释指南和 GRADE 体系中关于证据权重、硬性门槛（hard threshold）和应用阶段化（translational staging）的判断逻辑（Guyatt et al., 2008；Richards et al., 2015；Strande et al., 2017）。第一个维度是变异明确度。对于自然变异位点，关键问题是候选信号是否已经从宽泛的 QTL 区间、GWAS 峰或最近基因注释，推进到具体等位变异、结构变异、单倍型或较可信的候选变异集合。如果仍只是“显著 SNP 附近有某个基因”，则变异明确度较低；如果已经明确了具体插入、缺失、拷贝数变化、单倍型或等位变异，并且分型可靠、效应方向清楚，变异明确度才较高。对于基因编辑或靶点研究，此时变异明确度对应的问题是“靶点是否明确”，而非“是否存在可育种的自然等位变异”。</w:t>
+        <w:t>本节定义的四个证据维度，延续 ClinGen Gene-Disease Validity 框架的证据分层思想，并借鉴 ACMG/AMP 变异解释指南和 GRADE 体系中关于证据权重、硬性门槛（hard threshold）和应用阶段化（translational staging）的判断逻辑（Guyatt et al., 2008；Richards et al., 2015；Strande et al., 2017）。</w:t>
+      </w:r>
+    </w:p>
+    <w:p>
+      <w:pPr>
+        <w:pStyle w:val="BodyText"/>
+      </w:pPr>
+      <w:r>
+        <w:t>第一个维度是变异明确度。对于自然变异位点，关键问题是候选信号是否已经从宽泛的 QTL 区间、GWAS 峰或最近基因注释，推进到具体等位变异、结构变异、单倍型或较可信的候选变异集合。如果仍只是“显著 SNP 附近有某个基因”，则变异明确度较低；如果已经明确了具体插入、缺失、拷贝数变化、单倍型或等位变异，并且分型可靠、效应方向清楚，变异明确度才较高。对于基因编辑或靶点研究，此时变异明确度对应的问题是“靶点是否明确”，而非“是否存在可育种的自然等位变异”。</w:t>
       </w:r>
     </w:p>
     <w:p>
@@ -408,7 +416,7 @@
         <w:pStyle w:val="BodyText"/>
       </w:pPr>
       <w:r>
-        <w:t xml:space="preserve">因此，本文采用“硬性门槛优先，总分辅助”的判断逻辑。总分可以帮助比较候选位点的相对成熟度，但不能替代关键证据。一个候选位点即使在变异明确度、重复性和机制支持上得分较高，只要缺少强功能验证，也不应自动升为 A 级。反过来，一个编辑靶点即使具有强功能实验结果，如果缺少自然变异、群体效应或应用边界评估，也不能被写成成熟的育种标记。</w:t>
+        <w:t>总分可以帮助比较候选位点的相对成熟度，但不能替代关键证据。一个候选位点即使在变异明确度、重复性和机制支持上得分较高，只要缺少强功能验证，也不应自动升为 A 级。反过来，一个编辑靶点即使具有强功能实验结果，如果缺少自然变异、群体效应或应用边界评估，也不能被写成成熟的育种标记。</w:t>
       </w:r>
     </w:p>
     <w:p>
@@ -845,7 +853,7 @@
         <w:pStyle w:val="FirstParagraph"/>
       </w:pPr>
       <w:r>
-        <w:t>在 3.2 节基础上，本节进一步展开 A 级证据的两种子类。variant-level A 解决的是“自然变异是否具有强证据”，最接近功能标记或主效位点管理；gene/target-level A 解决的是“基因或靶点是否具有强功能作用”，常出现在编辑或强扰动研究中。两者的关键区别在于：一个位点的 variant-level 证据与 gene/target-level 证据应分别报告，不应合并为单一最高等级。某个基因可能在编辑或强扰动实验中达到 gene/target-level A，同时其自然变异证据仍只达到 B 或 B+；这种非对称证据本身就是重要信息。它说明该靶点具有明确生物学功能，但尚不能证明自然群体中已有可直接利用的功能等位变异。这种非对称证据在家鸡抗病靶点研究中尤其常见，ANP32A 是典型例子（详见第 4.3 节）：编辑实验可提供 gene/target-level A 证据，但自然群体可育种变异层面仍可能仅达到 B–C。此时 T 轴必须独立处理：variant-level A 解决“自然变异是否具有强证据”，gene/target-level A 解决“基因或靶点是否具有强功能作用”，T 轴解决“是否适合具体育种应用”。</w:t>
+        <w:t>在 3.2 节基础上，本节进一步展开 A 级证据的两种子类。variant-level A 解决的是“自然变异是否具有强证据”，最接近功能标记或主效位点管理；gene/target-level A 解决的是“基因或靶点是否具有强功能作用”，常出现在编辑或强扰动研究中。两者的关键区别在于：一个位点的 variant-level 证据与 gene/target-level 证据应分别报告，不应合并为单一最高等级。某个基因可能在编辑或强扰动实验中达到 gene/target-level A，同时其自然变异证据仍只达到 B 或 B+；这种非对称证据本身就是重要信息。它说明该靶点具有明确生物学功能，但尚不能证明自然群体中已有可直接利用的功能等位变异。这种非对称证据在家鸡抗病靶点研究中尤其常见，ANP32A 是典型例子（详见第 4.3 节）：编辑实验可提供 gene/target-level A 证据，但自然群体可育种变异层面仍可能仅达到 B–C。此时 T 轴必须独立处理：上述两种 A 级证据均仅回答“是否具有功能或强证据”，T 轴单独回答“是否适合具体育种应用”。</w:t>
       </w:r>
     </w:p>
     <w:bookmarkEnd w:id="29"/>

</xml_diff>

<commit_message>
Add chapter 7: bottlenecks, future directions and conclusion
Co-authored-by: FlatIsabella893 <284653963+FlatIsabella893@users.noreply.github.com>
</commit_message>
<xml_diff>
--- a/家鸡候选位点证据分级_当前中稿.docx
+++ b/家鸡候选位点证据分级_当前中稿.docx
@@ -6969,6 +6969,126 @@
     <w:bookmarkEnd w:id="46"/>
     <w:bookmarkEnd w:id="47"/>
     <w:bookmarkEnd w:id="48"/>
+    <w:p>
+      <w:pPr>
+        <w:pStyle w:val="Heading2"/>
+      </w:pPr>
+      <w:r>
+        <w:t xml:space="preserve">7 瓶颈、未来方向与结论</w:t>
+      </w:r>
+    </w:p>
+    <w:p>
+      <w:pPr>
+        <w:pStyle w:val="BodyText"/>
+      </w:pPr>
+      <w:r>
+        <w:t xml:space="preserve">本文提出的证据成熟度框架（C/B/B+/A）与产业适用性轴（T0/T1/T2），其价值不在于给候选位点贴上新标签，而在于把“证据有多强”和“是否适合育种”两个问题显性地分开。第 4 章的评估显示，家鸡 variant-level A 证据主要集中于主效可见表型，多数复杂经济性状仍停留在 B/B+ 或 C/B 阶段。这一格局并非永久，它取决于当前方法学、群体资源和学科协作的具体限制。本章先讨论这些瓶颈，再指出最可能改变证据分布的方向，最后给出面向研究者和育种实践的结论。</w:t>
+      </w:r>
+    </w:p>
+    <w:p>
+      <w:pPr>
+        <w:pStyle w:val="Heading3"/>
+      </w:pPr>
+      <w:r>
+        <w:t xml:space="preserve">7.1 当前框架应用的主要瓶颈</w:t>
+      </w:r>
+    </w:p>
+    <w:p>
+      <w:pPr>
+        <w:pStyle w:val="BodyText"/>
+      </w:pPr>
+      <w:r>
+        <w:t xml:space="preserve">第一类是方法学瓶颈，集中在功能验证环节。如第 5 章所述，从 B+ 升级到 A 的关键不是证据数量，而是内源、体内或等位基因层面的因果验证。家鸡在这一环节受到三项具体限制：PGC 介导编辑的通量，决定能验证多少候选位点；内源等位基因替换的效率，决定能验证哪类变异，尤其是结构变异和调控变异；以及长期与多性状表型监测能力，决定能否完成 T 轴评估。鸡 PGC 的长期培养和生殖系传递虽已建立（van de Lavoir et al., 2006；Whyte et al., 2015），但单个验证项目的成本、世代周期和设施门槛，使系统性的等位基因替换在多数育种主体中仍不可行。这是 A 级证据稀缺的直接技术原因。</w:t>
+      </w:r>
+    </w:p>
+    <w:p>
+      <w:pPr>
+        <w:pStyle w:val="BodyText"/>
+      </w:pPr>
+      <w:r>
+        <w:t xml:space="preserve">第二类是群体瓶颈。家鸡白羽肉鸡、黄羽肉鸡、商业蛋鸡、地方品种和实验资源群体之间存在显著遗传背景差异，同一候选位点在不同群体中可能由不同因果变异驱动，效应方向和大小也可能改变。这意味着在某一群体中获得的 variant-level A 证据，不能自动推广到其他群体；因果异质性和跨群体迁移性必须作为独立问题评估。当前多数功能验证集中在少数研究群体，缺少系统的跨群体复核，这既限制了证据的可推广性，也使 T 轴评估难以脱离具体群体泛化。</w:t>
+      </w:r>
+    </w:p>
+    <w:p>
+      <w:pPr>
+        <w:pStyle w:val="BodyText"/>
+      </w:pPr>
+      <w:r>
+        <w:t xml:space="preserve">第三类是学科瓶颈。一方面，本文框架本身尚未完成评估者间一致性（inter-rater reliability）的形式化验证（见 3.5 节），其评级在不同研究者之间可能存在分歧。另一方面，基因组学与数量遗传学之间存在术语和标准的断层：前者关注单个变异的因果性，后者关注全基因组层面的预测与遗传增益。候选位点证据分级要真正服务于育种，需要这两套语言对接，例如把 variant-level 证据等级转化为 GS 模型中的功能先验权重。这种对接目前仍缺少公认的规范。</w:t>
+      </w:r>
+    </w:p>
+    <w:p>
+      <w:pPr>
+        <w:pStyle w:val="Heading3"/>
+      </w:pPr>
+      <w:r>
+        <w:t xml:space="preserve">7.2 未来最可能改变证据分布的方向</w:t>
+      </w:r>
+    </w:p>
+    <w:p>
+      <w:pPr>
+        <w:pStyle w:val="BodyText"/>
+      </w:pPr>
+      <w:r>
+        <w:t xml:space="preserve">第一，泛基因组与结构变异图谱。第 2 章已指出，家鸡若干强效表型并非由最显著 SNP 解释，而是涉及结构变异、拷贝数变化或参考基因组之外的非参考序列（Rice et al., 2023）。随着长读长测序和图泛基因组的普及，系统性识别结构变异将逐步改变“显著 SNP 不等于因果变异”的格局，使更多候选位点从 region-level 或 gene-level 推进到 variant-level。这是变异明确度维度最可能取得系统性进展的方向。</w:t>
+      </w:r>
+    </w:p>
+    <w:p>
+      <w:pPr>
+        <w:pStyle w:val="BodyText"/>
+      </w:pPr>
+      <w:r>
+        <w:t xml:space="preserve">第二，PGC 编辑通量的提升。如果生殖系编辑和等位基因替换的效率、规模和成本能够改善，功能验证将从“一次只能验证少数位点”转向“系统性筛查候选变异”。这直接决定 gene/target-level A 和 variant-level A 证据在未来五到十年能积累多少，也是把第 4 章中大量 B+ 候选推向 A 的核心前提。</w:t>
+      </w:r>
+    </w:p>
+    <w:p>
+      <w:pPr>
+        <w:pStyle w:val="BodyText"/>
+      </w:pPr>
+      <w:r>
+        <w:t xml:space="preserve">第三，地方品种功能基因组学协作网络。群体瓶颈的根本解法是跨群体、跨机构的协作：在统一表型标准和共同环境试验下，对地方品种和商业群体进行平行的基因型、表型与功能研究。这既能处理因果异质性和跨群体迁移性问题，也能把地方适应性状从当前的 region-level C–B 推向更高证据等级，同时服务于遗传资源保护。</w:t>
+      </w:r>
+    </w:p>
+    <w:p>
+      <w:pPr>
+        <w:pStyle w:val="BodyText"/>
+      </w:pPr>
+      <w:r>
+        <w:t xml:space="preserve">第四，评级框架的形式化验证。本文框架目前是启发式工具。若要发展为可用于数据库标注或指南制定的稳定体系，需要预先注册评分规则、建立覆盖不同性状类型的基准位点集、由多名独立评估者盲法评分并报告一致性指标（Strande et al., 2017）。这一步是把叙述性判断语言升级为可复现评价体系的必要条件。</w:t>
+      </w:r>
+    </w:p>
+    <w:p>
+      <w:pPr>
+        <w:pStyle w:val="Heading3"/>
+      </w:pPr>
+      <w:r>
+        <w:t xml:space="preserve">7.3 结论与对从业者的建议</w:t>
+      </w:r>
+    </w:p>
+    <w:p>
+      <w:pPr>
+        <w:pStyle w:val="BodyText"/>
+      </w:pPr>
+      <w:r>
+        <w:t xml:space="preserve">对研究者而言，本文框架的直接启示是把验证投入对准证据链的薄弱环节，而不是重复增加同类证据。一个已经具有多重表达和关联证据的候选位点，再增加一项差异表达分析，对其证据等级的提升有限；真正能推动升级的是内源编辑、体内模型或跨群体复核。明确一个位点“缺哪一环”，比反复确认“它看起来合理”更有价值。</w:t>
+      </w:r>
+    </w:p>
+    <w:p>
+      <w:pPr>
+        <w:pStyle w:val="BodyText"/>
+      </w:pPr>
+      <w:r>
+        <w:t xml:space="preserve">对育种企业而言，应区分证据轴和产业轴分别决策。复杂经济性状的长期改良仍应以基因组选择和多性状选择指数为主干；少数 variant-level A 主效位点可用于品种特征管理、商品分级和保种；B+ 位点主要用于排序和优先验证；基因编辑靶点则必须在监管、福利和病原生态约束下单独评估。工具选择还要结合自身资源：MAS 成本最低，GS 需要表型基础设施，编辑目前更适合大型主体或公共机构主导。其中，高质量、可比较、可用于遗传评估的表型记录体系，是比追加分子数据更基础、也更值得优先投入的方向。</w:t>
+      </w:r>
+    </w:p>
+    <w:p>
+      <w:pPr>
+        <w:pStyle w:val="BodyText"/>
+      </w:pPr>
+      <w:r>
+        <w:t xml:space="preserve">总之，家鸡精准育种的现实瓶颈不是候选信号太少，而是证据上限与性状结构、表型可测量性和功能验证可及性密切绑定。本文提出的证据成熟度框架，价值不在于产生新的评级，而在于为讨论提供一种共同语言，使候选位点的能力与限制都能被清楚地说出来：哪些只是线索，哪些值得验证，哪些已经可用，以及在什么场景下可用。在这个意义上，更明确的证据上限判断和更恰当的工具匹配，比候选基因清单的进一步扩张，更能推动家鸡复杂性状研究真正转化为育种价值。</w:t>
+      </w:r>
+    </w:p>
     <w:p>
       <w:pPr>
         <w:pStyle w:val="Heading2"/>

</xml_diff>

<commit_message>
Replace chapter 7 with rewritten bottlenecks/future/conclusion version
Co-authored-by: FlatIsabella893 <284653963+FlatIsabella893@users.noreply.github.com>
</commit_message>
<xml_diff>
--- a/家鸡候选位点证据分级_当前中稿.docx
+++ b/家鸡候选位点证据分级_当前中稿.docx
@@ -6982,7 +6982,7 @@
         <w:pStyle w:val="BodyText"/>
       </w:pPr>
       <w:r>
-        <w:t xml:space="preserve">本文提出的证据成熟度框架（C/B/B+/A）与产业适用性轴（T0/T1/T2），其价值不在于给候选位点贴上新标签，而在于把“证据有多强”和“是否适合育种”两个问题显性地分开。第 4 章的评估显示，家鸡 variant-level A 证据主要集中于主效可见表型，多数复杂经济性状仍停留在 B/B+ 或 C/B 阶段。这一格局并非永久，它取决于当前方法学、群体资源和学科协作的具体限制。本章先讨论这些瓶颈，再指出最可能改变证据分布的方向，最后给出面向研究者和育种实践的结论。</w:t>
+        <w:t xml:space="preserve">本文的出发点是一个看似简单却常被混淆的区分：一个候选位点“有多强的证据”和“是否适合用于育种”，是两个不同问题。围绕这一区分，本文建立了证据轴（C/B/B+/A）与产业适用性轴（T0/T1/T2），并用它评估了家鸡四类性状的代表性位点。第 4 章得到的核心图景是：variant-level A 证据在家鸡中并不稀缺，却几乎全部落在主效可见表型上；真正承载产业价值的复杂经济性状，大多停留在 B/B+ 或 C/B。本章讨论这一格局背后的瓶颈、最可能改变它的方向，以及它对研究和育种实践的含义。</w:t>
       </w:r>
     </w:p>
     <w:p>
@@ -6990,31 +6990,39 @@
         <w:pStyle w:val="Heading3"/>
       </w:pPr>
       <w:r>
-        <w:t xml:space="preserve">7.1 当前框架应用的主要瓶颈</w:t>
-      </w:r>
-    </w:p>
-    <w:p>
-      <w:pPr>
-        <w:pStyle w:val="BodyText"/>
-      </w:pPr>
-      <w:r>
-        <w:t xml:space="preserve">第一类是方法学瓶颈，集中在功能验证环节。如第 5 章所述，从 B+ 升级到 A 的关键不是证据数量，而是内源、体内或等位基因层面的因果验证。家鸡在这一环节受到三项具体限制：PGC 介导编辑的通量，决定能验证多少候选位点；内源等位基因替换的效率，决定能验证哪类变异，尤其是结构变异和调控变异；以及长期与多性状表型监测能力，决定能否完成 T 轴评估。鸡 PGC 的长期培养和生殖系传递虽已建立（van de Lavoir et al., 2006；Whyte et al., 2015），但单个验证项目的成本、世代周期和设施门槛，使系统性的等位基因替换在多数育种主体中仍不可行。这是 A 级证据稀缺的直接技术原因。</w:t>
-      </w:r>
-    </w:p>
-    <w:p>
-      <w:pPr>
-        <w:pStyle w:val="BodyText"/>
-      </w:pPr>
-      <w:r>
-        <w:t xml:space="preserve">第二类是群体瓶颈。家鸡白羽肉鸡、黄羽肉鸡、商业蛋鸡、地方品种和实验资源群体之间存在显著遗传背景差异，同一候选位点在不同群体中可能由不同因果变异驱动，效应方向和大小也可能改变。这意味着在某一群体中获得的 variant-level A 证据，不能自动推广到其他群体；因果异质性和跨群体迁移性必须作为独立问题评估。当前多数功能验证集中在少数研究群体，缺少系统的跨群体复核，这既限制了证据的可推广性，也使 T 轴评估难以脱离具体群体泛化。</w:t>
-      </w:r>
-    </w:p>
-    <w:p>
-      <w:pPr>
-        <w:pStyle w:val="BodyText"/>
-      </w:pPr>
-      <w:r>
-        <w:t xml:space="preserve">第三类是学科瓶颈。一方面，本文框架本身尚未完成评估者间一致性（inter-rater reliability）的形式化验证（见 3.5 节），其评级在不同研究者之间可能存在分歧。另一方面，基因组学与数量遗传学之间存在术语和标准的断层：前者关注单个变异的因果性，后者关注全基因组层面的预测与遗传增益。候选位点证据分级要真正服务于育种，需要这两套语言对接，例如把 variant-level 证据等级转化为 GS 模型中的功能先验权重。这种对接目前仍缺少公认的规范。</w:t>
+        <w:t xml:space="preserve">7.1 证据格局背后的三类瓶颈</w:t>
+      </w:r>
+    </w:p>
+    <w:p>
+      <w:pPr>
+        <w:pStyle w:val="BodyText"/>
+      </w:pPr>
+      <w:r>
+        <w:t xml:space="preserve">家鸡复杂经济性状证据上限偏低，不是研究投入不足的简单结果，而是三类结构性瓶颈共同作用的产物。</w:t>
+      </w:r>
+    </w:p>
+    <w:p>
+      <w:pPr>
+        <w:pStyle w:val="BodyText"/>
+      </w:pPr>
+      <w:r>
+        <w:t xml:space="preserve">第一类是功能验证的可及性。第 5 章已说明，证据等级的真正跃迁发生在内源、体内和等位基因层面的因果验证，而这恰恰是家鸡最受限的环节：生殖系操作、世代周期和验证成本，使系统性的等位基因替换难以规模化。这一限制不是某个孤立的技术细节，而是决定了 A 级证据能以多快速度、在多少位点上积累的总闸门。</w:t>
+      </w:r>
+    </w:p>
+    <w:p>
+      <w:pPr>
+        <w:pStyle w:val="BodyText"/>
+      </w:pPr>
+      <w:r>
+        <w:t xml:space="preserve">第二类是群体异质性，这是家鸡区别于模式动物的核心特征。白羽肉鸡、黄羽肉鸡、商业蛋鸡、地方品种和实验资源群体之间遗传背景差异显著，同一关联区域在不同群体中可能由不同因果变异驱动，效应方向和大小也可能改变。这意味着在单一群体中获得的强证据不能默认推广到其他群体，因果异质性和跨群体迁移性必须作为独立问题处理。当前功能验证大多集中于少数研究群体，缺乏跨群体的平行复核，这既压低了证据的可推广性，也使 T 轴评估难以脱离具体群体而泛化。</w:t>
+      </w:r>
+    </w:p>
+    <w:p>
+      <w:pPr>
+        <w:pStyle w:val="BodyText"/>
+      </w:pPr>
+      <w:r>
+        <w:t xml:space="preserve">第三类是学科与基础设施的断层。一方面，基因组学关注单个变异的因果性，数量遗传学关注全基因组层面的预测与遗传增益，两套语言之间缺少公认的对接规范，例如如何把 variant-level 证据等级转化为基因组选择模型中的功能先验权重。另一方面，复杂经济性状的证据天花板很大程度上由表型决定：饲料效率、产蛋持续性、肉质、抗病终点和地方适应指标的测量精度与可比性，直接限制了任何下游分子证据可能达到的强度。高质量、标准化、可纵向追踪的表型基础设施，仍是比分子数据更稀缺、也更基础的资源。</w:t>
       </w:r>
     </w:p>
     <w:p>
@@ -7022,39 +7030,47 @@
         <w:pStyle w:val="Heading3"/>
       </w:pPr>
       <w:r>
-        <w:t xml:space="preserve">7.2 未来最可能改变证据分布的方向</w:t>
-      </w:r>
-    </w:p>
-    <w:p>
-      <w:pPr>
-        <w:pStyle w:val="BodyText"/>
-      </w:pPr>
-      <w:r>
-        <w:t xml:space="preserve">第一，泛基因组与结构变异图谱。第 2 章已指出，家鸡若干强效表型并非由最显著 SNP 解释，而是涉及结构变异、拷贝数变化或参考基因组之外的非参考序列（Rice et al., 2023）。随着长读长测序和图泛基因组的普及，系统性识别结构变异将逐步改变“显著 SNP 不等于因果变异”的格局，使更多候选位点从 region-level 或 gene-level 推进到 variant-level。这是变异明确度维度最可能取得系统性进展的方向。</w:t>
-      </w:r>
-    </w:p>
-    <w:p>
-      <w:pPr>
-        <w:pStyle w:val="BodyText"/>
-      </w:pPr>
-      <w:r>
-        <w:t xml:space="preserve">第二，PGC 编辑通量的提升。如果生殖系编辑和等位基因替换的效率、规模和成本能够改善，功能验证将从“一次只能验证少数位点”转向“系统性筛查候选变异”。这直接决定 gene/target-level A 和 variant-level A 证据在未来五到十年能积累多少，也是把第 4 章中大量 B+ 候选推向 A 的核心前提。</w:t>
-      </w:r>
-    </w:p>
-    <w:p>
-      <w:pPr>
-        <w:pStyle w:val="BodyText"/>
-      </w:pPr>
-      <w:r>
-        <w:t xml:space="preserve">第三，地方品种功能基因组学协作网络。群体瓶颈的根本解法是跨群体、跨机构的协作：在统一表型标准和共同环境试验下，对地方品种和商业群体进行平行的基因型、表型与功能研究。这既能处理因果异质性和跨群体迁移性问题，也能把地方适应性状从当前的 region-level C–B 推向更高证据等级，同时服务于遗传资源保护。</w:t>
-      </w:r>
-    </w:p>
-    <w:p>
-      <w:pPr>
-        <w:pStyle w:val="BodyText"/>
-      </w:pPr>
-      <w:r>
-        <w:t xml:space="preserve">第四，评级框架的形式化验证。本文框架目前是启发式工具。若要发展为可用于数据库标注或指南制定的稳定体系，需要预先注册评分规则、建立覆盖不同性状类型的基准位点集、由多名独立评估者盲法评分并报告一致性指标（Strande et al., 2017）。这一步是把叙述性判断语言升级为可复现评价体系的必要条件。</w:t>
+        <w:t xml:space="preserve">7.2 最可能改变证据分布的方向</w:t>
+      </w:r>
+    </w:p>
+    <w:p>
+      <w:pPr>
+        <w:pStyle w:val="BodyText"/>
+      </w:pPr>
+      <w:r>
+        <w:t xml:space="preserve">与上述瓶颈相对，未来若干进展有可能系统性地改变家鸡候选位点的证据分布。它们的共同特征是：改变的不是候选信号的数量，而是证据沿四个维度向上移动的能力。</w:t>
+      </w:r>
+    </w:p>
+    <w:p>
+      <w:pPr>
+        <w:pStyle w:val="BodyText"/>
+      </w:pPr>
+      <w:r>
+        <w:t xml:space="preserve">近期影响最直接的是泛基因组与结构变异图谱。第 2 章已指出，家鸡多个强效表型并非由最显著 SNP 解释，而是涉及结构变异、拷贝数变化或参考基因组之外的非参考序列（Rice et al., 2023）。随着长读长测序和图泛基因组的普及，系统性识别结构变异将使大批停留在 region-level 或 gene-level 的信号有机会推进到 variant-level，这是变异明确度维度最可能取得整体进展的方向。</w:t>
+      </w:r>
+    </w:p>
+    <w:p>
+      <w:pPr>
+        <w:pStyle w:val="BodyText"/>
+      </w:pPr>
+      <w:r>
+        <w:t xml:space="preserve">其次是生殖系编辑通量的提升。若 PGC 介导编辑和等位基因替换的效率、规模与成本能够改善，功能验证将从一次只能处理少数位点，转向对候选变异的系统性筛查，这直接决定第 4 章中大量 B+ 候选能否、以及以多快速度被推向 A。</w:t>
+      </w:r>
+    </w:p>
+    <w:p>
+      <w:pPr>
+        <w:pStyle w:val="BodyText"/>
+      </w:pPr>
+      <w:r>
+        <w:t xml:space="preserve">第三是跨群体、跨机构的协作网络，尤其是地方品种与商业群体在统一表型标准和共同环境下的平行研究。这是群体异质性瓶颈的根本解法，既能澄清因果异质性和跨群体迁移性，也能把地方适应性状从当前的 region-level C–B 推向更高等级，同时服务于遗传资源保护。</w:t>
+      </w:r>
+    </w:p>
+    <w:p>
+      <w:pPr>
+        <w:pStyle w:val="BodyText"/>
+      </w:pPr>
+      <w:r>
+        <w:t xml:space="preserve">第四是评级框架自身的形式化。本文框架目前是启发式工具；要发展为可用于数据库标注或指南制定的稳定体系，需要预先注册评分规则、建立覆盖不同性状类型的基准位点集、由多名独立评估者盲法评分并报告一致性指标（Strande et al., 2017）。这一步决定它能否从一种叙述性判断语言，升级为可复现的评价体系。</w:t>
       </w:r>
     </w:p>
     <w:p>
@@ -7062,31 +7078,31 @@
         <w:pStyle w:val="Heading3"/>
       </w:pPr>
       <w:r>
-        <w:t xml:space="preserve">7.3 结论与对从业者的建议</w:t>
-      </w:r>
-    </w:p>
-    <w:p>
-      <w:pPr>
-        <w:pStyle w:val="BodyText"/>
-      </w:pPr>
-      <w:r>
-        <w:t xml:space="preserve">对研究者而言，本文框架的直接启示是把验证投入对准证据链的薄弱环节，而不是重复增加同类证据。一个已经具有多重表达和关联证据的候选位点，再增加一项差异表达分析，对其证据等级的提升有限；真正能推动升级的是内源编辑、体内模型或跨群体复核。明确一个位点“缺哪一环”，比反复确认“它看起来合理”更有价值。</w:t>
-      </w:r>
-    </w:p>
-    <w:p>
-      <w:pPr>
-        <w:pStyle w:val="BodyText"/>
-      </w:pPr>
-      <w:r>
-        <w:t xml:space="preserve">对育种企业而言，应区分证据轴和产业轴分别决策。复杂经济性状的长期改良仍应以基因组选择和多性状选择指数为主干；少数 variant-level A 主效位点可用于品种特征管理、商品分级和保种；B+ 位点主要用于排序和优先验证；基因编辑靶点则必须在监管、福利和病原生态约束下单独评估。工具选择还要结合自身资源：MAS 成本最低，GS 需要表型基础设施，编辑目前更适合大型主体或公共机构主导。其中，高质量、可比较、可用于遗传评估的表型记录体系，是比追加分子数据更基础、也更值得优先投入的方向。</w:t>
-      </w:r>
-    </w:p>
-    <w:p>
-      <w:pPr>
-        <w:pStyle w:val="BodyText"/>
-      </w:pPr>
-      <w:r>
-        <w:t xml:space="preserve">总之，家鸡精准育种的现实瓶颈不是候选信号太少，而是证据上限与性状结构、表型可测量性和功能验证可及性密切绑定。本文提出的证据成熟度框架，价值不在于产生新的评级，而在于为讨论提供一种共同语言，使候选位点的能力与限制都能被清楚地说出来：哪些只是线索，哪些值得验证，哪些已经可用，以及在什么场景下可用。在这个意义上，更明确的证据上限判断和更恰当的工具匹配，比候选基因清单的进一步扩张，更能推动家鸡复杂性状研究真正转化为育种价值。</w:t>
+        <w:t xml:space="preserve">7.3 结论</w:t>
+      </w:r>
+    </w:p>
+    <w:p>
+      <w:pPr>
+        <w:pStyle w:val="BodyText"/>
+      </w:pPr>
+      <w:r>
+        <w:t xml:space="preserve">家鸡复杂性状研究已经积累了足够多的候选信号；下一阶段的关键不在于继续扩张清单，而在于诚实地标注每个信号处在什么证据阶段、缺哪一环、适合什么场景。本文框架的作用正是提供这样一种共同语言——它不产生新的生物学事实，而是让已有证据的强度和边界变得可被讨论、可被比较、也可被质疑。</w:t>
+      </w:r>
+    </w:p>
+    <w:p>
+      <w:pPr>
+        <w:pStyle w:val="BodyText"/>
+      </w:pPr>
+      <w:r>
+        <w:t xml:space="preserve">落到实践，这一视角对不同主体含义不同。对研究者，它意味着把有限的验证资源对准证据链的断点，而不是反复加固已经成立的环节：明确一个位点缺哪一环，比再次确认它看起来合理更有价值。对育种者，它意味着接受一个现实——复杂经济性状的改良在可见的未来仍将以基因组选择为主干，少数强证据位点只在其适配的场景里发挥作用，而非承担主选择功能。</w:t>
+      </w:r>
+    </w:p>
+    <w:p>
+      <w:pPr>
+        <w:pStyle w:val="BodyText"/>
+      </w:pPr>
+      <w:r>
+        <w:t xml:space="preserve">归根结底，家鸡精准育种的进步，取决于证据上限、性状结构和工具匹配三者能否被持续而清醒地对齐，而不取决于候选基因清单还能列多长。把“证据有多强”与“是否适合用于育种”这两个问题分开、再分别回答清楚，正是本文希望为家鸡复杂性状研究与育种转化提供的基本判断框架。</w:t>
       </w:r>
     </w:p>
     <w:p>

</xml_diff>

<commit_message>
Revise chapter 5 evidence upgrade discussion
</commit_message>
<xml_diff>
--- a/家鸡候选位点证据分级_当前中稿.docx
+++ b/家鸡候选位点证据分级_当前中稿.docx
@@ -5348,7 +5348,7 @@
         <w:pStyle w:val="BodyText"/>
       </w:pPr>
       <w:r>
-        <w:t xml:space="preserve">在本文框架中，功能验证不是所有证据中的普通加分项，而是 A 级证据的关键门槛。没有功能验证，候选位点即使具有较强统计重复性和机制解释，也通常只能停留在 B 或 B+。但不同功能实验的证据强度并不相同。报告基因、细胞模型、过表达、敲低、CRISPRa/i、高通量筛选和体外病原复制实验，可以证明候选序列或基因具有功能潜力；内源编辑、自然突变或等位基因导入、PGC 介导编辑、体内模型和救援实验，才更接近因果判定。功能验证的目标不是简单地“做一个实验”，而是逐步建立“候选变异或靶点—分子效应—细胞或组织功能—体内表型”的证据链。</w:t>
+        <w:t>在本文框架中，功能验证不是所有证据中的普通加分项，而是 A 级证据的关键门槛。没有功能验证，候选位点即使具有较强统计重复性和机制解释，也通常只能停留在 B 或 B+。但不同功能实验的证据强度并不相同。报告基因、MPRA、细胞模型、过表达、敲低、CRISPRa/i、高通量筛选和体外病原复制实验，可以证明候选序列或基因具有功能潜力（Inoue and Ahituv, 2015；Kampmann, 2018）；内源编辑、自然突变或等位基因导入、PGC 介导编辑、体内模型和救援实验，才更接近因果判定。功能验证的目标不是简单地“做一个实验”，而是逐步建立“候选变异或靶点—分子效应—细胞或组织功能—体内表型”的证据链。</w:t>
       </w:r>
     </w:p>
     <w:p>
@@ -5540,31 +5540,69 @@
               <w:jc w:val="left"/>
             </w:pPr>
             <w:r>
-              <w:t xml:space="preserve">MPRA、CRISPR 筛选或单细胞扰动命中</w:t>
-            </w:r>
-          </w:p>
-        </w:tc>
-        <w:tc>
-          <w:tcPr/>
-          <w:p>
-            <w:pPr>
-              <w:pStyle w:val="Compact"/>
-              <w:jc w:val="left"/>
-            </w:pPr>
-            <w:r>
-              <w:t xml:space="preserve">单基因验证、内源验证、目标组织和真实表型验证</w:t>
-            </w:r>
-          </w:p>
-        </w:tc>
-        <w:tc>
-          <w:tcPr/>
-          <w:p>
-            <w:pPr>
-              <w:pStyle w:val="Compact"/>
-              <w:jc w:val="left"/>
-            </w:pPr>
-            <w:r>
-              <w:t xml:space="preserve">gene/target-level A 或 B+，取决于是否完成体内因果验证</w:t>
+              <w:t>MPRA、CRISPR 筛选或单细胞扰动命中</w:t>
+            </w:r>
+          </w:p>
+        </w:tc>
+        <w:tc>
+          <w:tcPr/>
+          <w:p>
+            <w:pPr>
+              <w:pStyle w:val="Compact"/>
+              <w:jc w:val="left"/>
+            </w:pPr>
+            <w:r>
+              <w:t>单基因验证、机制确认和目标组织验证；未完成体内因果验证</w:t>
+            </w:r>
+          </w:p>
+        </w:tc>
+        <w:tc>
+          <w:tcPr/>
+          <w:p>
+            <w:pPr>
+              <w:pStyle w:val="Compact"/>
+              <w:jc w:val="left"/>
+            </w:pPr>
+            <w:r>
+              <w:t>B+</w:t>
+            </w:r>
+          </w:p>
+        </w:tc>
+      </w:tr>
+      <w:tr>
+        <w:tc>
+          <w:tcPr/>
+          <w:p>
+            <w:pPr>
+              <w:pStyle w:val="Compact"/>
+              <w:jc w:val="left"/>
+            </w:pPr>
+            <w:r>
+              <w:t>MPRA、CRISPR 筛选或单细胞扰动命中</w:t>
+            </w:r>
+          </w:p>
+        </w:tc>
+        <w:tc>
+          <w:tcPr/>
+          <w:p>
+            <w:pPr>
+              <w:pStyle w:val="Compact"/>
+              <w:jc w:val="left"/>
+            </w:pPr>
+            <w:r>
+              <w:t>单基因验证、内源验证、目标组织和体内因果验证；完成体内因果验证</w:t>
+            </w:r>
+          </w:p>
+        </w:tc>
+        <w:tc>
+          <w:tcPr/>
+          <w:p>
+            <w:pPr>
+              <w:pStyle w:val="Compact"/>
+              <w:jc w:val="left"/>
+            </w:pPr>
+            <w:r>
+              <w:t>gene/target-level A</w:t>
             </w:r>
           </w:p>
         </w:tc>
@@ -5592,15 +5630,15 @@
         <w:pStyle w:val="FirstParagraph"/>
       </w:pPr>
       <w:r>
-        <w:t xml:space="preserve">表达差异是家鸡复杂性状研究中最常见的机制证据之一。高低表型组之间的差异表达、目标组织中的高表达、感染后诱导表达或发育阶段特异表达，能够提示候选基因可能参与相关生物过程。然而，表达相关本身不能区分原因和结果。一个基因在高脂和低脂个体之间差异表达，可能参与脂肪沉积，也可能只是脂肪细胞状态变化后的结果；一个基因在感染后上调，可能参与抗病，也可能只是炎症反应的一部分。因此，单纯差异表达通常只能把候选位点从 C 级线索推进到机制候选，不能直接形成强因果证据。</w:t>
-      </w:r>
-    </w:p>
-    <w:p>
-      <w:pPr>
-        <w:pStyle w:val="BodyText"/>
-      </w:pPr>
-      <w:r>
-        <w:t xml:space="preserve">证据升级的关键，是把表达变化与遗传变异连接起来。分子 QTL、共定位、等位基因特异表达和等位基因特异染色质开放，可以部分回答候选变异是否影响目标组织中的分子表型。如果一个 GWAS 信号与 eQTL 信号共定位，并且有利等位基因或风险等位基因同时对应目标基因表达变化，证据强度就明显高于普通差异表达。如果同一个个体内两个等位基因表现出表达不平衡，且这种不平衡与候选变异或单倍型一致，则更能支持顺式调控机制。</w:t>
+        <w:t>表达差异是家鸡复杂性状研究中最常见的机制证据之一，可以提示候选基因可能参与相关生物过程。单纯差异表达不能区分原因与结果（见 2.2 节），通常只能把候选位点从 C 级线索推进到机制候选，不能直接形成强因果证据。</w:t>
+      </w:r>
+    </w:p>
+    <w:p>
+      <w:pPr>
+        <w:pStyle w:val="BodyText"/>
+      </w:pPr>
+      <w:r>
+        <w:t>证据升级的关键，是把表达变化与遗传变异连接起来。分子 QTL、共定位、等位基因特异表达和等位基因特异染色质开放，可以部分回答候选变异是否影响目标组织中的分子表型。如果一个 GWAS 信号与 eQTL 信号共定位，并且有利等位基因或风险等位基因同时对应目标基因表达变化，证据强度就明显高于普通差异表达（Giambartolomei et al., 2014；Zhu et al., 2016）。如果同一个个体内两个等位基因表现出表达不平衡，且这种不平衡与候选变异或单倍型一致，则更能支持顺式调控机制。</w:t>
       </w:r>
     </w:p>
     <w:p>
@@ -5616,7 +5654,7 @@
         <w:pStyle w:val="BodyText"/>
       </w:pPr>
       <w:r>
-        <w:t xml:space="preserve">对于非编码变异，这一过程尤其重要。非编码候选位点通常不会改变蛋白序列，其作用更可能体现在增强子活性、转录因子结合、剪接调控、染色质状态或三维互作上。因此，对非编码位点而言，理想的升级路径不是从 GWAS 直接跳到“候选基因”，而是依次确认候选变异、调控元件、等位基因分子效应、靶基因和表型后果。PHIP、IGF2BP1 和 rs734209466–IGFBP2/IGFBP5 这类案例的价值，正是在于把候选信号向这一链条推进；其不足，则在于仍需要更强的内源和体内证据来完成从 B/B+ 到 A 的跨越。</w:t>
+        <w:t>对于非编码变异，这一过程尤其重要。非编码候选位点通常不会改变蛋白序列，其作用更可能体现在增强子活性、转录因子结合、剪接调控、染色质状态或三维互作上。因此，对非编码位点而言，理想的升级路径不是从 GWAS 直接跳到“候选基因”，而是依次确认候选变异、调控元件、等位基因分子效应、靶基因和表型后果。PHIP、IGF2BP1 启动子缺失和 rs734209466–IGFBP2/IGFBP5 这类案例的价值，正在于把候选信号从统计关联推进到调控元件、等位基因分子效应和靶基因解释链条（Wang D. et al., 2025；Wang K. et al., 2021；Shen et al., 2024）。</w:t>
       </w:r>
     </w:p>
     <w:bookmarkEnd w:id="38"/>
@@ -5634,7 +5672,7 @@
         <w:pStyle w:val="FirstParagraph"/>
       </w:pPr>
       <w:r>
-        <w:t xml:space="preserve">报告基因实验是验证候选调控序列最常见的方法之一。它可以比较不同等位基因或不同片段的转录调控活性，判断候选变异是否可能影响增强子或启动子功能。对于非编码变异，报告基因阳性通常比单纯“落在开放染色质区域”更有说服力，因为它至少证明候选片段具有改变转录输出的能力。然而，报告基因实验也有明显边界：候选序列被放入人工载体和简化调控环境中，脱离了原生染色质、三维空间结构、细胞发育状态和组织微环境。因此，报告基因阳性说明“有调控潜力”，不等于证明“在体内目标组织中承担实际调控功能”。</w:t>
+        <w:t>报告基因实验是验证候选调控序列最常见的方法之一。它可以比较不同等位基因或不同片段的转录调控活性，判断候选变异是否可能影响增强子或启动子功能。对于非编码变异，报告基因阳性通常比单纯“落在开放染色质区域”更有说服力，因为它至少证明候选片段具有改变转录输出的能力。然而，报告基因阳性只说明候选片段有调控潜力，不等于在体内目标组织承担实际功能（其边界见 2.3 节）。</w:t>
       </w:r>
     </w:p>
     <w:p>
@@ -5658,7 +5696,7 @@
         <w:pStyle w:val="BodyText"/>
       </w:pPr>
       <w:r>
-        <w:t xml:space="preserve">由此可见，从 B+ 升级到 A，最关键的不是实验数量，而是实验设计是否针对因果问题。多个报告基因、差异表达和细胞实验可以形成很强的机制链，但如果都没有回到内源变异和体内表型，仍不宜自动升 A。相反，一个设计严密的等位基因替换或体内救援实验，即使样本规模有限，也可能提供更接近因果判定的证据。以 PHIP 为例，当前证据已经涉及非编码变异、转录因子结合、表达变化和颗粒细胞功能，但仍缺少决定性的内源等位基因替换或 PGC 编辑后产蛋相关表型重现，因此本文将其评为 B 而非 B+ 或 A。这正是“实验设计针对因果问题”优先于“实验数量”的具体体现。</w:t>
+        <w:t>由此可见，从 B+ 升级到 A，最关键的不是实验数量，而是实验设计是否针对因果问题。多个报告基因、差异表达和细胞实验可以形成很强的机制链，但如果都没有回到内源变异和体内表型，仍不宜自动升 A。相反，一个设计严密的等位基因替换或体内救援实验，即使样本规模有限，也可能提供更接近因果判定的证据。以 PHIP 为例（Wang D. et al., 2025），当前证据已经涉及非编码变异、转录因子结合、表达变化和颗粒细胞功能，但仍缺少决定性的内源等位基因替换或 PGC 编辑后产蛋相关表型重现，因此本文将其评为 B 而非 B+ 或 A。这正是“实验设计针对因果问题”优先于“实验数量”的具体体现。</w:t>
       </w:r>
     </w:p>
     <w:bookmarkEnd w:id="39"/>
@@ -5676,7 +5714,7 @@
         <w:pStyle w:val="FirstParagraph"/>
       </w:pPr>
       <w:r>
-        <w:t xml:space="preserve">家鸡功能验证的一个特殊挑战，是获得稳定的体内遗传模型比模式动物更困难。鸡胚胎发育、生殖细胞操作、世代周期、饲养成本和伦理监管都会限制大规模功能验证。PGC 介导编辑为家鸡提供了重要路径，因为它可以在生殖系层面进行基因编辑或等位基因操作，从而建立更接近真实遗传背景的体内模型。对于复杂性状候选位点，PGC 编辑的价值不仅在于“能改基因”，更在于它有可能把候选变异、内源表达和体内表型连接起来。</w:t>
+        <w:t>家鸡功能验证的一个特殊挑战，是获得稳定的体内遗传模型比模式动物更困难。鸡胚胎发育、生殖细胞操作、世代周期、饲养成本和伦理监管都会限制大规模功能验证。鸡世代间隔约 5–6 个月，加 PGC 嵌合体建立、生殖系传递和 F2 表型采集，单个编辑品系从构建到获得可用体内表型通常需 2 年以上。PGC 介导编辑为家鸡提供了重要路径，因为它可以在生殖系层面进行基因编辑或等位基因操作，从而建立更接近真实遗传背景的体内模型（van de Lavoir et al., 2006；Whyte et al., 2015）。对于复杂性状候选位点，PGC 编辑的价值不仅在于“能改基因”，更在于它有可能把候选变异、内源表达和体内表型连接起来。</w:t>
       </w:r>
     </w:p>
     <w:p>
@@ -5700,7 +5738,7 @@
         <w:pStyle w:val="BodyText"/>
       </w:pPr>
       <w:r>
-        <w:t xml:space="preserve">不过，体内功能验证仍不等于产业应用成熟。即使 PGC 编辑或体内模型证明某个变异或靶点具有功能，也仍需要目标育种群体中的等位基因频率、遗传背景依赖、多性状影响和经济权重评估。ANP32A 这类抗病靶点尤其说明这一点：即使在 PGC 编辑或体内模型层面已经达到 gene/target-level A，自然群体可育种变异层面仍可能停留在 B 或 C；且其 T 轴位置受病原逃逸、补偿通路、动物福利、监管路径和消费者接受度等多重约束。因此，功能验证可以推动证据轴升级，但不能自动完成产业轴升级。</w:t>
+        <w:t>不过，体内功能验证仍不等于产业应用成熟。即使 PGC 编辑或体内模型证明某个变异或靶点具有功能，也仍需要目标育种群体中的等位基因频率、遗传背景依赖、多性状影响和经济权重评估。ANP32A 这类抗病靶点尤其说明这一点（Idoko-Akoh et al., 2023）：即使在 PGC 编辑或体内模型层面已经达到 gene/target-level A，自然群体可育种变异层面仍可能停留在 B 或 C；且其 T 轴位置受病原逃逸、补偿通路、动物福利、监管路径和消费者接受度等多重约束。因此，功能验证可以推动证据轴升级，但不能自动完成产业轴升级。</w:t>
       </w:r>
     </w:p>
     <w:bookmarkEnd w:id="40"/>
@@ -5718,7 +5756,7 @@
         <w:pStyle w:val="FirstParagraph"/>
       </w:pPr>
       <w:r>
-        <w:t xml:space="preserve">随着基因组编辑、单细胞组学、MPRA、CRISPR 筛选和多组学整合的发展，高通量功能筛选正在成为候选位点优先排序的重要工具。MPRA 可以同时测试大量候选调控片段或等位变异的转录活性；CRISPRa/i 或 CRISPR knockout 筛选可以在细胞层面寻找影响病毒复制、细胞分化、代谢状态或免疫反应的基因；单细胞扰动实验可以把基因扰动与细胞状态变化联系起来。这些方法显著提高了候选筛选效率，尤其适合在大量 GWAS 或选择扫描信号中识别更值得验证的对象。</w:t>
+        <w:t>随着基因组编辑、单细胞组学、MPRA、CRISPR 筛选和多组学整合的发展，高通量功能筛选正在成为候选位点优先排序的重要工具。MPRA 可以同时测试大量候选调控片段或等位变异的转录活性；CRISPRa/i 或 CRISPR knockout 筛选可以在细胞层面寻找影响病毒复制、细胞分化、代谢状态或免疫反应的基因（Inoue and Ahituv, 2015；Kampmann, 2018）；单细胞扰动实验可以把基因扰动与细胞状态变化联系起来。这些方法显著提高了候选筛选效率，尤其适合在大量 GWAS 或选择扫描信号中识别更值得验证的对象。</w:t>
       </w:r>
     </w:p>
     <w:p>
@@ -5756,12 +5794,11 @@
       <w:r>
         <w:rPr>
           <w:b/>
-          <w:bCs/>
         </w:rPr>
-        <w:t xml:space="preserve">候选构建</w:t>
-      </w:r>
-      <w:r>
-        <w:t xml:space="preserve">：利用 GWAS、QTL、选择扫描、多组学共定位和功能注释建立候选位点集合。</w:t>
+        <w:t>1. 候选构建</w:t>
+      </w:r>
+      <w:r>
+        <w:t>：利用 GWAS、QTL、选择扫描、多组学共定位和功能注释建立候选位点集合。</w:t>
       </w:r>
     </w:p>
     <w:p>
@@ -5775,12 +5812,11 @@
       <w:r>
         <w:rPr>
           <w:b/>
-          <w:bCs/>
         </w:rPr>
-        <w:t xml:space="preserve">优先排序</w:t>
-      </w:r>
-      <w:r>
-        <w:t xml:space="preserve">：利用 MPRA、CRISPR 筛选、单细胞扰动或其他高通量实验识别高验证价值候选。</w:t>
+        <w:t>2. 优先排序</w:t>
+      </w:r>
+      <w:r>
+        <w:t>：利用 MPRA、CRISPR 筛选、单细胞扰动或其他高通量实验识别高验证价值候选。</w:t>
       </w:r>
     </w:p>
     <w:p>
@@ -5794,12 +5830,11 @@
       <w:r>
         <w:rPr>
           <w:b/>
-          <w:bCs/>
         </w:rPr>
-        <w:t xml:space="preserve">机制确认</w:t>
-      </w:r>
-      <w:r>
-        <w:t xml:space="preserve">：通过等位基因特异表达、共定位、报告基因、细胞模型和调控元件验证确认候选机制。</w:t>
+        <w:t>3. 机制确认</w:t>
+      </w:r>
+      <w:r>
+        <w:t>：通过等位基因特异表达、共定位、报告基因、细胞模型和调控元件验证确认候选机制。</w:t>
       </w:r>
     </w:p>
     <w:p>
@@ -5813,12 +5848,11 @@
       <w:r>
         <w:rPr>
           <w:b/>
-          <w:bCs/>
         </w:rPr>
-        <w:t xml:space="preserve">因果定性</w:t>
-      </w:r>
-      <w:r>
-        <w:t xml:space="preserve">：通过内源编辑、PGC 介导编辑、体内模型、救援实验和目标群体验证，判断其能否达到 variant-level A 或 gene/target-level A。</w:t>
+        <w:t>4. 因果定性</w:t>
+      </w:r>
+      <w:r>
+        <w:t>：通过内源编辑、PGC 介导编辑、体内模型、救援实验和目标群体验证，判断其能否达到 variant-level A 或 gene/target-level A。</w:t>
       </w:r>
     </w:p>
     <w:p>

</xml_diff>

<commit_message>
Revise chapter 6 breeding decision discussion
</commit_message>
<xml_diff>
--- a/家鸡候选位点证据分级_当前中稿.docx
+++ b/家鸡候选位点证据分级_当前中稿.docx
@@ -5895,7 +5895,7 @@
         <w:pStyle w:val="BodyText"/>
       </w:pPr>
       <w:r>
-        <w:t xml:space="preserve">标记辅助选择、基因组选择和基因编辑是覆盖不同证据等级与应用场景的并行工具，而非依次替代的三代技术。MAS 适用于少数效应明确、检测方便、与目标表型稳定相关的主效位点；GS 适用于多数多基因复杂经济性状；基因编辑既是强功能验证工具，也可能在少数关键靶点上具有定向改造价值，但它对证据等级、监管路径和产业可接受性的要求最高。因此，证据成熟度框架的核心用途不是给候选位点贴标签，而是防止育种工具错配。</w:t>
+        <w:t>标记辅助选择、基因组选择和基因编辑是覆盖不同证据等级与应用场景的并行工具，而非依次替代的三代技术。MAS 适用于少数效应明确、检测方便、与目标表型稳定相关的主效位点；GS 适用于多数多基因复杂经济性状（Wolc, 2014；Wolc et al., 2016）；基因编辑既是强功能验证工具，也可能在少数关键靶点上具有定向改造价值，但它对证据等级、监管路径和产业可接受性的要求最高。因此，证据成熟度框架的核心用途不是给候选位点贴标签，而是防止育种工具错配。</w:t>
       </w:r>
     </w:p>
     <w:p>
@@ -6342,7 +6342,7 @@
         <w:pStyle w:val="FirstParagraph"/>
       </w:pPr>
       <w:r>
-        <w:t xml:space="preserve">标记辅助选择最适合处理效应明确、分型可靠、应用目标单一的位点。第 4 章中达到 variant-level A 的蓝壳 SLCO1B3、黄肤 BCDO2、纤维黑变 EDN3、豌豆冠 SOX5、玫瑰冠相关倒位以及部分羽色和羽型位点，均可作为 MAS 或品种特征管理的典型对象。这类位点的共同特点是表型边界清楚、变异效应较大、检测成本低，且 T 轴应用场景相对明确。对于壳色、肤色、羽色、冠型、乌骨性状和特定品种识别而言，MAS 可以提高选种准确性，减少表型误判，并服务于保种、商品分级和市场定位。</w:t>
+        <w:t>标记辅助选择最适合处理效应明确、分型可靠、应用目标单一的位点。第 4 章中达到 variant-level A 的蓝壳 SLCO1B3、黄肤 BCDO2、纤维黑变 EDN3、豌豆冠 SOX5、玫瑰冠相关倒位以及部分羽色和羽型位点，均可作为 MAS 或品种特征管理的典型对象（Wang Z. et al., 2013；Eriksson et al., 2008；Dorshorst et al., 2011；Wright et al., 2009；Imsland et al., 2012）。这类位点的共同特点是表型边界清楚、变异效应较大、检测成本低，且 T 轴应用场景相对明确。对于壳色、肤色、羽色、冠型、乌骨性状和特定品种识别而言，MAS 可以提高选种准确性，减少表型误判，并服务于保种、商品分级和市场定位。</w:t>
       </w:r>
     </w:p>
     <w:p>
@@ -6366,7 +6366,7 @@
         <w:pStyle w:val="BodyText"/>
       </w:pPr>
       <w:r>
-        <w:t xml:space="preserve">对于 B+ 位点，MAS 应更加谨慎。IGF2BP1 启动子缺失、rs734209466–IGFBP2/IGFBP5 调控链、TSHR 驯化相关变异以及部分受体型抗病位点，虽然具有较强机制证据或候选价值，但仍不宜直接作为 MAS 标记。它们更适合作为目标群体验证对象、功能实验优先对象或风险评估位点。在严格控制的试点研究中，可以测试其作为辅助标记的价值，但不应在主流选择流程中使用。只有当这些位点在目标育种群体中表现出稳定效应，并且完成多性状和经济权重评估后，才可能进入更直接的选择应用。对于 C 或普通 B 级候选信号，直接用于 MAS 风险更高，容易把群体特异 LD、表型偶然关联或机制线索误当作因果标记。</w:t>
+        <w:t>对于 B+ 位点，MAS 应更加谨慎。IGF2BP1 启动子缺失、rs734209466–IGFBP2/IGFBP5 调控链、TSHR 驯化相关变异以及部分受体型抗病位点，虽然具有较强机制证据或候选价值，但仍不宜直接作为 MAS 标记（Wang K. et al., 2021；Shen et al., 2024；Rubin et al., 2010；Lee et al., 2017；Li et al., 2018）。它们更适合作为目标群体验证对象、功能实验优先对象或风险评估位点。在严格控制的试点研究中，可以测试其作为辅助标记的价值，但不应在主流选择流程中使用。只有当这些位点在目标育种群体中表现出稳定效应，并且完成多性状和经济权重评估后，才可能进入更直接的选择应用。对于 C 或普通 B 级候选信号，直接用于 MAS 风险更高，容易把群体特异 LD、表型偶然关联或机制线索误当作因果标记。</w:t>
       </w:r>
     </w:p>
     <w:bookmarkEnd w:id="43"/>
@@ -6384,39 +6384,39 @@
         <w:pStyle w:val="FirstParagraph"/>
       </w:pPr>
       <w:r>
-        <w:t xml:space="preserve">对于生长、饲料效率、产蛋持续性、肉质、蛋壳强度、复杂抗病性和地方适应等多基因经济性状，基因组选择仍应是主要改良工具。复杂经济性状通常由大量小效应位点共同影响，单个位点即使具有一定机制证据，也难以解释足够多的遗传变异。第 4 章显示，生长、脂肪沉积和饲料效率方向目前最高多为 B+；产蛋数量和综合蛋品质多数为 B 或 C–B；抗病性状虽然有 gene/target-level A 靶点，但自然变异层面的可育种 A 级位点很少。这种证据分布决定了复杂经济性状不宜依赖少数候选基因直接选择。</w:t>
-      </w:r>
-    </w:p>
-    <w:p>
-      <w:pPr>
-        <w:pStyle w:val="BodyText"/>
-      </w:pPr>
-      <w:r>
-        <w:t xml:space="preserve">GS 的优势在于不要求每个位点都被证明为因果变异，而是利用全基因组标记捕捉整体遗传值。对于高度多基因性状，GS 比 MAS 更符合遗传结构。尤其在商业育种体系中，选择目标通常不是单一性状最大化，而是生长、繁殖、饲料效率、肉质、健康、福利和遗传多样性的综合平衡。多性状选择指数可以将不同性状的经济权重纳入同一框架，避免单一候选位点选择造成不必要的性状偏移。</w:t>
-      </w:r>
-    </w:p>
-    <w:p>
-      <w:pPr>
-        <w:pStyle w:val="BodyText"/>
-      </w:pPr>
-      <w:r>
-        <w:t xml:space="preserve">证据成熟度框架可以增强 GS，而不是与 GS 对立。B+ 或高可信 B 级位点可以作为功能先验，用于构建加权 GS 模型、贝叶斯模型或功能注释增强模型。比如，IGF2BP1 或 IGFBP2/IGFBP5 相关位点可作为生长和脂肪沉积方向的机制先验；MHC-B 或部分抗病候选区域可作为疾病风险模型中的候选区域。对于尚未达到 B+ 的位点，如 PHIP，其在 GS 模型中应仅作为低权重候选区段或候选清单的一部分；其更恰当的应用路径仍是功能验证，详见第 6.4 节。</w:t>
-      </w:r>
-    </w:p>
-    <w:p>
-      <w:pPr>
-        <w:pStyle w:val="BodyText"/>
-      </w:pPr>
-      <w:r>
-        <w:t xml:space="preserve">这类功能先验必须有权重边界。例如，在腹脂沉积 GS 模型中，rs734209466–IGFBP2/IGFBP5 区域具有具体候选变异和较强机制证据，可作为高权重先验位点，但其权重上限不应超过该位点在交叉验证中显示的解释力。在产蛋持续性 GS 模型中，PHIP 和 PRLR 邻近区域因变异未完全明确，只能作为候选先验区段，且权重应低于明确变异位点；同时，其权重也不应超过该位点在该模型交叉验证中显示的解释力。由于产蛋持续性方向目前缺少 variant-level A 位点，模型整体应以 GS 多基因评估为主，候选先验作用有限。这样的做法既利用了 B+ 或 B 级位点的机制信息，又避免把候选位点当作确定性因果标记。</w:t>
-      </w:r>
-    </w:p>
-    <w:p>
-      <w:pPr>
-        <w:pStyle w:val="BodyText"/>
-      </w:pPr>
-      <w:r>
-        <w:t xml:space="preserve">GS 的另一个关键前提是高质量表型。复杂性状的遗传评估不能只依赖更密集的基因型或更多多组学数据。饲料效率需要标准化个体采食记录，产蛋持续性需要纵向记录，肉质需要一致的屠宰和测定流程，抗病性状需要明确感染模型和终点，地方适应需要共同环境或跨环境表型。若表型质量不足，GS 预测准确性和候选位点解释都会受到限制。由此可见，复杂经济性状的主要瓶颈往往不是缺少候选基因，而是缺少稳定、可比较、可用于遗传评估的高质量表型体系。表型基础设施的瓶颈对 MAS 和 GS 都是约束；但对基因编辑而言，约束的来源进一步扩展到监管、福利和病原生态，下一节将讨论这些非生物学约束如何决定编辑工具的实际可用边界。</w:t>
+        <w:t>对于生长、饲料效率、产蛋持续性、肉质、蛋壳强度、复杂抗病性和地方适应等多基因经济性状，基因组选择仍应是主要改良工具（Wolc, 2014；Wolc et al., 2016）。复杂经济性状通常由大量小效应位点共同影响，单个位点即使具有一定机制证据，也难以解释足够多的遗传变异。第 4 章显示，生长、脂肪沉积和饲料效率方向目前最高多为 B+；产蛋数量和综合蛋品质多数为 B 或 C–B；抗病性状虽然有 gene/target-level A 靶点，但自然变异层面的可育种 A 级位点很少。这种证据分布决定了复杂经济性状不宜依赖少数候选基因直接选择。</w:t>
+      </w:r>
+    </w:p>
+    <w:p>
+      <w:pPr>
+        <w:pStyle w:val="BodyText"/>
+      </w:pPr>
+      <w:r>
+        <w:t>GS 的优势在于不要求每个位点都被证明为因果变异，而是利用全基因组标记捕捉整体遗传值。对于高度多基因性状，GS 比 MAS 更符合遗传结构（Wolc, 2014；Wolc et al., 2016）。尤其在商业育种体系中，选择目标通常不是单一性状最大化，而是生长、繁殖、饲料效率、肉质、健康、福利和遗传多样性的综合平衡。多性状选择指数可以将不同性状的经济权重纳入同一框架，避免单一候选位点选择造成不必要的性状偏移。</w:t>
+      </w:r>
+    </w:p>
+    <w:p>
+      <w:pPr>
+        <w:pStyle w:val="BodyText"/>
+      </w:pPr>
+      <w:r>
+        <w:t>证据成熟度框架可以增强 GS，而不是与 GS 对立。B+ 或高可信 B 级位点可以作为功能先验，用于构建加权 GS 模型、贝叶斯模型或功能注释增强模型（MacLeod et al., 2016）。比如，IGF2BP1 或 IGFBP2/IGFBP5 相关位点可作为生长和脂肪沉积方向的机制先验；MHC-B 或部分抗病候选区域可作为疾病风险模型中的候选区域。对于尚未达到 B+ 的位点，如 PHIP，其在 GS 模型中应仅作为低权重候选区段或候选清单的一部分；其更恰当的应用路径仍是功能验证，详见第 6.4 节。</w:t>
+      </w:r>
+    </w:p>
+    <w:p>
+      <w:pPr>
+        <w:pStyle w:val="BodyText"/>
+      </w:pPr>
+      <w:r>
+        <w:t>这类功能先验必须有权重边界。例如，在腹脂沉积 GS 模型中，rs734209466–IGFBP2/IGFBP5 区域具有具体候选变异和较强机制证据，可作为高权重先验位点（Shen et al., 2024），但其权重上限不应超过该位点在交叉验证中显示的解释力。在产蛋持续性 GS 模型中，PHIP 和 PRLR 邻近区域因变异未完全明确，只能作为候选先验区段，且权重应低于明确变异位点；同时，其权重也不应超过该位点在该模型交叉验证中显示的解释力。由于产蛋持续性方向目前缺少 variant-level A 位点，模型整体应以 GS 多基因评估为主，候选先验作用有限。这样的做法既利用了 B+ 或 B 级位点的机制信息，又避免把候选位点当作确定性因果标记。</w:t>
+      </w:r>
+    </w:p>
+    <w:p>
+      <w:pPr>
+        <w:pStyle w:val="BodyText"/>
+      </w:pPr>
+      <w:r>
+        <w:t>GS 的另一个关键前提是高质量表型。复杂性状的遗传评估不能只依赖更密集的基因型或更多组学数据。饲料效率需要标准化个体采食记录，产蛋持续性需要纵向记录，肉质需要一致的屠宰和测定流程，抗病性状需要明确感染模型和终点，地方适应需要共同环境或跨环境表型（Wolc, 2014；Liu et al., 2017；Mebratie et al., 2019）。若表型质量不足，GS 预测准确性和候选位点解释都会受到限制。由此可见，复杂经济性状的主要瓶颈往往不是缺少候选基因，而是缺少稳定、可比较、可用于遗传评估的高质量表型体系。表型基础设施的瓶颈对 MAS 和 GS 都是约束；但对基因编辑而言，约束的来源进一步扩展到监管、福利和病原生态，下一节将讨论这些非生物学约束如何决定编辑工具的实际可用边界。</w:t>
       </w:r>
     </w:p>
     <w:bookmarkEnd w:id="44"/>
@@ -6434,7 +6434,7 @@
         <w:pStyle w:val="FirstParagraph"/>
       </w:pPr>
       <w:r>
-        <w:t xml:space="preserve">基因编辑在家鸡遗传研究中的价值首先是功能验证，其次才是潜在育种工具。PGC 介导编辑、内源等位基因替换、结构变异重建、靶点敲除或敲入，可以帮助研究者判断候选变异或基因是否真正影响目标表型。对于 B+ 位点，编辑实验是推动其向 A 级升级的关键路径。对于 gene/target-level 候选，编辑可以明确靶点是否具有功能作用；对于 variant-level 候选，最有价值的编辑设计是等位基因替换或自然变异重建，而不是简单敲除整个基因。</w:t>
+        <w:t>基因编辑在家鸡遗传研究中的价值首先是功能验证，其次才是潜在育种工具。PGC 介导编辑、内源等位基因替换、结构变异重建、靶点敲除或敲入，可以帮助研究者判断候选变异或基因是否真正影响目标表型（van de Lavoir et al., 2006；Whyte et al., 2015）。对于 B+ 位点，编辑实验是推动其向 A 级升级的关键路径。对于 gene/target-level 候选，编辑可以明确靶点是否具有功能作用；对于 variant-level 候选，最有价值的编辑设计是等位基因替换或自然变异重建，而不是简单敲除整个基因。</w:t>
       </w:r>
     </w:p>
     <w:p>
@@ -6450,65 +6450,74 @@
         <w:pStyle w:val="BodyText"/>
       </w:pPr>
       <w:r>
-        <w:t xml:space="preserve">就证据非对称性而言，ANP32A 是</w:t>
-      </w:r>
-      <w:r>
-        <w:t xml:space="preserve"> </w:t>
-      </w:r>
+        <w:t>就证据非对称性而言，ANP32A 是 gene/target-level A + variant-level B–C 的极端非对称情形：编辑层面证据强，但自然群体可育种变异证据弱（Idoko-Akoh et al., 2023）；TVB/NHE1 则代表非对称程度较轻的情形，靶点功能证据和自然变异证据部分重叠（Lee et al., 2017；Li et al., 2018）。就监管路径而言，ANP32A 类靶点更接近纯编辑路径，主要在监管允许编辑的市场中具有产业前景；TVB/NHE1 类靶点可同时支持自然变异筛选和编辑两条路径，在监管严格的市场中也可能通过自然变异筛选实现部分育种价值。就应用边界而言，ANP32A 需要病原逃逸、ANP32 家族补偿和多性状副作用的额外评估；TVB/NHE1 仍需要病原亚群特异性、跨群体效应和体内感染验证。</w:t>
+      </w:r>
+    </w:p>
+    <w:p>
+      <w:pPr>
+        <w:pStyle w:val="BodyText"/>
+      </w:pPr>
+      <w:r>
+        <w:t xml:space="preserve">基于上述差异，对监管允许编辑的市场，研究投入可优先聚焦 ANP32A 这类高功能价值靶点的编辑路径；对监管严格的市场，TVB/NHE1 这类同时存在自然变异的靶点应是研究优先级更高的对象。</w:t>
+      </w:r>
+    </w:p>
+    <w:p>
+      <w:pPr>
+        <w:pStyle w:val="BodyText"/>
+      </w:pPr>
+      <w:r>
+        <w:t xml:space="preserve">对于复杂经济性状，基因编辑无法替代 GS。生长、饲料效率、产蛋持续性和肉质通常不由单个靶点决定。即使编辑某个关键调控基因能够改变表型，也可能引起多性状副作用。比如，提高体型可能影响腿部健康和繁殖性能；降低脂肪沉积可能影响肉质、代谢稳态或适应性；改变繁殖内分泌通路可能影响产蛋节律、卵巢健康和福利。所以，基因编辑更适合三类任务：第一，作为功能验证工具，确认 B+ 位点是否具备 A 级证据；第二，作为少数关键风险位点或主效位点的定向管理手段；第三，在抗病或特定生物安全场景中探索靶点突破，但必须进行严格 T 轴评估。</w:t>
+      </w:r>
+    </w:p>
+    <w:p>
+      <w:pPr>
+        <w:pStyle w:val="BodyText"/>
+      </w:pPr>
+      <w:r>
+        <w:t>基因编辑的 T 轴评估至少涉及三个独立维度。第一是监管路径。不同国家和地区对禽类基因编辑产品的监管态度差异很大，目标市场选择直接决定编辑应用的可行边界。由于不同国家和地区对禽类基因编辑产品的监管差异显著，编辑应用策略应优先评估目标市场（包括本地主流市场和出口目标市场）的具体监管现状，而非按全球平均情况估计可行性。第二是福利与多代追踪。编辑后多代的生长、繁殖、行为、健康和免疫指标监测，是负责任应用的基本要求，不能只凭 F0 或 F1 的短期表型决定产业化。第三是病原逃逸监测。抗病编辑尤其需要在产业实施前后建立病毒变异和宿主适应监测体系，否则单一靶点的保护效应可能在选择压力下被绕过。这三个维度任何一项缺失，编辑应用都难以从研究阶段进入产业阶段。</w:t>
+      </w:r>
+    </w:p>
+    <w:bookmarkEnd w:id="45"/>
+    <w:bookmarkStart w:id="46" w:name="具体情景代表性位点应该怎么用"/>
+    <w:p>
+      <w:pPr>
+        <w:pStyle w:val="Heading3"/>
+      </w:pPr>
+      <w:r>
+        <w:t xml:space="preserve">6.4 具体情景：代表性位点应该怎么用</w:t>
+      </w:r>
+    </w:p>
+    <w:p>
+      <w:pPr>
+        <w:pStyle w:val="FirstParagraph"/>
+      </w:pPr>
+      <w:r>
+        <w:t xml:space="preserve">将前文代表性位点放入育种决策框架，可以更清楚地看到不同证据等级对应的不同用途。</w:t>
+      </w:r>
+    </w:p>
+    <w:p>
+      <w:pPr>
+        <w:pStyle w:val="BodyText"/>
+      </w:pPr>
       <w:r>
         <w:rPr>
           <w:b/>
-          <w:bCs/>
         </w:rPr>
-        <w:t xml:space="preserve">gene/target-level A + variant-level B–C</w:t>
-      </w:r>
-      <w:r>
-        <w:t xml:space="preserve"> </w:t>
-      </w:r>
-      <w:r>
-        <w:t xml:space="preserve">的极端非对称情形：编辑层面证据强，但自然群体可育种变异证据弱；TVB/NHE1 则代表非对称程度较轻的情形，靶点功能证据和自然变异证据部分重叠。就监管路径而言，ANP32A 类靶点更接近纯编辑路径，主要在监管允许编辑的市场中具有产业前景；TVB/NHE1 类靶点可同时支持自然变异筛选和编辑两条路径，在监管严格的市场中也可能通过自然变异筛选实现部分育种价值。就应用边界而言，ANP32A 需要病原逃逸、ANP32 家族补偿和多性状副作用的额外评估；TVB/NHE1 仍需要病原亚群特异性、跨群体效应和体内感染验证。</w:t>
-      </w:r>
-    </w:p>
-    <w:p>
-      <w:pPr>
-        <w:pStyle w:val="BodyText"/>
-      </w:pPr>
-      <w:r>
-        <w:t xml:space="preserve">基于上述差异，对监管允许编辑的市场，研究投入可优先聚焦 ANP32A 这类高功能价值靶点的编辑路径；对监管严格的市场，TVB/NHE1 这类同时存在自然变异的靶点应是研究优先级更高的对象。</w:t>
-      </w:r>
-    </w:p>
-    <w:p>
-      <w:pPr>
-        <w:pStyle w:val="BodyText"/>
-      </w:pPr>
-      <w:r>
-        <w:t xml:space="preserve">对于复杂经济性状，基因编辑无法替代 GS。生长、饲料效率、产蛋持续性和肉质通常不由单个靶点决定。即使编辑某个关键调控基因能够改变表型，也可能引起多性状副作用。比如，提高体型可能影响腿部健康和繁殖性能；降低脂肪沉积可能影响肉质、代谢稳态或适应性；改变繁殖内分泌通路可能影响产蛋节律、卵巢健康和福利。所以，基因编辑更适合三类任务：第一，作为功能验证工具，确认 B+ 位点是否具备 A 级证据；第二，作为少数关键风险位点或主效位点的定向管理手段；第三，在抗病或特定生物安全场景中探索靶点突破，但必须进行严格 T 轴评估。</w:t>
-      </w:r>
-    </w:p>
-    <w:p>
-      <w:pPr>
-        <w:pStyle w:val="BodyText"/>
-      </w:pPr>
-      <w:r>
-        <w:t xml:space="preserve">基因编辑的 T 轴评估至少涉及三个独立维度。第一是监管路径。不同国家和地区对禽类基因编辑产品的监管态度差异很大，目标市场选择直接决定编辑应用的可行边界。中文行业读者在制定编辑应用策略时，应优先评估国内主流市场和目标出口市场的具体监管现状，而非按全球平均情况估计可行性。第二是福利与多代追踪。编辑后多代的生长、繁殖、行为、健康和免疫指标监测，是负责任应用的基本要求，不能只凭 F0 或 F1 的短期表型决定产业化。第三是病原逃逸监测。抗病编辑尤其需要在产业实施前后建立病毒变异和宿主适应监测体系，否则单一靶点的保护效应可能在选择压力下被绕过。这三个维度任何一项缺失，编辑应用都难以从研究阶段进入产业阶段。</w:t>
-      </w:r>
-    </w:p>
-    <w:bookmarkEnd w:id="45"/>
-    <w:bookmarkStart w:id="46" w:name="具体情景代表性位点应该怎么用"/>
-    <w:p>
-      <w:pPr>
-        <w:pStyle w:val="Heading3"/>
-      </w:pPr>
-      <w:r>
-        <w:t xml:space="preserve">6.4 具体情景：代表性位点应该怎么用</w:t>
-      </w:r>
-    </w:p>
-    <w:p>
-      <w:pPr>
-        <w:pStyle w:val="FirstParagraph"/>
-      </w:pPr>
-      <w:r>
-        <w:t xml:space="preserve">将前文代表性位点放入育种决策框架，可以更清楚地看到不同证据等级对应的不同用途。</w:t>
+        <w:t>SLCO1B3 EAV-HP 插入：variant-level A / T2 的成熟 MAS 应用。</w:t>
+      </w:r>
+      <w:r>
+        <w:br/>
+      </w:r>
+      <w:r>
+        <w:t>SLCO1B3 EAV-HP 插入是本文讨论中较成熟的 MAS 案例（Wang Z. et al., 2013）。其分型可通过常规 PCR 或简单分型方法完成，检测成本低，适合大规模应用于蓝壳产蛋鸡品种识别、品系纯度管理、蓝壳商品蛋市场分级，以及蓝壳地方品种保种群体监测。但 SLCO1B3 的“成熟”严格限定在壳色管理这一具体场景；它不能作为产蛋数、蛋壳强度或综合蛋品质的标记。这种“A 级证据 + 严格场景边界”的应用方式，是 BCDO2 黄肤、EDN3 纤维黑变、SOX5 豌豆冠等其他特色表型 A 级位点应当参照的模板（Eriksson et al., 2008；Dorshorst et al., 2011；Wright et al., 2009）。</w:t>
+      </w:r>
+    </w:p>
+    <w:p>
+      <w:pPr>
+        <w:pStyle w:val="BodyText"/>
+      </w:pPr>
+      <w:r>
+        <w:t xml:space="preserve">与 SLCO1B3 这种已经达到 T2 的成熟应用案例不同，多数复杂经济性状的代表位点目前仍停留在 B+ 或 B 级。</w:t>
       </w:r>
     </w:p>
     <w:p>
@@ -6518,23 +6527,14 @@
       <w:r>
         <w:rPr>
           <w:b/>
-          <w:bCs/>
         </w:rPr>
-        <w:t xml:space="preserve">SLCO1B3 EAV-HP 插入：variant-level A / T2 的成熟 MAS 应用。</w:t>
+        <w:t>IGF2BP1 启动子缺失：variant-level B+ / T0 的验证优先位点。</w:t>
       </w:r>
       <w:r>
         <w:br/>
       </w:r>
       <w:r>
-        <w:t xml:space="preserve">SLCO1B3 EAV-HP 插入是本文讨论中较成熟的 MAS 案例。其分型可通过常规 PCR 或简单分型方法完成，检测成本低，适合大规模应用于蓝壳产蛋鸡品种识别、品系纯度管理、蓝壳商品蛋市场分级，以及蓝壳地方品种保种群体监测。但 SLCO1B3 的“成熟”严格限定在壳色管理这一具体场景；它不能作为产蛋数、蛋壳强度或综合蛋品质的标记。这种“A 级证据 + 严格场景边界”的应用方式，是 BCDO2 黄肤、EDN3 纤维黑变、SOX5 豌豆冠等其他特色表型 A 级位点应当参照的模板。</w:t>
-      </w:r>
-    </w:p>
-    <w:p>
-      <w:pPr>
-        <w:pStyle w:val="BodyText"/>
-      </w:pPr>
-      <w:r>
-        <w:t xml:space="preserve">与 SLCO1B3 这种已经达到 T2 的成熟应用案例不同，多数复杂经济性状的代表位点目前仍停留在 B+ 或 B 级。</w:t>
+        <w:t>IGF2BP1 启动子缺失目前定位为 variant-level B+ / T0，不宜直接进入 MAS（Wang K. et al., 2021）。其升级路径包含三类工作，可并行推进：（1）内源编辑或等位基因导入验证，以建立因果证据；（2）跨主流商业品系的效应一致性确认；（3）腿病、胸肌质量、脂肪沉积、繁殖性能等多性状副作用评估。这三类工作均完成且方向一致后，IGF2BP1 才可能升级为 variant-level A / T1，进入特定群体的有限 MAS 试点。在这些验证完成前，直接作为“增重标记”使用会过度外推。这一升级路径所需的内源编辑、跨品系验证和长期多性状评估，目前主要在大型育种公司或公共研究机构具备实施条件。中小育种主体在 IGF2BP1 升级前，更适合将其作为研究跟踪对象，而非自主验证目标。</w:t>
       </w:r>
     </w:p>
     <w:p>
@@ -6544,15 +6544,14 @@
       <w:r>
         <w:rPr>
           <w:b/>
-          <w:bCs/>
         </w:rPr>
-        <w:t xml:space="preserve">IGF2BP1 启动子缺失：variant-level B+ / T0 的验证优先位点。</w:t>
+        <w:t>rs734209466–IGFBP2/IGFBP5 调控链：variant-level B+ / T0 的高优先级调控候选。</w:t>
       </w:r>
       <w:r>
         <w:br/>
       </w:r>
       <w:r>
-        <w:t xml:space="preserve">IGF2BP1 启动子缺失目前定位为 variant-level B+ / T0，不宜直接进入 MAS。其升级路径包含三类工作，可并行推进：（1）内源编辑或等位基因导入验证，以建立因果证据；（2）跨主流商业品系的效应一致性确认；（3）腿病、胸肌质量、脂肪沉积、繁殖性能等多性状副作用评估。这三类工作均完成且方向一致后，IGF2BP1 才可能升级为 variant-level A / T1，进入特定群体的有限 MAS 试点。在这些验证完成前，直接作为“增重标记”使用会过度外推。这一升级路径所需的内源编辑、跨品系验证和长期多性状评估，目前主要在大型育种公司或公共研究机构具备实施条件。中小育种主体在 IGF2BP1 升级前，更适合将其作为研究跟踪对象，而非自主验证目标。</w:t>
+        <w:t>该调控链具有较完整的非编码调控机制证据，定位为 variant-level B+ / T0（Shen et al., 2024）。其主要应用价值是为后续内源验证和跨群体效应评估提供高优先级对象，而不是立即指导降脂选择。后续应用应优先回答三个问题：该变异在白羽肉鸡、黄羽肉鸡和地方鸡中的等位基因频率与效应是否一致；降低脂肪沉积是否影响肉质、繁殖和代谢稳态；该位点是否能提高 GS 模型对腹脂或肉质相关性状的预测能力。只有在这些问题得到回答后，才适合考虑更直接的选择应用。</w:t>
       </w:r>
     </w:p>
     <w:p>
@@ -6562,15 +6561,22 @@
       <w:r>
         <w:rPr>
           <w:b/>
-          <w:bCs/>
         </w:rPr>
-        <w:t xml:space="preserve">rs734209466–IGFBP2/IGFBP5 调控链：variant-level B+ / T0 的高优先级调控候选。</w:t>
+        <w:t>PHIP 非编码变异：variant-level B / T0 的产蛋机制候选。</w:t>
       </w:r>
       <w:r>
         <w:br/>
       </w:r>
       <w:r>
-        <w:t xml:space="preserve">该调控链具有较完整的非编码调控机制证据，定位为 variant-level B+ / T0。其主要应用价值是为后续内源验证和跨群体效应评估提供高优先级对象，而不是立即指导降脂选择。后续应用应优先回答三个问题：该变异在白羽肉鸡、黄羽肉鸡和地方鸡中的等位基因频率与效应是否一致；降低脂肪沉积是否影响肉质、繁殖和代谢稳态；该位点是否能提高 GS 模型对腹脂或肉质相关性状的预测能力。只有在这些问题得到回答后，才适合考虑更直接的选择应用。</w:t>
+        <w:t>PHIP 可以用于卵巢功能机制研究、目标群体验证和功能实验设计，但不宜写成产蛋数量标记（Wang D. et al., 2025）。PHIP 后续研究的优先级应从增加相似的表达层面证据，转向内源等位基因编辑、颗粒细胞和体内卵巢表型验证，以及纵向产蛋记录关联。PGC 编辑后获得稳定的 F1/F2 产蛋表型数据通常需要 1.5–2 年；加上多群体重复验证和纵向产蛋记录，PHIP 完成 B 级到 B+ 或 A 级的升级周期实际上不少于 3–5 年。这一时间约束应纳入研究规划。如果不能连接到开产日龄、产蛋节律、产蛋持续性或卵巢功能的体内结果，其证据等级就不宜过度提高。</w:t>
+      </w:r>
+    </w:p>
+    <w:p>
+      <w:pPr>
+        <w:pStyle w:val="BodyText"/>
+      </w:pPr>
+      <w:r>
+        <w:t xml:space="preserve">以上四个位点（SLCO1B3、IGF2BP1、IGFBP2/IGFBP5、PHIP）都属于 variant-level 评级，应用决策围绕变异本身展开。MHC-B 则代表另一种证据形态：单倍型层面证据强于单一变异。</w:t>
       </w:r>
     </w:p>
     <w:p>
@@ -6580,23 +6586,22 @@
       <w:r>
         <w:rPr>
           <w:b/>
-          <w:bCs/>
         </w:rPr>
-        <w:t xml:space="preserve">PHIP 非编码变异：variant-level B / T0 的产蛋机制候选。</w:t>
+        <w:t>MHC-B 单倍型：haplotype/region-level B+ / T1 的特定疾病风险层。</w:t>
       </w:r>
       <w:r>
         <w:br/>
       </w:r>
       <w:r>
-        <w:t xml:space="preserve">PHIP 可以用于卵巢功能机制研究、目标群体验证和功能实验设计，但不宜写成产蛋数量标记。PHIP 后续研究的优先级应从增加相似的表达层面证据，转向内源等位基因编辑、颗粒细胞和体内卵巢表型验证，以及纵向产蛋记录关联。PGC 编辑后获得稳定的 F1/F2 产蛋表型数据通常需要 1.5–2 年；加上多群体重复验证和纵向产蛋记录，PHIP 完成 B 级到 B+ 或 A 级的升级周期实际上不少于 3–5 年。这一时间约束应纳入研究规划。如果不能连接到开产日龄、产蛋节律、产蛋持续性或卵巢功能的体内结果，其证据等级就不宜过度提高。</w:t>
-      </w:r>
-    </w:p>
-    <w:p>
-      <w:pPr>
-        <w:pStyle w:val="BodyText"/>
-      </w:pPr>
-      <w:r>
-        <w:t xml:space="preserve">以上四个位点（SLCO1B3、IGF2BP1、IGFBP2/IGFBP5、PHIP）都属于 variant-level 评级，应用决策围绕变异本身展开。MHC-B 则代表另一种证据形态：单倍型层面证据强于单一变异。</w:t>
+        <w:t>MHC-B 适合用于特定疾病背景下的风险评估和育种辅助决策，但不宜作为普适抗病标记（Briles and Briles, 1982；Kaufman et al., 1999）。haplotype-level 标签的使用见第 4.3 节关于 MHC-B 的讨论，其含义是该区域的单倍型证据强于单一变异证据。MHC-B 的定位意味着：在马立克氏病、疫苗反应或特定免疫表型中，它可以进入目标群体验证和风险管理；但由于单倍型结构复杂、病原背景依赖和多性状权衡明显，不能简单推广到所有疾病或所有商业群体。实际应用中，MHC-B 更适合作为抗病指数中的一个风险层，而不是替代全基因组选择或综合健康评估。</w:t>
+      </w:r>
+    </w:p>
+    <w:p>
+      <w:pPr>
+        <w:pStyle w:val="BodyText"/>
+      </w:pPr>
+      <w:r>
+        <w:t xml:space="preserve">MHC-B 的复杂性来自单倍型的多基因构成。ANP32A 则展示另一种复杂性——同一位点在 gene/target-level 与 variant-level 之间给出截然不同的证据强度。</w:t>
       </w:r>
     </w:p>
     <w:p>
@@ -6606,41 +6611,14 @@
       <w:r>
         <w:rPr>
           <w:b/>
-          <w:bCs/>
         </w:rPr>
-        <w:t xml:space="preserve">MHC-B 单倍型：haplotype/region-level B+ / T1 的特定疾病风险层。</w:t>
+        <w:t>ANP32A：gene/target-level A 与 variant-level B–C 并存的非对称证据。</w:t>
       </w:r>
       <w:r>
         <w:br/>
       </w:r>
       <w:r>
-        <w:t xml:space="preserve">MHC-B 适合用于特定疾病背景下的风险评估和育种辅助决策，但不宜作为普适抗病标记。haplotype-level 标签的使用见第 4.3 节关于 MHC-B 的讨论，其含义是该区域的单倍型证据强于单一变异证据。MHC-B 的定位意味着：在马立克氏病、疫苗反应或特定免疫表型中，它可以进入目标群体验证和风险管理；但由于单倍型结构复杂、病原背景依赖和多性状权衡明显，不能简单推广到所有疾病或所有商业群体。实际应用中，MHC-B 更适合作为抗病指数中的一个风险层，而不是替代全基因组选择或综合健康评估。</w:t>
-      </w:r>
-    </w:p>
-    <w:p>
-      <w:pPr>
-        <w:pStyle w:val="BodyText"/>
-      </w:pPr>
-      <w:r>
-        <w:t xml:space="preserve">MHC-B 的复杂性来自单倍型的多基因构成。ANP32A 则展示另一种复杂性——同一位点在 gene/target-level 与 variant-level 之间给出截然不同的证据强度。</w:t>
-      </w:r>
-    </w:p>
-    <w:p>
-      <w:pPr>
-        <w:pStyle w:val="BodyText"/>
-      </w:pPr>
-      <w:r>
-        <w:rPr>
-          <w:b/>
-          <w:bCs/>
-        </w:rPr>
-        <w:t xml:space="preserve">ANP32A：gene/target-level A 与 variant-level B–C 并存的非对称证据。</w:t>
-      </w:r>
-      <w:r>
-        <w:br/>
-      </w:r>
-      <w:r>
-        <w:t xml:space="preserve">ANP32A 在禽流感宿主因子研究中具有强功能价值，可作为基因编辑抗病策略和病毒适配机制研究的核心靶点；但不能被写成自然群体中已经可直接选择的抗病标记。其应用路线应从功能验证和生物安全评估出发，而不是从常规 MAS 出发。若考虑编辑应用，必须同步评价病原逃逸、ANP32 家族补偿、多性状影响、福利、监管和市场接受度。在监管允许禽类基因编辑产品的目标市场中，ANP32A 编辑路径具有进入抗病育种的潜在前景，但仍需完成多代福利评估和病原逃逸监测；在监管不允许编辑应用的目标市场，ANP32A 仍可作为生物安全监测、病毒适应性追踪和疫苗策略优化的研究工具，而不必把其应用价值绑定在编辑应用上。</w:t>
+        <w:t>ANP32A 在禽流感宿主因子研究中具有强功能价值，可作为基因编辑抗病策略和病毒适配机制研究的核心靶点（Idoko-Akoh et al., 2023）；但不能被写成自然群体中已经可直接选择的抗病标记。其应用路线应从功能验证和生物安全评估出发，而不是从常规 MAS 出发。若考虑编辑应用，必须同步评价病原逃逸、ANP32 家族补偿、多性状影响、福利、监管和市场接受度。在监管允许禽类基因编辑产品的目标市场中，ANP32A 编辑路径具有进入抗病育种的潜在前景，但仍需完成多代福利评估和病原逃逸监测；在监管不允许编辑应用的目标市场，ANP32A 仍可作为生物安全监测、病毒适应性追踪和疫苗策略优化的研究工具，而不必把其应用价值绑定在编辑应用上。</w:t>
       </w:r>
     </w:p>
     <w:p>
@@ -7136,6 +7114,14 @@
       </w:pPr>
       <w:r>
         <w:t>Luo, C., Qu, H., Ma, J., et al. 2014. A genome-wide association study identifies major loci affecting the immune response against infectious bronchitis virus in chicken. Infection, Genetics and Evolution 21:351-358. https://doi.org/10.1016/j.meegid.2013.12.004.</w:t>
+      </w:r>
+    </w:p>
+    <w:p>
+      <w:pPr>
+        <w:pStyle w:val="Heading2"/>
+      </w:pPr>
+      <w:r>
+        <w:t>MacLeod, I. M., Bowman, P. J., Vander Jagt, C. J., et al. 2016. Exploiting biological priors and sequence variants enhances QTL discovery and genomic prediction of complex traits. BMC Genomics 17:144. https://doi.org/10.1186/s12864-016-2443-6.</w:t>
       </w:r>
     </w:p>
     <w:p>

</xml_diff>

<commit_message>
Final manuscript citation and format polish
</commit_message>
<xml_diff>
--- a/家鸡候选位点证据分级_当前中稿.docx
+++ b/家鸡候选位点证据分级_当前中稿.docx
@@ -59,7 +59,7 @@
         <w:pStyle w:val="BodyText"/>
       </w:pPr>
       <w:r>
-        <w:t>这一瓶颈来自关联证据与因果归属之间的系统性断层（详见第 2 章）。少数主效可见表型，如黄肤、豌豆冠、纤维黑变和蓝壳，已形成较清楚的“变异—分子功能—表型”链条，可作为强证据参照（Eriksson et al., 2008；Wright et al., 2009；Dorshorst et al., 2011；Wang et al., 2013）；多数复杂经济性状仍缺少同等验证深度（详见第 4 章）。</w:t>
+        <w:t>这一瓶颈来自关联证据与因果归属之间的系统性断层（详见第 2 章）。少数主效可见表型，如黄肤、豌豆冠、纤维黑变和蓝壳，已形成较清楚的“变异—分子功能—表型”链条，可作为强证据参照（Eriksson et al., 2008；Wright et al., 2009；Dorshorst et al., 2011；Wang Z. et al., 2013）；多数复杂经济性状仍缺少同等验证深度（详见第 4 章）。</w:t>
       </w:r>
     </w:p>
     <w:p>
@@ -200,7 +200,7 @@
         <w:pStyle w:val="BodyText"/>
       </w:pPr>
       <w:r>
-        <w:t>这一标准在具体案例中如何兑现，可以从 PHIP 非编码变异和 rs734209466–IGFBP2/IGFBP5 调控链看到。前者提示非编码变异可能通过转录因子结合和 PHIP 表达影响颗粒细胞相关功能（Wang et al., 2025）；后者提示等位基因特异增强子和三维调控可能参与 IGFBP2/IGFBP5 表达及脂前体细胞表型调节（Shen et al., 2024）。这类研究明显强于普通 GWAS 邻近基因注释，也能显著提高候选位点的验证优先级。可是，只要还缺少内源编辑、体内因果验证、跨群体重复或目标育种群体稳定性评估，它们仍应被解释为机制证据较强的候选位点。其具体评级（rs734209466–IGFBP2/IGFBP5 在 4.1 节评为 B+，PHIP 在 4.2 节评为 B）取决于变异层证据互证程度的差异，这一差异将在第 4 章相关案例段中具体说明。</w:t>
+        <w:t>这一标准在具体案例中如何兑现，可以从 PHIP 非编码变异和 rs734209466–IGFBP2/IGFBP5 调控链看到。前者提示非编码变异可能通过转录因子结合和 PHIP 表达影响颗粒细胞相关功能（Wang D. et al., 2025）；后者提示等位基因特异增强子和三维调控可能参与 IGFBP2/IGFBP5 表达及脂前体细胞表型调节（Shen et al., 2024）。这类研究明显强于普通 GWAS 邻近基因注释，也能显著提高候选位点的验证优先级。可是，只要还缺少内源编辑、体内因果验证、跨群体重复或目标育种群体稳定性评估，它们仍应被解释为机制证据较强的候选位点。其具体评级（rs734209466–IGFBP2/IGFBP5 在 4.1 节评为 B+，PHIP 在 4.2 节评为 B）取决于变异层证据互证程度的差异，这一差异将在第 4 章相关案例段中具体说明。</w:t>
       </w:r>
     </w:p>
     <w:p>
@@ -242,7 +242,7 @@
         <w:pStyle w:val="FirstParagraph"/>
       </w:pPr>
       <w:r>
-        <w:t>功能实验是候选位点证据升级的关键环节，但不同实验体系提供的证据强度并不相同。报告基因实验可以检验某段序列是否具有调控活性；MPRA 可高通量测试大量候选调控片段；过表达、敲低或细胞模型可以判断某个基因是否影响细胞表型；CRISPRa/i 可以测试调控方向；体外病毒复制实验可以初步评估宿主因子对病原复制的影响（Inoue and Ahituv, 2015；Kampmann, 2018）。这些实验比单纯关联或表达证据更进一步，但这类实验结果多数仍属于中等强度功能证据。</w:t>
+        <w:t>功能实验是候选位点证据升级的关键环节，但不同实验体系提供的证据强度并不相同。报告基因实验可以检验某段序列是否具有调控活性；大规模并行报告实验（massively parallel reporter assay, MPRA）可高通量测试大量候选调控片段；过表达、敲低或细胞模型可以判断某个基因是否影响细胞表型；CRISPR 激活/干扰（CRISPRa/i）可以测试调控方向；体外病毒复制实验可以初步评估宿主因子对病原复制的影响（Inoue and Ahituv, 2015；Kampmann, 2018）。这些实验比单纯关联或表达证据更进一步，但这类实验结果多数仍属于中等强度功能证据。</w:t>
       </w:r>
     </w:p>
     <w:p>
@@ -258,7 +258,7 @@
         <w:pStyle w:val="BodyText"/>
       </w:pPr>
       <w:r>
-        <w:t>更强的功能证据通常需要把候选变异、内源分子效应和体内表型连接起来。内源编辑、自然突变或等位基因导入、PGC 介导编辑、体内模型、救援实验以及在目标群体中的等位基因效应验证，能够更直接地回答候选变异或靶点是否影响表型。鸡 PGC 的长期培养和生殖系传递为家鸡内源编辑提供了关键技术基础（van de Lavoir et al., 2006；Whyte et al., 2015），ANP32A 编辑鸡则展示了 PGC 介导编辑如何把宿主因子、病毒复制和体内抗感染表型连接起来（Idoko-Akoh et al., 2023）。对于自然变异位点，理想证据链应包括明确变异、可靠分型、稳定关联、目标组织中的分子效应、功能扰动结果和体内表型后果。对于编辑靶点，强功能证据可以证明基因或靶点影响某一表型，但仍不能自动证明自然群体中存在可直接利用的功能等位变异。</w:t>
+        <w:t>更强的功能证据通常需要把候选变异、内源分子效应和体内表型连接起来。内源编辑、自然突变或等位基因导入、原始生殖细胞（primordial germ cells, PGC）介导编辑、体内模型、救援实验以及在目标群体中的等位基因效应验证，能够更直接地回答候选变异或靶点是否影响表型。鸡 PGC 的长期培养和生殖系传递为家鸡内源编辑提供了关键技术基础（van de Lavoir et al., 2006；Whyte et al., 2015），ANP32A 编辑鸡则展示了 PGC 介导编辑如何把宿主因子、病毒复制和体内抗感染表型连接起来（Idoko-Akoh et al., 2023）。对于自然变异位点，理想证据链应包括明确变异、可靠分型、稳定关联、目标组织中的分子效应、功能扰动结果和体内表型后果。对于编辑靶点，强功能证据可以证明基因或靶点影响某一表型，但仍不能自动证明自然群体中存在可直接利用的功能等位变异。</w:t>
       </w:r>
     </w:p>
     <w:p>
@@ -342,7 +342,7 @@
         <w:pStyle w:val="BodyText"/>
       </w:pPr>
       <w:r>
-        <w:t xml:space="preserve">第三个维度是分子机制支持。机制支持的核心不是“这个基因看起来合理”，而是候选信号是否能够连接到目标组织、目标细胞类型、调控元件、分子 QTL、等位基因特异表达、染色质状态或三维互作等证据。普通差异表达、通路富集或最近基因注释只能提供较弱机制线索；目标组织中的表达、开放染色质或细胞类型定位可以增强解释力；而统计学共定位、方向一致的等位基因特异表达、等位基因特异调控或与候选变异一致的分子效应，才更接近较强机制证据。对于非编码变异，机制支持尤其重要，因为其作用往往不在编码改变，而在调控活性、表达量、剪接、组织特异性或发育阶段特异性上。</w:t>
+        <w:t>第三个维度是分子机制支持。机制支持的核心不是“这个基因看起来合理”，而是候选信号是否能够连接到目标组织、目标细胞类型、调控元件、分子 QTL、等位基因特异表达（allele-specific expression, ASE）、染色质状态或三维互作等证据。普通差异表达、通路富集或最近基因注释只能提供较弱机制线索；目标组织中的表达、开放染色质或细胞类型定位可以增强解释力；而统计学共定位、方向一致的等位基因特异表达、等位基因特异调控或与候选变异一致的分子效应，才更接近较强机制证据。对于非编码变异，机制支持尤其重要，因为其作用往往不在编码改变，而在调控活性、表达量、剪接、组织特异性或发育阶段特异性上。</w:t>
       </w:r>
     </w:p>
     <w:p>
@@ -5464,7 +5464,7 @@
               <w:jc w:val="left"/>
             </w:pPr>
             <w:r>
-              <w:t xml:space="preserve">ASE、coloc、报告基因阳性等调控候选</w:t>
+              <w:t>等位基因特异表达（ASE）、coloc、报告基因阳性等调控候选</w:t>
             </w:r>
           </w:p>
         </w:tc>

</xml_diff>

<commit_message>
Clarify rating decision workflow
</commit_message>
<xml_diff>
--- a/家鸡候选位点证据分级_当前中稿.docx
+++ b/家鸡候选位点证据分级_当前中稿.docx
@@ -848,6 +848,102 @@
           <w:sz w:val="24"/>
         </w:rPr>
         <w:t>总分可以帮助比较候选位点的相对成熟度，但不能替代关键证据。一个候选位点即使在变异明确度、重复性和机制支持上得分较高，只要缺少强功能验证，也不应自动升为 A 级。反过来，一个编辑靶点即使具有强功能实验结果，如果缺少自然变异、群体效应或应用边界评估，也不能被写成成熟的育种标记。</w:t>
+      </w:r>
+    </w:p>
+    <w:p>
+      <w:pPr>
+        <w:pStyle w:val="BodyText"/>
+        <w:spacing w:line="360" w:lineRule="auto" w:before="0" w:after="0"/>
+        <w:ind w:firstLine="480"/>
+        <w:jc w:val="both"/>
+      </w:pPr>
+      <w:r>
+        <w:rPr>
+          <w:rFonts w:ascii="Times New Roman" w:hAnsi="Times New Roman" w:eastAsia="宋体" w:cs="Times New Roman"/>
+          <w:color w:val="000000"/>
+          <w:sz w:val="24"/>
+        </w:rPr>
+        <w:t>评级判定流程如下。第一，先定证据层级：根据变异解析程度将证据归入 region-level、gene-level、variant-level、haplotype-level 或 target-level，避免把区域信号、候选基因、自然变异和编辑靶点混为同一层级。</w:t>
+      </w:r>
+    </w:p>
+    <w:p>
+      <w:pPr>
+        <w:pStyle w:val="BodyText"/>
+        <w:spacing w:line="360" w:lineRule="auto" w:before="0" w:after="0"/>
+        <w:ind w:firstLine="480"/>
+        <w:jc w:val="both"/>
+      </w:pPr>
+      <w:r>
+        <w:rPr>
+          <w:rFonts w:ascii="Times New Roman" w:hAnsi="Times New Roman" w:eastAsia="宋体" w:cs="Times New Roman"/>
+          <w:color w:val="000000"/>
+          <w:sz w:val="24"/>
+        </w:rPr>
+        <w:t>第二，先检查 A 级硬门槛：是否已有强功能验证，包括内源编辑、PGC 介导编辑、体内模型、救援实验、自然突变或等位基因导入等能够连接变异或靶点与表型后果的证据。若没有，最高只能评为 B+，不得评为 A；若有，再进入 A 级判定，并区分 variant-level A 与 gene/target-level A。</w:t>
+      </w:r>
+    </w:p>
+    <w:p>
+      <w:pPr>
+        <w:pStyle w:val="BodyText"/>
+        <w:spacing w:line="360" w:lineRule="auto" w:before="0" w:after="0"/>
+        <w:ind w:firstLine="480"/>
+        <w:jc w:val="both"/>
+      </w:pPr>
+      <w:r>
+        <w:rPr>
+          <w:rFonts w:ascii="Times New Roman" w:hAnsi="Times New Roman" w:eastAsia="宋体" w:cs="Times New Roman"/>
+          <w:color w:val="000000"/>
+          <w:sz w:val="24"/>
+        </w:rPr>
+        <w:t>第三，在未达到 A 级门槛的前提下判定 B+：若明确候选变异、至少一种强机制互证（如共定位、等位基因特异表达、方向一致的调控证据）和中等功能证据三项中至少两项同时存在，且不同证据能够相互印证，可评为 B+；若证据只达到单项较强或多项之间不能形成互证，则保持 B。</w:t>
+      </w:r>
+    </w:p>
+    <w:p>
+      <w:pPr>
+        <w:pStyle w:val="BodyText"/>
+        <w:spacing w:line="360" w:lineRule="auto" w:before="0" w:after="0"/>
+        <w:ind w:firstLine="480"/>
+        <w:jc w:val="both"/>
+      </w:pPr>
+      <w:r>
+        <w:rPr>
+          <w:rFonts w:ascii="Times New Roman" w:hAnsi="Times New Roman" w:eastAsia="宋体" w:cs="Times New Roman"/>
+          <w:color w:val="000000"/>
+          <w:sz w:val="24"/>
+        </w:rPr>
+        <w:t>第四，C 级用于单一 GWAS、单一差异表达、单一选择扫描、最近基因注释或候选基因合理性，但缺少独立重复、机制互证和功能验证的情形。C 级不是否定信号价值，而是提示其仍处于假设生成阶段。</w:t>
+      </w:r>
+    </w:p>
+    <w:p>
+      <w:pPr>
+        <w:pStyle w:val="BodyText"/>
+        <w:spacing w:line="360" w:lineRule="auto" w:before="0" w:after="0"/>
+        <w:ind w:firstLine="480"/>
+        <w:jc w:val="both"/>
+      </w:pPr>
+      <w:r>
+        <w:rPr>
+          <w:rFonts w:ascii="Times New Roman" w:hAnsi="Times New Roman" w:eastAsia="宋体" w:cs="Times New Roman"/>
+          <w:color w:val="000000"/>
+          <w:sz w:val="24"/>
+        </w:rPr>
+        <w:t>第五，T 轴独立判定：B+ 不能自动对应 T1 或 T2；是否进入 T1/T2 必须单独评估目标群体效应、多性状影响、经济权重、福利风险和监管可行性。</w:t>
+      </w:r>
+    </w:p>
+    <w:p>
+      <w:pPr>
+        <w:pStyle w:val="BodyText"/>
+        <w:spacing w:line="360" w:lineRule="auto" w:before="0" w:after="0"/>
+        <w:ind w:firstLine="480"/>
+        <w:jc w:val="both"/>
+      </w:pPr>
+      <w:r>
+        <w:rPr>
+          <w:rFonts w:ascii="Times New Roman" w:hAnsi="Times New Roman" w:eastAsia="宋体" w:cs="Times New Roman"/>
+          <w:color w:val="000000"/>
+          <w:sz w:val="24"/>
+        </w:rPr>
+        <w:t>这一流程还需遵守两个关键原则：两个中等证据不自动等于一个强证据；多个同类表达证据也不应简单堆叠为更高等级。只有当不同证据类型在同一候选变异、靶基因、目标组织和表型方向上形成互证时，才构成真正的证据升级。</w:t>
       </w:r>
     </w:p>
     <w:p>
@@ -28893,7 +28989,7 @@
                 <w:color w:val="000000"/>
                 <w:sz w:val="15"/>
               </w:rPr>
-              <w:t>家鸡驯化全基因组重测序/选择扫瞄</w:t>
+              <w:t>家鸡驯化全基因组重测序/选择扫描</w:t>
             </w:r>
           </w:p>
         </w:tc>
@@ -29228,81 +29324,81 @@
                 <w:color w:val="000000"/>
                 <w:sz w:val="15"/>
               </w:rPr>
-              <w:t>热适应/高原适应/寒冷耐受选择扫瞄区域</w:t>
-            </w:r>
-          </w:p>
-        </w:tc>
-        <w:tc>
-          <w:tcPr>
-            <w:tcW w:type="dxa" w:w="1376"/>
-            <w:vAlign w:val="center"/>
-            <w:tcMar>
-              <w:top w:w="60" w:type="dxa"/>
-              <w:start w:w="60" w:type="dxa"/>
-              <w:bottom w:w="60" w:type="dxa"/>
-              <w:end w:w="60" w:type="dxa"/>
-            </w:tcMar>
-            <w:shd w:fill="FFFFFF"/>
-          </w:tcPr>
-          <w:p>
-            <w:pPr>
-              <w:keepLines w:val="0"/>
-              <w:spacing w:line="240" w:lineRule="auto" w:before="0" w:after="0"/>
-              <w:jc w:val="left"/>
-            </w:pPr>
-            <w:r>
-              <w:rPr>
-                <w:rFonts w:ascii="Times New Roman" w:hAnsi="Times New Roman" w:eastAsia="宋体" w:cs="Times New Roman"/>
-                <w:b w:val="0"/>
-                <w:color w:val="000000"/>
-                <w:sz w:val="15"/>
-              </w:rPr>
-            </w:r>
-            <w:r>
-              <w:rPr>
-                <w:rFonts w:ascii="Times New Roman" w:hAnsi="Times New Roman" w:eastAsia="宋体" w:cs="Times New Roman"/>
-                <w:b w:val="0"/>
-                <w:color w:val="000000"/>
-                <w:sz w:val="15"/>
-              </w:rPr>
-              <w:t>多选择扫瞄研究；正文未绑定单一原始位点研究</w:t>
-            </w:r>
-          </w:p>
-        </w:tc>
-        <w:tc>
-          <w:tcPr>
-            <w:tcW w:type="dxa" w:w="1376"/>
-            <w:vAlign w:val="center"/>
-            <w:tcMar>
-              <w:top w:w="60" w:type="dxa"/>
-              <w:start w:w="60" w:type="dxa"/>
-              <w:bottom w:w="60" w:type="dxa"/>
-              <w:end w:w="60" w:type="dxa"/>
-            </w:tcMar>
-            <w:shd w:fill="FFFFFF"/>
-          </w:tcPr>
-          <w:p>
-            <w:pPr>
-              <w:keepLines w:val="0"/>
-              <w:spacing w:line="240" w:lineRule="auto" w:before="0" w:after="0"/>
-              <w:jc w:val="left"/>
-            </w:pPr>
-            <w:r>
-              <w:rPr>
-                <w:rFonts w:ascii="Times New Roman" w:hAnsi="Times New Roman" w:eastAsia="宋体" w:cs="Times New Roman"/>
-                <w:b w:val="0"/>
-                <w:color w:val="000000"/>
-                <w:sz w:val="15"/>
-              </w:rPr>
-            </w:r>
-            <w:r>
-              <w:rPr>
-                <w:rFonts w:ascii="Times New Roman" w:hAnsi="Times New Roman" w:eastAsia="宋体" w:cs="Times New Roman"/>
-                <w:b w:val="0"/>
-                <w:color w:val="000000"/>
-                <w:sz w:val="15"/>
-              </w:rPr>
-              <w:t>地方鸡资源群体和环境关联/选择扫瞄研究</w:t>
+              <w:t>热适应/高原适应/寒冷耐受选择扫描区域</w:t>
+            </w:r>
+          </w:p>
+        </w:tc>
+        <w:tc>
+          <w:tcPr>
+            <w:tcW w:type="dxa" w:w="1376"/>
+            <w:vAlign w:val="center"/>
+            <w:tcMar>
+              <w:top w:w="60" w:type="dxa"/>
+              <w:start w:w="60" w:type="dxa"/>
+              <w:bottom w:w="60" w:type="dxa"/>
+              <w:end w:w="60" w:type="dxa"/>
+            </w:tcMar>
+            <w:shd w:fill="FFFFFF"/>
+          </w:tcPr>
+          <w:p>
+            <w:pPr>
+              <w:keepLines w:val="0"/>
+              <w:spacing w:line="240" w:lineRule="auto" w:before="0" w:after="0"/>
+              <w:jc w:val="left"/>
+            </w:pPr>
+            <w:r>
+              <w:rPr>
+                <w:rFonts w:ascii="Times New Roman" w:hAnsi="Times New Roman" w:eastAsia="宋体" w:cs="Times New Roman"/>
+                <w:b w:val="0"/>
+                <w:color w:val="000000"/>
+                <w:sz w:val="15"/>
+              </w:rPr>
+            </w:r>
+            <w:r>
+              <w:rPr>
+                <w:rFonts w:ascii="Times New Roman" w:hAnsi="Times New Roman" w:eastAsia="宋体" w:cs="Times New Roman"/>
+                <w:b w:val="0"/>
+                <w:color w:val="000000"/>
+                <w:sz w:val="15"/>
+              </w:rPr>
+              <w:t>多选择扫描研究；正文未绑定单一原始位点研究</w:t>
+            </w:r>
+          </w:p>
+        </w:tc>
+        <w:tc>
+          <w:tcPr>
+            <w:tcW w:type="dxa" w:w="1376"/>
+            <w:vAlign w:val="center"/>
+            <w:tcMar>
+              <w:top w:w="60" w:type="dxa"/>
+              <w:start w:w="60" w:type="dxa"/>
+              <w:bottom w:w="60" w:type="dxa"/>
+              <w:end w:w="60" w:type="dxa"/>
+            </w:tcMar>
+            <w:shd w:fill="FFFFFF"/>
+          </w:tcPr>
+          <w:p>
+            <w:pPr>
+              <w:keepLines w:val="0"/>
+              <w:spacing w:line="240" w:lineRule="auto" w:before="0" w:after="0"/>
+              <w:jc w:val="left"/>
+            </w:pPr>
+            <w:r>
+              <w:rPr>
+                <w:rFonts w:ascii="Times New Roman" w:hAnsi="Times New Roman" w:eastAsia="宋体" w:cs="Times New Roman"/>
+                <w:b w:val="0"/>
+                <w:color w:val="000000"/>
+                <w:sz w:val="15"/>
+              </w:rPr>
+            </w:r>
+            <w:r>
+              <w:rPr>
+                <w:rFonts w:ascii="Times New Roman" w:hAnsi="Times New Roman" w:eastAsia="宋体" w:cs="Times New Roman"/>
+                <w:b w:val="0"/>
+                <w:color w:val="000000"/>
+                <w:sz w:val="15"/>
+              </w:rPr>
+              <w:t>地方鸡资源群体和环境关联/选择扫描研究</w:t>
             </w:r>
           </w:p>
         </w:tc>

</xml_diff>

<commit_message>
Qualify evidence landscape claims
</commit_message>
<xml_diff>
--- a/家鸡候选位点证据分级_当前中稿.docx
+++ b/家鸡候选位点证据分级_当前中稿.docx
@@ -49,7 +49,7 @@
           <w:color w:val="000000"/>
           <w:sz w:val="24"/>
         </w:rPr>
-        <w:t>家鸡复杂性状研究已通过 QTL、GWAS、选择扫描和多组学整合积累大量候选位点。但后关联阶段的核心问题已不再是发现更多信号，而是判断已有信号处在何种证据阶段。本文提出家鸡候选位点证据成熟度与育种转化框架，将证据划分为四阶：候选线索（C）、有重复或机制支持的候选（B）、高验证优先级（B+），以及具有完整“变异—分子功能—表型”链条和强功能验证的因果证据（A）。本文的方法学贡献在于将 ClinGen、ACMG/AMP 等临床基因组学中已有的变异解释和证据分级体系适配到家鸡复杂性状和育种转化语境；同时设立独立的 T0/T1/T2 产业适用性轴，纳入群体效应、多性状平衡、动物福利、监管和经济可行性等评估维度，并与 C/B/B+/A 证据轴形成 4×3 评估矩阵。应用该框架揭示出家鸡候选位点的现实证据格局：variant-level A 证据主要集中于 SLCO1B3 蓝壳、BCDO2 黄肤、EDN3 纤维黑变和 SOX5 豌豆冠等主效可见表型；生长、饲料效率、产蛋持续性、肉质和复杂抗病性等多基因经济性状多处于 B/B+ 或 C/B 阶段；抗病性状则呈现 gene/target-level A 证据多于 variant-level A 自然变异证据的非对称格局，如 ANP32A（禽流感宿主因子）和 TVB/NHE1（禽白血病病毒（ALV）受体）。在工具选择上，基因组选择和多性状选择指数主要应用于复杂经济性状长期改良；标记辅助选择主要应用于 variant-level A + T2 主效位点；基因编辑主要应用于少数 gene/target-level A 关键靶点，并前置评估监管、福利和病原逃逸风险。</w:t>
+        <w:t>家鸡复杂性状研究已通过 QTL、GWAS、选择扫描和多组学整合积累大量候选位点。但后关联阶段的核心问题已不再是发现更多信号，而是判断已有信号处在何种证据阶段。本文提出家鸡候选位点证据成熟度与育种转化框架，将证据划分为四阶：候选线索（C）、有重复或机制支持的候选（B）、高验证优先级（B+），以及具有完整“变异—分子功能—表型”链条和强功能验证的因果证据（A）。本文的方法学贡献在于将 ClinGen、ACMG/AMP 等临床基因组学中已有的变异解释和证据分级体系适配到家鸡复杂性状和育种转化语境；同时设立独立的 T0/T1/T2 产业适用性轴，纳入群体效应、多性状平衡、动物福利、监管和经济可行性等评估维度，并与 C/B/B+/A 证据轴形成 4×3 评估矩阵。应用该框架评估本文纳入的代表性位点后显示：variant-level A 证据主要集中于 SLCO1B3 蓝壳、BCDO2 黄肤、EDN3 纤维黑变和 SOX5 豌豆冠等主效可见表型；生长、饲料效率、产蛋持续性、肉质和复杂抗病性等多基因经济性状多处于 B/B+ 或 C/B 阶段；抗病性状则呈现 gene/target-level A 证据多于 variant-level A 自然变异证据的非对称格局，如 ANP32A（禽流感宿主因子）和 TVB/NHE1（禽白血病病毒（ALV）受体）。在工具选择上，基因组选择和多性状选择指数主要应用于复杂经济性状长期改良；标记辅助选择主要应用于 variant-level A + T2 主效位点；基因编辑主要应用于少数 gene/target-level A 关键靶点，并前置评估监管、福利和病原逃逸风险。</w:t>
       </w:r>
     </w:p>
     <w:p>
@@ -210,7 +210,7 @@
           <w:color w:val="000000"/>
           <w:sz w:val="24"/>
         </w:rPr>
-        <w:t>本文希望回答三个更接近育种决策的问题：(1) 哪些证据只能作为候选线索；(2) 哪些证据值得优先进入功能验证；(3) 哪些结果具备进入目标育种群体验证和转化评估的基础。本文将通过四类性状评估表明：(1) 大多数 GWAS、选择扫描和普通差异表达信号在缺少重复、机制支持和功能验证时仅为 C 级候选线索；(2) 优先功能验证应聚焦已具有较完整机制证据但缺少内源或体内验证的 B+ 候选；(3) variant-level A 证据主要集中于主效可见表型，多数复杂经济性状的现实证据上限受性状结构和表型可测量性约束，长期改良仍应以基因组选择（GS）和多性状选择指数为主。</w:t>
+        <w:t>本文希望回答三个更接近育种决策的问题：(1) 哪些证据只能作为候选线索；(2) 哪些证据值得优先进入功能验证；(3) 哪些结果具备进入目标育种群体验证和转化评估的基础。本文将通过四类性状评估表明：(1) 大多数 GWAS、选择扫描和普通差异表达信号在缺少重复、机制支持和功能验证时仅为 C 级候选线索；(2) 优先功能验证应聚焦已具有较完整机制证据但缺少内源或体内验证的 B+ 候选；(3) 基于本文纳入的代表性位点，variant-level A 证据主要集中于主效可见表型，多数复杂经济性状的现实证据上限受性状结构和表型可测量性约束，长期改良仍应以基因组选择（GS）和多性状选择指数为主。</w:t>
       </w:r>
     </w:p>
     <w:bookmarkEnd w:id="21"/>
@@ -1954,7 +1954,7 @@
           <w:color w:val="000000"/>
           <w:sz w:val="24"/>
         </w:rPr>
-        <w:t>在本文中，该框架的用途更克制：它帮助组织已有文献，避免把候选线索提前包装成因果位点，也避免把功能验证结果直接等同于育种应用。下一章将应用该框架比较不同性状的代表性候选位点，并指出 variant-level A 在家鸡中的具体分布。</w:t>
+        <w:t>在本文中，该框架的用途更克制：它帮助组织已有文献，避免把候选线索提前包装成因果位点，也避免把功能验证结果直接等同于育种应用。下一章将应用该框架比较不同性状的代表性候选位点，并指出 variant-level A 在本文评估案例中的具体分布。</w:t>
       </w:r>
     </w:p>
     <w:p>
@@ -2002,7 +2002,7 @@
           <w:color w:val="000000"/>
           <w:sz w:val="24"/>
         </w:rPr>
-        <w:t xml:space="preserve">本章不试图穷尽所有已报道的候选基因，而是按照第 3 章提出的证据成熟度框架，比较不同性状中具有代表性的候选位点。重点回答三个问题：第一，哪些案例已经具有较完整的“变异—功能—表型”链条；第二，哪些信号具有较强重复性或机制支持，值得优先进入功能验证；第三，哪些结果目前仍主要是候选线索，不宜直接作为因果结论或育种标记使用。这样的比较能够更清楚地显示家鸡精准育种中的一个现实边界：当前 variant-level A 证据主要集中在主效、寡基因或结构变异控制的可见表型，而多数复杂经济性状更常处于 B/B+ 或 C/B 阶段。</w:t>
+        <w:t>本章不试图穷尽所有已报道的候选基因，而是按照第 3 章提出的证据成熟度框架，比较不同性状中具有代表性的候选位点。重点回答三个问题：第一，哪些案例已经具有较完整的“变异—功能—表型”链条；第二，哪些信号具有较强重复性或机制支持，值得优先进入功能验证；第三，哪些结果目前仍主要是候选线索，不宜直接作为因果结论或育种标记使用。这样的比较能够更清楚地显示本文评估案例中的一个现实边界：基于本文纳入的代表性位点，variant-level A 证据主要集中在主效、寡基因或结构变异控制的可见表型，而多数复杂经济性状更常处于 B/B+ 或 C/B 阶段。</w:t>
       </w:r>
     </w:p>
     <w:p>
@@ -10793,7 +10793,7 @@
           <w:color w:val="000000"/>
           <w:sz w:val="24"/>
         </w:rPr>
-        <w:t xml:space="preserve">综合第 4.1–4.4 节可以看到，家鸡候选位点的证据分布并不是均匀的。variant-level A 证据并不稀缺，但主要集中在壳色、肤色、冠型、羽色、纤维黑变等主效或寡基因可见表型中；相反，生长、饲料效率、产蛋持续性、肉质、复杂抗病性和地方适应等育种价值更高的复杂经济性状，通常只能达到 B+、B 或 C–B 阶段。换言之，家鸡遗传研究的现实困境不是完全缺少强因果案例，而是强因果案例的性状分布与产业育种最关心的复杂经济性状之间存在明显错位。</w:t>
+        <w:t>就本文评估的代表性案例而言，家鸡候选位点的证据分布并不是均匀的。variant-level A 证据并不稀缺，但主要集中在壳色、肤色、冠型、羽色、纤维黑变等主效或寡基因可见表型中；相反，生长、饲料效率、产蛋持续性、肉质、复杂抗病性和地方适应等育种价值更高的复杂经济性状，通常只能达到 B+、B 或 C–B 阶段。换言之，就本文评估的案例而言，现实困境不是完全缺少强因果案例，而是强因果案例的性状分布与产业育种最关心的复杂经济性状之间存在明显错位。</w:t>
       </w:r>
     </w:p>
     <w:p>
@@ -11543,7 +11543,7 @@
           <w:color w:val="000000"/>
           <w:sz w:val="24"/>
         </w:rPr>
-        <w:t xml:space="preserve">由此可以提炼出四个判断。第一，证据等级与性状遗传结构高度相关。主效或寡基因控制的可见表型更容易形成“变异—分子功能—表型”链条，因此更容易达到 variant-level A；而饲料效率、产蛋持续性、肉质、复杂抗病性和地方适应等性状通常受多基因小效应、环境互作、发育阶段和管理条件共同影响，即使候选信号数量很多，也很难形成单个位点层面的强因果证据。第二，抗病性状呈现明显的非对称证据格局：强证据更多出现在 gene/target-level，例如 ANP32A 或部分病毒受体相关靶点，而不是自然变异层面的 variant-level A。这说明抗病育种的关键瓶颈不只是发现功能靶点，而是如何将靶点功能证据转化为可育种自然变异，或转化为监管、福利和产业上可接受的编辑应用。</w:t>
+        <w:t>由本文评估的案例可以提炼出四个判断。第一，证据等级与性状遗传结构高度相关。主效或寡基因控制的可见表型更容易形成“变异—分子功能—表型”链条，因此更容易达到 variant-level A；而饲料效率、产蛋持续性、肉质、复杂抗病性和地方适应等性状通常受多基因小效应、环境互作、发育阶段和管理条件共同影响，即使候选信号数量很多，也很难形成单个位点层面的强因果证据。第二，在本文评估的抗病案例中，抗病性状呈现明显的非对称证据格局：强证据更多出现在 gene/target-level，例如 ANP32A 或部分病毒受体相关靶点，而不是自然变异层面的 variant-level A。这说明抗病育种的关键瓶颈不只是发现功能靶点，而是如何将靶点功能证据转化为可育种自然变异，或转化为监管、福利和产业上可接受的编辑应用。</w:t>
       </w:r>
     </w:p>
     <w:p>
@@ -11658,7 +11658,7 @@
           <w:color w:val="000000"/>
           <w:sz w:val="24"/>
         </w:rPr>
-        <w:t xml:space="preserve">第 4 章显示，家鸡中并不缺少强证据位点，但真正达到 variant-level A 的案例主要集中在主效可见表型；多数复杂经济性状仍停留在 C、B 或 B+ 阶段。造成这一现象的关键原因之一，是候选信号从统计发现到功能因果之间仍存在明显断层。GWAS、QTL、选择扫描、多组学共定位和差异表达可以提出候选位点，也可以提高候选位点的机制合理性，但它们通常不能单独证明自然变异驱动表型差异。功能验证的核心任务，就是把“候选信号可能相关”推进到“变异、基因或靶点确实影响分子过程和表型”。</w:t>
+        <w:t>第 4 章评估的代表性案例显示，家鸡中并不缺少强证据位点，但真正达到 variant-level A 的案例主要集中在主效可见表型；多数复杂经济性状仍停留在 C、B 或 B+ 阶段。造成这一现象的关键原因之一，是候选信号从统计发现到功能因果之间仍存在明显断层。GWAS、QTL、选择扫描、多组学共定位和差异表达可以提出候选位点，也可以提高候选位点的机制合理性，但它们通常不能单独证明自然变异驱动表型差异。功能验证的核心任务，就是把“候选信号可能相关”推进到“变异、基因或靶点确实影响分子过程和表型”。</w:t>
       </w:r>
     </w:p>
     <w:p>
@@ -14439,7 +14439,7 @@
           <w:color w:val="000000"/>
           <w:sz w:val="24"/>
         </w:rPr>
-        <w:t xml:space="preserve">本章建立的工具匹配规则基于当前证据格局。下一章将讨论这一格局目前面临的方法学和群体性瓶颈，以及未来最可能改变家鸡候选位点证据分布的具体方向，包括泛基因组与结构变异图谱、PGC 编辑通量提升、地方品种功能基因组学协作和评级框架的形式化验证。</w:t>
+        <w:t>本章建立的工具匹配规则基于本文评估案例呈现的当前证据格局。下一章将讨论这一格局目前面临的方法学和群体性瓶颈，以及未来最可能改变本文所讨论的家鸡候选位点证据分布的具体方向，包括泛基因组与结构变异图谱、PGC 编辑通量提升、地方品种功能基因组学协作和评级框架的形式化验证。</w:t>
       </w:r>
     </w:p>
     <w:bookmarkEnd w:id="46"/>
@@ -14474,7 +14474,7 @@
           <w:color w:val="000000"/>
           <w:sz w:val="24"/>
         </w:rPr>
-        <w:t xml:space="preserve">本文的出发点是一个看似简单却常被混淆的区分：一个候选位点“有多强的证据”和“是否适合用于育种”，是两个不同问题。围绕这一区分，本文建立了证据轴（C/B/B+/A）与产业适用性轴（T0/T1/T2），并用它评估了家鸡四类性状的代表性位点。第 4 章得到的核心图景是：variant-level A 证据在家鸡中并不稀缺，却几乎全部落在主效可见表型上；真正承载产业价值的复杂经济性状，大多停留在 B/B+ 或 C/B。本章讨论这一格局背后的瓶颈、最可能改变它的方向，以及它对研究和育种实践的含义。</w:t>
+        <w:t>本文的出发点是一个看似简单却常被混淆的区分：一个候选位点“有多强的证据”和“是否适合用于育种”，是两个不同问题。围绕这一区分，本文建立了证据轴（C/B/B+/A）与产业适用性轴（T0/T1/T2），并用它评估了家鸡四类性状的代表性位点。基于本文纳入的代表性位点，第 4 章得到的核心图景是：variant-level A 证据在本文评估案例中并不稀缺，却几乎全部落在主效可见表型上；真正承载产业价值的复杂经济性状，大多停留在 B/B+ 或 C/B。本章讨论本文评估案例呈现的这一格局背后的瓶颈、最可能改变它的方向，以及它对研究和育种实践的含义。</w:t>
       </w:r>
     </w:p>
     <w:p>
@@ -14506,7 +14506,7 @@
           <w:color w:val="000000"/>
           <w:sz w:val="24"/>
         </w:rPr>
-        <w:t xml:space="preserve">家鸡复杂经济性状证据上限偏低，不是研究投入不足的简单结果，而是三类结构性瓶颈共同作用的产物。</w:t>
+        <w:t>就本文评估的复杂经济性状案例而言，证据上限偏低不是研究投入不足的简单结果，而是三类结构性瓶颈共同作用的产物。</w:t>
       </w:r>
     </w:p>
     <w:p>
@@ -14586,7 +14586,7 @@
           <w:color w:val="000000"/>
           <w:sz w:val="24"/>
         </w:rPr>
-        <w:t xml:space="preserve">与上述瓶颈相对，未来若干进展有可能系统性地改变家鸡候选位点的证据分布。它们的共同特征是：改变的不是候选信号的数量，而是证据沿四个维度向上移动的能力。</w:t>
+        <w:t>与上述瓶颈相对，未来若干进展有可能系统性地改变本文所讨论的家鸡候选位点证据分布。它们的共同特征是：改变的不是候选信号的数量，而是证据沿四个维度向上移动的能力。</w:t>
       </w:r>
     </w:p>
     <w:p>

</xml_diff>

<commit_message>
Position framework as heuristic
</commit_message>
<xml_diff>
--- a/家鸡候选位点证据分级_当前中稿.docx
+++ b/家鸡候选位点证据分级_当前中稿.docx
@@ -16,7 +16,7 @@
           <w:color w:val="000000"/>
           <w:sz w:val="32"/>
         </w:rPr>
-        <w:t xml:space="preserve">家鸡复杂性状候选位点的证据分级与育种转化</w:t>
+        <w:t>家鸡复杂性状候选位点的证据分级与育种转化：一个启发式框架</w:t>
       </w:r>
     </w:p>
     <w:bookmarkStart w:id="20" w:name="摘要"/>
@@ -49,7 +49,7 @@
           <w:color w:val="000000"/>
           <w:sz w:val="24"/>
         </w:rPr>
-        <w:t>家鸡复杂性状研究已通过 QTL、GWAS、选择扫描和多组学整合积累大量候选位点。但后关联阶段的核心问题已不再是发现更多信号，而是判断已有信号处在何种证据阶段。本文提出家鸡候选位点证据成熟度与育种转化框架，将证据划分为四阶：候选线索（C）、有重复或机制支持的候选（B）、高验证优先级（B+），以及具有完整“变异—分子功能—表型”链条和强功能验证的因果证据（A）。本文的方法学贡献在于将 ClinGen、ACMG/AMP 等临床基因组学中已有的变异解释和证据分级体系适配到家鸡复杂性状和育种转化语境；同时设立独立的 T0/T1/T2 产业适用性轴，纳入群体效应、多性状平衡、动物福利、监管和经济可行性等评估维度，并与 C/B/B+/A 证据轴形成 4×3 评估矩阵。应用该框架评估本文纳入的代表性位点后显示：variant-level A 证据主要集中于 SLCO1B3 蓝壳、BCDO2 黄肤、EDN3 纤维黑变和 SOX5 豌豆冠等主效可见表型；生长、饲料效率、产蛋持续性、肉质和复杂抗病性等多基因经济性状多处于 B/B+ 或 C/B 阶段；抗病性状则呈现 gene/target-level A 证据多于 variant-level A 自然变异证据的非对称格局，如 ANP32A（禽流感宿主因子）和 TVB/NHE1（禽白血病病毒（ALV）受体）。在工具选择上，基因组选择和多性状选择指数主要应用于复杂经济性状长期改良；标记辅助选择主要应用于 variant-level A + T2 主效位点；基因编辑主要应用于少数 gene/target-level A 关键靶点，并前置评估监管、福利和病原逃逸风险。</w:t>
+        <w:t>家鸡复杂性状研究已通过 QTL、GWAS、选择扫描和多组学整合积累大量候选位点。但后关联阶段的核心问题已不再是发现更多信号，而是判断已有信号处在何种证据阶段。本文提出一个启发式证据成熟度与育种转化框架（a proposed heuristic framework），将证据划分为四阶：候选线索（C）、有重复或机制支持的候选（B）、高验证优先级（B+），以及具有完整“变异—分子功能—表型”链条和强功能验证的因果证据（A）。本文的方法学贡献在于将 ClinGen、ACMG/AMP 等临床基因组学中已有的变异解释和证据分级体系适配到家鸡复杂性状和育种转化语境；同时设立独立的 T0/T1/T2 产业适用性轴，纳入群体效应、多性状平衡、动物福利、监管和经济可行性等评估维度，并与 C/B/B+/A 证据轴形成 4×3 评估矩阵。应用该框架评估本文纳入的代表性位点后显示：variant-level A 证据主要集中于 SLCO1B3 蓝壳、BCDO2 黄肤、EDN3 纤维黑变和 SOX5 豌豆冠等主效可见表型；生长、饲料效率、产蛋持续性、肉质和复杂抗病性等多基因经济性状多处于 B/B+ 或 C/B 阶段；抗病性状则呈现 gene/target-level A 证据多于 variant-level A 自然变异证据的非对称格局，如 ANP32A（禽流感宿主因子）和 TVB/NHE1（禽白血病病毒（ALV）受体）。在工具选择上，基因组选择和多性状选择指数主要应用于复杂经济性状长期改良；标记辅助选择主要应用于 variant-level A + T2 主效位点；基因编辑主要应用于少数 gene/target-level A 关键靶点，并前置评估监管、福利和病原逃逸风险。</w:t>
       </w:r>
     </w:p>
     <w:p>
@@ -1906,7 +1906,7 @@
           <w:color w:val="000000"/>
           <w:sz w:val="24"/>
         </w:rPr>
-        <w:t xml:space="preserve">本文提出的 C、B、B+、A 和 T0/T1/T2 框架，是用于叙述性综述的操作性判断工具，而不是已经完成外部验证的客观量表。它的价值在于提高讨论透明度，使读者能够看清一个候选位点的证据来自哪里、强到什么程度、缺哪一环、下一步应该验证什么。它不应被理解为正式指南，也不能替代系统综述、meta 分析、数量遗传评估或目标群体的实际育种验证。</w:t>
+        <w:t>本框架定位为启发式判断工具，而非经过信度验证的量表；其评级一致性的形式化验证（inter-rater reliability）属于后续工作，不影响其作为讨论性框架的适用性。未来若要将其发展为正式量表，可预先注册评分规则；选择覆盖主效表型、生长、产蛋、饲料效率、抗病和地方适应等不同性状类型的代表性位点（建议不少于 30 个）；由多名独立评估者（建议不少于 3 名）盲法评分；以 Cohen’s kappa 或 Fleiss’ kappa 等指标报告一致性，并对分歧位点进行仲裁分析（Fleiss, 1971；Strande et al., 2017；McHugh, 2012）。</w:t>
       </w:r>
     </w:p>
     <w:p>
@@ -1922,7 +1922,7 @@
           <w:color w:val="000000"/>
           <w:sz w:val="24"/>
         </w:rPr>
-        <w:t xml:space="preserve">这一框架仍存在主观性。不同研究者对重复性、机制支持和功能验证强度的判断可能存在差异；不同性状的表型复杂度、可测量性和功能验证难度也不同。例如，对“两个商业品系内重复”是否构成真正独立重复，或对“报告基因阳性加等位基因特异表达”是否足以构成较强机制证据，不同评估者之间可能出现分歧。主效可见表型更容易形成清楚的“变异—功能—表型”链条，而饲料效率、产蛋持续性、肉质、复杂抗病性和地方适应等性状更容易停留在多基因、小效应和环境互作背景下。因此，不同性状之间不宜简单比较“哪个领域更先进”，而应比较各自证据链是否达到该性状条件下可以达到的合理深度。</w:t>
+        <w:t>因此，本文提出的 C、B、B+、A 和 T0/T1/T2 框架，是用于结构化叙述综述的操作性判断工具，而不是正式指南或定量评分量表。它的价值在于提高讨论透明度，使读者能够看清一个候选位点的证据来自哪里、强到什么程度、缺哪一环、下一步应该验证什么。它也不能替代系统综述、meta 分析、数量遗传评估或目标群体的实际育种验证。</w:t>
       </w:r>
     </w:p>
     <w:p>
@@ -1938,7 +1938,7 @@
           <w:color w:val="000000"/>
           <w:sz w:val="24"/>
         </w:rPr>
-        <w:t>本框架尚未完成评估者间一致性（inter-rater reliability）的形式化验证，这是其当前的明确局限。未来的形式化路径包括：预先注册评分规则；选择覆盖主效表型、生长、产蛋、饲料效率、抗病和地方适应等不同性状类型的代表性位点（建议不少于 30 个）；由多名独立评估者（建议不少于 3 名）盲法评分；以 Cohen’s kappa 或 Fleiss’ kappa 等指标报告一致性，并对分歧位点进行仲裁分析（Fleiss, 1971；Strande et al., 2017；McHugh, 2012）。</w:t>
+        <w:t>这一框架仍存在主观性。不同研究者对重复性、机制支持和功能验证强度的判断可能存在差异；不同性状的表型复杂度、可测量性和功能验证难度也不同。例如，对“两个商业品系内重复”是否构成真正独立重复，或对“报告基因阳性加等位基因特异表达”是否足以构成较强机制证据，不同评估者之间可能出现分歧。主效可见表型更容易形成清楚的“变异—功能—表型”链条，而饲料效率、产蛋持续性、肉质、复杂抗病性和地方适应等性状更容易停留在多基因、小效应和环境互作背景下。因此，不同性状之间不宜简单比较“哪个领域更先进”，而应比较各自证据链是否达到该性状条件下可以达到的合理深度。</w:t>
       </w:r>
     </w:p>
     <w:p>

</xml_diff>

<commit_message>
Address minor reviewer revisions on criteria costs and literature
</commit_message>
<xml_diff>
--- a/家鸡候选位点证据分级_当前中稿.docx
+++ b/家鸡候选位点证据分级_当前中稿.docx
@@ -123,6 +123,17 @@
           <w:color w:val="000000"/>
         </w:rPr>
         <w:t>针对这一证据深度的不对称分布，本文借鉴并扩展临床基因组学和循证医学已有的证据分级体系。ClinGen、ACMG/AMP 和 GRADE 已为变异解释、证据权重和干预效果评级提供成熟参照（Guyatt et al., 2008；Rehm et al., 2015；Richards et al., 2015）。本文的核心贡献是将这些体系的核心思路（变异解释、证据权重和应用阶段化）适配到家鸡复杂性状和育种转化语境，并用 T 轴把功能证据强度与产业应用成熟度分开评价。</w:t>
+      </w:r>
+    </w:p>
+    <w:p>
+      <w:pPr>
+        <w:pStyle w:val="BodyText"/>
+      </w:pPr>
+      <w:r>
+        <w:rPr>
+          <w:color w:val="000000"/>
+        </w:rPr>
+        <w:t>近两年，家鸡及动物育种相关基础设施也在快速更新：动物 GS 研究趋势和鸡基因组预测研究提示，复杂性状改良仍依赖全基因组预测体系；泛基因组、GEGA、ChickenGTEx 和单细胞/多组学资源提高了从 GWAS 信号定位到调控组织、细胞类型和候选机制的能力；PGC/CRISPR 编辑综述进一步说明了体内功能验证的技术边界（Celik, 2024；Li X. et al., 2024；Fang and Edwards, 2025；Degalez et al., 2024；ChickenGTEx Consortium et al., 2025；Yan et al., 2024；Wadood and Zhang, 2024；He et al., 2025）。这些进展强化了本文的基本立场：候选位点需要按证据成熟度和转化边界分层，而不是按报道频率简单排序。</w:t>
       </w:r>
     </w:p>
     <w:p>
@@ -1725,10 +1736,9 @@
       </w:pPr>
       <w:r>
         <w:rPr>
-          <w:rFonts w:ascii="Times New Roman" w:hAnsi="Times New Roman" w:eastAsia="宋体" w:cs="Times New Roman"/>
-          <w:color w:val="000000"/>
-        </w:rPr>
-        <w:t>经验上，T2 至少要求：(1) 跨世代稳定性数据（不少于 2 代）；(2) 跨环境或跨场验证；(3) 与多性状选择指数的协调性评估；(4) 经济权重在该应用场景下的明确化。任一项缺失，原则上应保留在 T1 阶段。</w:t>
+          <w:color w:val="000000"/>
+        </w:rPr>
+        <w:t>经验上，T2 至少要求：(1) 跨世代稳定性数据（不少于 2 代）；(2) 跨环境或跨场验证；(3) 与多性状选择指数的协调性评估；(4) 经济权重在该应用场景下的明确化。任一项缺失，原则上应保留在 T1 阶段。以上判据为操作性建议（operational recommendation），基于育种实践经验，非普遍硬性标准。</w:t>
       </w:r>
     </w:p>
     <w:p>
@@ -2802,7 +2812,7 @@
         <w:rPr>
           <w:color w:val="000000"/>
         </w:rPr>
-        <w:t>抗病与免疫性状必须绑定具体病原、感染模型和表型终点。正文保留 MHC-B、ANP32A 和 TVB/NHE1 三个案例，因为它们能够展示抗病证据的非对称性：强证据常出现在 haplotype、gene 或 target 层面，而不是自然变异的 variant-level A。TLR、IFITM3、MX1、OASL、SLC11A1、IL 家族以及 NDV、IBDV、IBV、球虫病、沙门氏菌等候选集合保留在补充表 1。</w:t>
+        <w:t>抗病与免疫性状必须绑定具体病原、感染模型和表型终点。正文保留 MHC-B、ANP32A 和 TVB/NHE1 三个案例，因为它们能够展示抗病证据的非对称性：强证据常出现在 haplotype、gene 或 target 层面，而不是自然变异的 variant-level A。TLR、IFITM3、MX1、OASL、SLC11A1、IL 家族以及 NDV、IBDV、IBV、球虫病、沙门氏菌等候选集合保留在补充表 1。这些集合在本文中用于展示复杂抗病性状的证据上限，而非穷举所有抗病基因。</w:t>
       </w:r>
     </w:p>
     <w:p>
@@ -5513,10 +5523,9 @@
       </w:pPr>
       <w:r>
         <w:rPr>
-          <w:rFonts w:ascii="Times New Roman" w:hAnsi="Times New Roman" w:eastAsia="宋体" w:cs="Times New Roman"/>
-          <w:color w:val="000000"/>
-        </w:rPr>
-        <w:t>标记辅助选择、基因组选择和基因编辑是覆盖不同证据等级与应用场景的并行工具，而非依次替代的三代技术。MAS 适用于少数效应明确、检测方便、与目标表型稳定相关的主效位点；GS 适用于多数多基因复杂经济性状（Wolc, 2014；Wolc et al., 2016）；基因编辑既是强功能验证工具，也可能在少数关键靶点上具有定向改造价值，但它对证据等级、监管路径和产业可接受性的要求最高。因此，证据成熟度框架的核心用途不是给候选位点贴标签，而是防止育种工具错配。</w:t>
+          <w:color w:val="000000"/>
+        </w:rPr>
+        <w:t>标记辅助选择、基因组选择和基因编辑是覆盖不同证据等级与应用场景的并行工具，而非依次替代的三代技术。MAS 适用于少数效应明确、检测方便、与目标表型稳定相关的主效位点；GS 适用于多数多基因复杂经济性状（Wolc, 2014；Wolc et al., 2016；Celik, 2024；Li X. et al., 2024）；基因编辑既是强功能验证工具，也可能在少数关键靶点上具有定向改造价值，但它对证据等级、监管路径和产业可接受性的要求最高。因此，证据成熟度框架的核心用途不是给候选位点贴标签，而是防止育种工具错配。</w:t>
       </w:r>
     </w:p>
     <w:p>
@@ -5528,10 +5537,9 @@
       </w:pPr>
       <w:r>
         <w:rPr>
-          <w:rFonts w:ascii="Times New Roman" w:hAnsi="Times New Roman" w:eastAsia="宋体" w:cs="Times New Roman"/>
-          <w:color w:val="000000"/>
-        </w:rPr>
-        <w:t xml:space="preserve">本章给出的工具匹配建议基于各位点的当前证据等级。证据成熟度本身是动态的：一个位点完成关键验证步骤后可能跨越评级边界，相应应用建议也会随之改变。育种决策应定期回顾候选位点的证据状态，而不是把当前评级当作永久结论。同时，工具选择不仅是证据问题，也是成本—收益问题。MAS 单位点分型成本较低，适合中小育种企业或保种场景；GS 需要参考群体、全基因组标记和稳定表型记录系统，前期投入较大但适合多基因经济性状长期改良；基因编辑需要 PGC 体系、功能验证平台、多代追踪和监管准备，目前更适合大型育种公司或公共研究机构主导。证据成熟度框架提供科学边界，具体工具组合还要结合育种主体资源、目标市场和监管环境综合决定。</w:t>
+          <w:color w:val="000000"/>
+        </w:rPr>
+        <w:t>本章给出的工具匹配建议基于各位点的当前证据等级。证据成熟度本身是动态的：一个位点完成关键验证步骤后可能跨越评级边界，相应应用建议也会随之改变。育种决策应定期回顾候选位点的证据状态，而不是把当前评级当作永久结论。同时，工具选择不仅是证据问题，也是成本—收益问题。MAS 单位点分型成本较低，适合中小育种企业或保种场景；GS 需要参考群体、全基因组标记和稳定表型记录系统，前期投入较大但适合多基因经济性状长期改良；基因编辑需要 PGC 体系、功能验证平台、多代追踪和监管准备，目前更适合大型育种公司或公共研究机构主导。证据成熟度框架提供科学边界，具体工具组合还要结合育种主体资源、目标市场和监管环境综合决定。更具体地说，MAS 单位点分型成本通常为每样本数元至数十元；GS 需建立数百至数千个体的参考群，并持续积累高质量表型；PGC 编辑品系建立通常需专门设施、嵌合体和生殖系传递筛选，单个品系从构建到可用体内表型通常需 2 年以上。</w:t>
       </w:r>
     </w:p>
     <w:p>
@@ -6329,11 +6337,9 @@
       </w:pPr>
       <w:r>
         <w:rPr>
-          <w:rFonts w:ascii="Times New Roman" w:hAnsi="Times New Roman" w:eastAsia="宋体" w:cs="Times New Roman"/>
-          <w:b/>
-          <w:color w:val="000000"/>
-        </w:rPr>
-        <w:t xml:space="preserve">表 8 的核心含义是：证据等级和 T 轴必须同时看。A 级但 T0 的位点不能直接应用；B+ 但 T0 的位点主要用于验证和排序；B+ 即使在某一群体中表现出稳定预测价值，也不应被改写为强因果标记；gene/target-level A 如果缺少 variant-level 自然变异证据，也不能写成可直接选择的功能标记。真正进入育种流程的，不是“看起来重要的基因”，而是证据等级、应用场景和工具类型三者匹配的位点。</w:t>
+          <w:color w:val="000000"/>
+        </w:rPr>
+        <w:t>表 8 的核心含义是：证据等级和 T 轴必须同时看。A 级但 T0 的位点进入目标群体验证；B+ 但 T0 的位点主要用于验证和排序；B+ 若只在某一群体中表现出稳定预测价值，应报告为群体内预测标记，而不是强因果标记；gene/target-level A 缺少 variant-level 自然变异证据时，主要支持靶点研究或编辑路径评估。真正进入育种流程的，是证据等级、应用场景和工具类型三者匹配的组合。</w:t>
       </w:r>
     </w:p>
     <w:p>
@@ -6441,10 +6447,9 @@
       </w:pPr>
       <w:r>
         <w:rPr>
-          <w:rFonts w:ascii="Times New Roman" w:hAnsi="Times New Roman" w:eastAsia="宋体" w:cs="Times New Roman"/>
-          <w:color w:val="000000"/>
-        </w:rPr>
-        <w:t xml:space="preserve">但是，A 级主效位点进入 MAS 并不意味着可以无条件使用。首先，T2 必须绑定具体应用场景。SLCO1B3 可用于蓝壳识别，不代表能够提高产蛋数或蛋壳强度；BCDO2 可用于黄肤管理，不代表能够改善肉质或地方适应；EDN3 可解释乌骨和纤维黑变，不代表其对抗病性或药用价值具有强证据。其次，某些主效位点可能伴随负面连锁或多性状风险。玫瑰冠是第 4.4 节讨论的多性状风险案例。在 MAS 决策语境下，这一风险意味着：即使变异明确度和表型因果证据达到 A 级，玫瑰冠 MAS 也应限制在繁殖性能不是核心目标的场景，如展览、保种或特定文化标识用途，而不应直接进入肉用或蛋用商业品系的繁殖核心群体管理。</w:t>
+          <w:color w:val="000000"/>
+        </w:rPr>
+        <w:t>但是，A 级主效位点进入 MAS 仍需场景限定。SLCO1B3 的成熟场景是蓝壳识别，不涵盖产蛋数或蛋壳强度；BCDO2 的成熟场景是黄肤管理，不涵盖肉质或地方适应；EDN3 的成熟场景是乌骨和纤维黑变，不涵盖抗病性或药用价值。其次，某些主效位点可能伴随负面连锁或多性状风险。玫瑰冠是第 4.4 节讨论的多性状风险案例。在 MAS 决策语境下，即使变异明确度和表型因果证据达到 A 级，玫瑰冠 MAS 也应限制在繁殖性能不是核心目标的场景，如展览、保种或特定文化标识用途。</w:t>
       </w:r>
     </w:p>
     <w:p>
@@ -6610,10 +6615,9 @@
       </w:pPr>
       <w:r>
         <w:rPr>
-          <w:rFonts w:ascii="Times New Roman" w:hAnsi="Times New Roman" w:eastAsia="宋体" w:cs="Times New Roman"/>
-          <w:color w:val="000000"/>
-        </w:rPr>
-        <w:t xml:space="preserve">基因编辑作为育种工具时，门槛更高。一个靶点在实验模型中有效，并不等于可以进入产业育种；这一门槛由证据非对称性、监管路径和应用边界三类约束共同构成。下面以 ANP32A 和 TVB/NHE1 两类典型靶点说明这种约束差异。</w:t>
+          <w:color w:val="000000"/>
+        </w:rPr>
+        <w:t>基因编辑作为育种工具时，门槛更高。一个靶点在实验模型中有效，距离产业育种仍有证据非对称性、监管路径和应用边界三类门槛。下面以 ANP32A 和 TVB/NHE1 两类典型靶点说明这种约束差异。</w:t>
       </w:r>
     </w:p>
     <w:p>
@@ -7079,10 +7083,9 @@
       </w:pPr>
       <w:r>
         <w:rPr>
-          <w:rFonts w:ascii="Times New Roman" w:hAnsi="Times New Roman" w:eastAsia="宋体" w:cs="Times New Roman"/>
-          <w:color w:val="000000"/>
-        </w:rPr>
-        <w:t xml:space="preserve">总体而言，证据成熟度框架对育种转化的实际作用，是把“有什么证据”与“用什么工具”之间的对应关系显性化。MAS 不应承担复杂经济性状长期改良的主干任务；GS 不需要每个位点都达到 A 级，但需要高质量表型和全基因组预测体系；基因编辑不能因为靶点有效就直接进入产业应用，而必须经过 T 轴约束。真正稳妥的家鸡精准育种，是让证据等级、性状结构、应用场景和育种工具四者持续对齐，而不是把任何一个候选位点当作通用解。</w:t>
+          <w:color w:val="000000"/>
+        </w:rPr>
+        <w:t>总体而言，证据成熟度框架对育种转化的实际作用，是把“有什么证据”与“用什么工具”之间的对应关系显性化。MAS 不应承担复杂经济性状长期改良的主干任务；GS 不要求每个位点都达到 A 级，但需要高质量表型和全基因组预测体系；基因编辑即使靶点有效，也必须经过 T 轴约束。真正稳妥的家鸡精准育种，是让证据等级、性状结构、应用场景和育种工具四者持续对齐，而不是把任何一个候选位点当作通用解。</w:t>
       </w:r>
     </w:p>
     <w:p>
@@ -7247,10 +7250,9 @@
       </w:pPr>
       <w:r>
         <w:rPr>
-          <w:rFonts w:ascii="Times New Roman" w:hAnsi="Times New Roman" w:eastAsia="宋体" w:cs="Times New Roman"/>
-          <w:color w:val="000000"/>
-        </w:rPr>
-        <w:t xml:space="preserve">近期影响最直接的是泛基因组与结构变异图谱。第 2 章已指出，家鸡多个强效表型并非由最显著 SNP 解释，而是涉及结构变异、拷贝数变化或参考基因组之外的非参考序列（Rice et al., 2023）。随着长读长测序和图泛基因组的普及，系统性识别结构变异将使大批停留在 region-level 或 gene-level 的信号有机会推进到 variant-level，这是变异明确度维度最可能取得整体进展的方向。</w:t>
+          <w:color w:val="000000"/>
+        </w:rPr>
+        <w:t>近期影响最直接的是泛基因组与结构变异图谱。第 2 章已指出，家鸡多个强效表型并非由最显著 SNP 解释，而是涉及结构变异、拷贝数变化或参考基因组之外的非参考序列（Rice et al., 2023；Fang and Edwards, 2025）。随着长读长测序和图泛基因组的普及，系统性识别结构变异将使大批停留在 region-level 或 gene-level 的信号有机会推进到 variant-level，这是变异明确度维度最可能取得整体进展的方向。与此同时，GEGA 和 ChickenGTEx 等功能基因组资源把候选区域进一步连接到组织表达、调控效应和单细胞背景，有助于判断 GWAS 信号的作用组织和分子路径（Degalez et al., 2024；ChickenGTEx Consortium et al., 2025；Yan et al., 2024）。</w:t>
       </w:r>
     </w:p>
     <w:p>
@@ -7262,10 +7264,9 @@
       </w:pPr>
       <w:r>
         <w:rPr>
-          <w:rFonts w:ascii="Times New Roman" w:hAnsi="Times New Roman" w:eastAsia="宋体" w:cs="Times New Roman"/>
-          <w:color w:val="000000"/>
-        </w:rPr>
-        <w:t xml:space="preserve">其次是生殖系编辑通量的提升。若 PGC 介导编辑和等位基因替换的效率、规模与成本能够改善，功能验证将从一次只能处理少数位点，转向对候选变异的系统性筛查，这直接决定第 4 章中大量 B+ 候选能否、以及以多快速度被推向 A。</w:t>
+          <w:color w:val="000000"/>
+        </w:rPr>
+        <w:t>其次是生殖系编辑通量的提升。若 PGC 介导编辑和等位基因替换的效率、规模与成本能够改善，功能验证将从一次只能处理少数位点，转向对候选变异的系统性筛查，这直接决定第 4 章中大量 B+ 候选能否、以及以多快速度被推向 A。近年鸡 PGC/CRISPR 编辑综述也强调，编辑通量提升的关键仍在 PGC 培养、递送效率、生殖系传递和多代验证（He et al., 2025）。</w:t>
       </w:r>
     </w:p>
     <w:p>
@@ -7374,929 +7375,558 @@
       </w:r>
     </w:p>
     <w:p>
-      <w:pPr>
-        <w:pStyle w:val="Heading2"/>
-        <w:spacing w:before="240" w:after="120" w:line="312" w:lineRule="auto"/>
-        <w:jc w:val="left"/>
-      </w:pPr>
-      <w:r>
-        <w:rPr>
-          <w:rFonts w:ascii="Times New Roman" w:hAnsi="Times New Roman" w:eastAsia="黑体" w:cs="Times New Roman"/>
-          <w:b/>
+      <w:r>
+        <w:rPr>
           <w:color w:val="000000"/>
         </w:rPr>
         <w:t>Animal QTLdb. Chicken QTLdb summary data by year and release. Release 58 (Dec. 29, 2025). https://www.animalgenome.org/cgi-bin/QTLdb/GG/summary?statu=&amp;summ=year. Accessed May 31, 2026.</w:t>
       </w:r>
     </w:p>
     <w:p>
-      <w:pPr>
-        <w:pStyle w:val="Heading2"/>
-        <w:spacing w:before="240" w:after="120" w:line="312" w:lineRule="auto"/>
-        <w:jc w:val="left"/>
-      </w:pPr>
-      <w:r>
-        <w:rPr>
-          <w:rFonts w:ascii="Times New Roman" w:hAnsi="Times New Roman" w:eastAsia="黑体" w:cs="Times New Roman"/>
-          <w:b/>
+      <w:r>
+        <w:rPr>
           <w:color w:val="000000"/>
         </w:rPr>
         <w:t>Briles, W. E., and Briles, R. W. 1982. Identification of haplotypes of the chicken major histocompatibility complex (B). Immunogenetics 15:449-459. https://doi.org/10.1007/BF00345904.</w:t>
       </w:r>
     </w:p>
     <w:p>
-      <w:pPr>
-        <w:pStyle w:val="Heading2"/>
-        <w:spacing w:before="240" w:after="120" w:line="312" w:lineRule="auto"/>
-        <w:jc w:val="left"/>
-      </w:pPr>
-      <w:r>
-        <w:rPr>
-          <w:rFonts w:ascii="Times New Roman" w:hAnsi="Times New Roman" w:eastAsia="黑体" w:cs="Times New Roman"/>
-          <w:b/>
+      <w:r>
+        <w:rPr>
           <w:color w:val="000000"/>
         </w:rPr>
         <w:t>Calenge, F., Kaiser, P., Vignal, A., and Beaumont, C. 2010. Genetic control of resistance to salmonellosis and to Salmonella carrier-state in fowl: a review. Genetics Selection Evolution 42:11. https://doi.org/10.1186/1297-9686-42-11.</w:t>
       </w:r>
     </w:p>
     <w:p>
-      <w:pPr>
-        <w:pStyle w:val="Heading2"/>
-        <w:spacing w:before="240" w:after="120" w:line="312" w:lineRule="auto"/>
-        <w:jc w:val="left"/>
-      </w:pPr>
-      <w:r>
-        <w:rPr>
-          <w:rFonts w:ascii="Times New Roman" w:hAnsi="Times New Roman" w:eastAsia="黑体" w:cs="Times New Roman"/>
-          <w:b/>
+      <w:r>
+        <w:rPr>
+          <w:color w:val="000000"/>
+        </w:rPr>
+        <w:t>Celik, S. 2024. Bibliometric analysis of genomic selection in breeding of animal from 1993 to 2024: global trends and advancements. Frontiers in Genetics 15:1402140. https://doi.org/10.3389/fgene.2024.1402140.</w:t>
+      </w:r>
+    </w:p>
+    <w:p>
+      <w:r>
+        <w:rPr>
+          <w:color w:val="000000"/>
+        </w:rPr>
+        <w:t>ChickenGTEx Consortium, Yao, Y., Smith, J., et al. 2025. Genetic regulation of gene expression across multiple tissues in chickens. Nature Genetics 57:1298-1308. https://doi.org/10.1038/s41588-025-02155-9.</w:t>
+      </w:r>
+    </w:p>
+    <w:p>
+      <w:r>
+        <w:rPr>
+          <w:color w:val="000000"/>
+        </w:rPr>
+        <w:t>Degalez, F., Bardou, P., and Lagarrigue, S. 2024. GEGA (Gallus Enriched Gene Annotation): an online tool providing genomics and functional information across 47 tissues for a chicken gene-enriched atlas gathering Ensembl and RefSeq genome annotations. NAR Genomics and Bioinformatics 6:lqae101. https://doi.org/10.1093/nargab/lqae101.</w:t>
+      </w:r>
+    </w:p>
+    <w:p>
+      <w:r>
+        <w:rPr>
           <w:color w:val="000000"/>
         </w:rPr>
         <w:t>Dorshorst, B., Molin, A.-M., Rubin, C.-J., et al. 2011. A complex genomic rearrangement involving the endothelin 3 locus causes dermal hyperpigmentation in the chicken. PLoS Genetics 7:e1002412. https://doi.org/10.1371/journal.pgen.1002412.</w:t>
       </w:r>
     </w:p>
     <w:p>
-      <w:pPr>
-        <w:pStyle w:val="Heading2"/>
-        <w:spacing w:before="240" w:after="120" w:line="312" w:lineRule="auto"/>
-        <w:jc w:val="left"/>
-      </w:pPr>
-      <w:r>
-        <w:rPr>
-          <w:rFonts w:ascii="Times New Roman" w:hAnsi="Times New Roman" w:eastAsia="黑体" w:cs="Times New Roman"/>
-          <w:b/>
+      <w:r>
+        <w:rPr>
           <w:color w:val="000000"/>
         </w:rPr>
         <w:t>Elferink, M. G., Vallee, A. A., Jungerius, A. P., Crooijmans, R. P. M. A., and Groenen, M. A. M. 2008. Partial duplication of the PRLR and SPEF2 genes at the late feathering locus in chicken. BMC Genomics 9:391. https://doi.org/10.1186/1471-2164-9-391.</w:t>
       </w:r>
     </w:p>
     <w:p>
-      <w:pPr>
-        <w:pStyle w:val="Heading2"/>
-        <w:spacing w:before="240" w:after="120" w:line="312" w:lineRule="auto"/>
-        <w:jc w:val="left"/>
-      </w:pPr>
-      <w:r>
-        <w:rPr>
-          <w:rFonts w:ascii="Times New Roman" w:hAnsi="Times New Roman" w:eastAsia="黑体" w:cs="Times New Roman"/>
-          <w:b/>
+      <w:r>
+        <w:rPr>
           <w:color w:val="000000"/>
         </w:rPr>
         <w:t>Eriksson, J., Larson, G., Gunnarsson, U., et al. 2008. Identification of the yellow skin gene reveals a hybrid origin of the domestic chicken. PLoS Genetics 4:e1000010. https://doi.org/10.1371/journal.pgen.1000010.</w:t>
       </w:r>
     </w:p>
     <w:p>
-      <w:pPr>
-        <w:pStyle w:val="Heading2"/>
-        <w:spacing w:before="240" w:after="120" w:line="312" w:lineRule="auto"/>
-        <w:jc w:val="left"/>
-      </w:pPr>
-      <w:r>
-        <w:rPr>
-          <w:rFonts w:ascii="Times New Roman" w:hAnsi="Times New Roman" w:eastAsia="黑体" w:cs="Times New Roman"/>
-          <w:b/>
+      <w:r>
+        <w:rPr>
+          <w:color w:val="000000"/>
+        </w:rPr>
+        <w:t>Fang, B., and Edwards, S. V. 2025. Pangenomes: new tools for ecological and evolutionary genomics. Trends in Ecology &amp; Evolution. https://doi.org/10.1016/j.tree.2025.11.010.</w:t>
+      </w:r>
+    </w:p>
+    <w:p>
+      <w:r>
+        <w:rPr>
           <w:color w:val="000000"/>
         </w:rPr>
         <w:t>Fleiss, J. L. 1971. Measuring nominal scale agreement among many raters. Psychological Bulletin 76:378-382. https://doi.org/10.1037/h0031619.</w:t>
       </w:r>
     </w:p>
     <w:p>
-      <w:pPr>
-        <w:pStyle w:val="Heading2"/>
-        <w:spacing w:before="240" w:after="120" w:line="312" w:lineRule="auto"/>
-        <w:jc w:val="left"/>
-      </w:pPr>
-      <w:r>
-        <w:rPr>
-          <w:rFonts w:ascii="Times New Roman" w:hAnsi="Times New Roman" w:eastAsia="黑体" w:cs="Times New Roman"/>
-          <w:b/>
+      <w:r>
+        <w:rPr>
           <w:color w:val="000000"/>
         </w:rPr>
         <w:t>Fu, Y., Wu, C., Shen, M., Pan, J., Zhang, H., Sun, L., Liang, S., and Huang, X. 2023. Genome-wide association study of egg production traits in Shuanglian chickens using whole genome sequencing. Genes 14:2129. https://doi.org/10.3390/genes14122129.</w:t>
       </w:r>
     </w:p>
     <w:p>
-      <w:pPr>
-        <w:pStyle w:val="Heading2"/>
-        <w:spacing w:before="240" w:after="120" w:line="312" w:lineRule="auto"/>
-        <w:jc w:val="left"/>
-      </w:pPr>
-      <w:r>
-        <w:rPr>
-          <w:rFonts w:ascii="Times New Roman" w:hAnsi="Times New Roman" w:eastAsia="黑体" w:cs="Times New Roman"/>
-          <w:b/>
+      <w:r>
+        <w:rPr>
           <w:color w:val="000000"/>
         </w:rPr>
         <w:t>Gao, Y., Xu, G., Zeng, T., Tian, Y., Wu, P., Liu, Y., Zhao, Y., and Zhou, S. 2022. Genome-wide association study of egg-laying traits and egg quality in LingKun chickens. Frontiers in Veterinary Science 9:877739. https://doi.org/10.3389/fvets.2022.877739.</w:t>
       </w:r>
     </w:p>
     <w:p>
-      <w:pPr>
-        <w:pStyle w:val="Heading2"/>
-        <w:spacing w:before="240" w:after="120" w:line="312" w:lineRule="auto"/>
-        <w:jc w:val="left"/>
-      </w:pPr>
-      <w:r>
-        <w:rPr>
-          <w:rFonts w:ascii="Times New Roman" w:hAnsi="Times New Roman" w:eastAsia="黑体" w:cs="Times New Roman"/>
-          <w:b/>
+      <w:r>
+        <w:rPr>
           <w:color w:val="000000"/>
         </w:rPr>
         <w:t>Giambartolomei, C., Vukcevic, D., Schadt, E. E., et al. 2014. Bayesian test for colocalisation between pairs of genetic association studies using summary statistics. PLoS Genetics 10:e1004383. https://doi.org/10.1371/journal.pgen.1004383.</w:t>
       </w:r>
     </w:p>
     <w:p>
-      <w:pPr>
-        <w:pStyle w:val="Heading2"/>
-        <w:spacing w:before="240" w:after="120" w:line="312" w:lineRule="auto"/>
-        <w:jc w:val="left"/>
-      </w:pPr>
-      <w:r>
-        <w:rPr>
-          <w:rFonts w:ascii="Times New Roman" w:hAnsi="Times New Roman" w:eastAsia="黑体" w:cs="Times New Roman"/>
-          <w:b/>
+      <w:r>
+        <w:rPr>
           <w:color w:val="000000"/>
         </w:rPr>
         <w:t>Guyatt, G. H., Oxman, A. D., Vist, G. E., et al. 2008. GRADE: an emerging consensus on rating quality of evidence and strength of recommendations. BMJ 336:924-926. https://doi.org/10.1136/bmj.39489.470347.AD.</w:t>
       </w:r>
     </w:p>
     <w:p>
-      <w:pPr>
-        <w:pStyle w:val="Heading2"/>
-        <w:spacing w:before="240" w:after="120" w:line="312" w:lineRule="auto"/>
-        <w:jc w:val="left"/>
-      </w:pPr>
-      <w:r>
-        <w:rPr>
-          <w:rFonts w:ascii="Times New Roman" w:hAnsi="Times New Roman" w:eastAsia="黑体" w:cs="Times New Roman"/>
-          <w:b/>
+      <w:r>
+        <w:rPr>
           <w:color w:val="000000"/>
         </w:rPr>
         <w:t>Habimana, R., Ngeno, K., Okeno, T. O., Hirwa, C. d. A., Keambou Tiambo, C., and Yao, N. 2021. Genome-wide association study of growth performance and immune response to Newcastle disease virus of indigenous chicken in Rwanda. Frontiers in Genetics 12:723980. https://doi.org/10.3389/fgene.2021.723980.</w:t>
       </w:r>
     </w:p>
     <w:p>
-      <w:pPr>
-        <w:pStyle w:val="Heading2"/>
-        <w:spacing w:before="240" w:after="120" w:line="312" w:lineRule="auto"/>
-        <w:jc w:val="left"/>
-      </w:pPr>
-      <w:r>
-        <w:rPr>
-          <w:rFonts w:ascii="Times New Roman" w:hAnsi="Times New Roman" w:eastAsia="黑体" w:cs="Times New Roman"/>
-          <w:b/>
+      <w:r>
+        <w:rPr>
+          <w:color w:val="000000"/>
+        </w:rPr>
+        <w:t>He, J., Shi, N., Yao, H., Li, J., Wang, Y., and Zhang, J. 2025. Genome editing in the chicken: from PGC-mediated germline transmission to advanced applications. International Journal of Molecular Sciences 26:9426. https://doi.org/10.3390/ijms26199426.</w:t>
+      </w:r>
+    </w:p>
+    <w:p>
+      <w:r>
+        <w:rPr>
           <w:color w:val="000000"/>
         </w:rPr>
         <w:t>Hormozdiari, F., van de Bunt, M., Segre, A. V., et al. 2016. Colocalization of GWAS and eQTL signals detects target genes. American Journal of Human Genetics 99:1245-1260. https://doi.org/10.1016/j.ajhg.2016.10.003.</w:t>
       </w:r>
     </w:p>
     <w:p>
-      <w:pPr>
-        <w:pStyle w:val="Heading2"/>
-        <w:spacing w:before="240" w:after="120" w:line="312" w:lineRule="auto"/>
-        <w:jc w:val="left"/>
-      </w:pPr>
-      <w:r>
-        <w:rPr>
-          <w:rFonts w:ascii="Times New Roman" w:hAnsi="Times New Roman" w:eastAsia="黑体" w:cs="Times New Roman"/>
-          <w:b/>
+      <w:r>
+        <w:rPr>
           <w:color w:val="000000"/>
         </w:rPr>
         <w:t>Hu, Z.-L., Park, C. A., and Reecy, J. M. 2016. Developmental progress and current status of the Animal QTLdb. Nucleic Acids Research 44:D827-D833. https://doi.org/10.1093/nar/gkv1233.</w:t>
       </w:r>
     </w:p>
     <w:p>
-      <w:pPr>
-        <w:pStyle w:val="Heading2"/>
-        <w:spacing w:before="240" w:after="120" w:line="312" w:lineRule="auto"/>
-        <w:jc w:val="left"/>
-      </w:pPr>
-      <w:r>
-        <w:rPr>
-          <w:rFonts w:ascii="Times New Roman" w:hAnsi="Times New Roman" w:eastAsia="黑体" w:cs="Times New Roman"/>
-          <w:b/>
+      <w:r>
+        <w:rPr>
           <w:color w:val="000000"/>
         </w:rPr>
         <w:t>Idoko-Akoh, A., Goldhill, D. H., Sheppard, C. M., et al. 2023. Creating resistance to avian influenza infection through genome editing of the ANP32 gene family. Nature Communications 14:6136. https://doi.org/10.1038/s41467-023-41476-3.</w:t>
       </w:r>
     </w:p>
     <w:p>
-      <w:pPr>
-        <w:pStyle w:val="Heading2"/>
-        <w:spacing w:before="240" w:after="120" w:line="312" w:lineRule="auto"/>
-        <w:jc w:val="left"/>
-      </w:pPr>
-      <w:r>
-        <w:rPr>
-          <w:rFonts w:ascii="Times New Roman" w:hAnsi="Times New Roman" w:eastAsia="黑体" w:cs="Times New Roman"/>
-          <w:b/>
+      <w:r>
+        <w:rPr>
           <w:color w:val="000000"/>
         </w:rPr>
         <w:t>Imsland, F., Feng, C., Boije, H., et al. 2012. The Rose-comb mutation in chickens constitutes a structural rearrangement causing both altered comb morphology and defective sperm motility. PLoS Genetics 8:e1002775. https://doi.org/10.1371/journal.pgen.1002775.</w:t>
       </w:r>
     </w:p>
     <w:p>
-      <w:pPr>
-        <w:pStyle w:val="Heading2"/>
-        <w:spacing w:before="240" w:after="120" w:line="312" w:lineRule="auto"/>
-        <w:jc w:val="left"/>
-      </w:pPr>
-      <w:r>
-        <w:rPr>
-          <w:rFonts w:ascii="Times New Roman" w:hAnsi="Times New Roman" w:eastAsia="黑体" w:cs="Times New Roman"/>
-          <w:b/>
+      <w:r>
+        <w:rPr>
           <w:color w:val="000000"/>
         </w:rPr>
         <w:t>Inoue, F., and Ahituv, N. 2015. Decoding enhancers using massively parallel reporter assays. Genomics 106:159-164. https://doi.org/10.1016/j.ygeno.2015.06.005.</w:t>
       </w:r>
     </w:p>
     <w:p>
-      <w:pPr>
-        <w:pStyle w:val="Heading2"/>
-        <w:spacing w:before="240" w:after="120" w:line="312" w:lineRule="auto"/>
-        <w:jc w:val="left"/>
-      </w:pPr>
-      <w:r>
-        <w:rPr>
-          <w:rFonts w:ascii="Times New Roman" w:hAnsi="Times New Roman" w:eastAsia="黑体" w:cs="Times New Roman"/>
-          <w:b/>
+      <w:r>
+        <w:rPr>
           <w:color w:val="000000"/>
         </w:rPr>
         <w:t>Kambadur, R., Sharma, M., Smith, T. P. L., and Bass, J. J. 1997. Mutations in myostatin (GDF8) in double-muscled Belgian Blue and Piedmontese cattle. Genome Research 7:910-916. https://doi.org/10.1101/gr.7.9.910.</w:t>
       </w:r>
     </w:p>
     <w:p>
-      <w:pPr>
-        <w:pStyle w:val="Heading2"/>
-        <w:spacing w:before="240" w:after="120" w:line="312" w:lineRule="auto"/>
-        <w:jc w:val="left"/>
-      </w:pPr>
-      <w:r>
-        <w:rPr>
-          <w:rFonts w:ascii="Times New Roman" w:hAnsi="Times New Roman" w:eastAsia="黑体" w:cs="Times New Roman"/>
-          <w:b/>
+      <w:r>
+        <w:rPr>
           <w:color w:val="000000"/>
         </w:rPr>
         <w:t>Kampmann, M. 2018. CRISPRi and CRISPRa screens in mammalian cells for precision biology and medicine. ACS Chemical Biology 13:406-416. https://doi.org/10.1021/acschembio.7b00657.</w:t>
       </w:r>
     </w:p>
     <w:p>
-      <w:pPr>
-        <w:pStyle w:val="Heading2"/>
-        <w:spacing w:before="240" w:after="120" w:line="312" w:lineRule="auto"/>
-        <w:jc w:val="left"/>
-      </w:pPr>
-      <w:r>
-        <w:rPr>
-          <w:rFonts w:ascii="Times New Roman" w:hAnsi="Times New Roman" w:eastAsia="黑体" w:cs="Times New Roman"/>
-          <w:b/>
+      <w:r>
+        <w:rPr>
           <w:color w:val="000000"/>
         </w:rPr>
         <w:t>Kang, X., Lu, Y., Zhang, H., et al. 2024. Genome-wide association study identifies a novel candidate gene for egg production traits in chickens. Animal Genetics 55:480-483. https://doi.org/10.1111/age.13427.</w:t>
       </w:r>
     </w:p>
     <w:p>
-      <w:pPr>
-        <w:pStyle w:val="Heading2"/>
-        <w:spacing w:before="240" w:after="120" w:line="312" w:lineRule="auto"/>
-        <w:jc w:val="left"/>
-      </w:pPr>
-      <w:r>
-        <w:rPr>
-          <w:rFonts w:ascii="Times New Roman" w:hAnsi="Times New Roman" w:eastAsia="黑体" w:cs="Times New Roman"/>
-          <w:b/>
+      <w:r>
+        <w:rPr>
           <w:color w:val="000000"/>
         </w:rPr>
         <w:t>Kaufman, J., Milne, S., Göbel, T. W. F., et al. 1999. The chicken B locus is a minimal essential major histocompatibility complex. Nature 401:923-925. https://doi.org/10.1038/44856.</w:t>
       </w:r>
     </w:p>
     <w:p>
-      <w:pPr>
-        <w:pStyle w:val="Heading2"/>
-        <w:spacing w:before="240" w:after="120" w:line="312" w:lineRule="auto"/>
-        <w:jc w:val="left"/>
-      </w:pPr>
-      <w:r>
-        <w:rPr>
-          <w:rFonts w:ascii="Times New Roman" w:hAnsi="Times New Roman" w:eastAsia="黑体" w:cs="Times New Roman"/>
-          <w:b/>
+      <w:r>
+        <w:rPr>
           <w:color w:val="000000"/>
         </w:rPr>
         <w:t>Kerje, S., Lind, J., Schütz, K., Jensen, P., and Andersson, L. 2003. Melanocortin 1-receptor (MC1R) mutations are associated with plumage colour in chicken. Animal Genetics 34:241-248. https://doi.org/10.1046/j.1365-2052.2003.00991.x.</w:t>
       </w:r>
     </w:p>
     <w:p>
-      <w:pPr>
-        <w:pStyle w:val="Heading2"/>
-        <w:spacing w:before="240" w:after="120" w:line="312" w:lineRule="auto"/>
-        <w:jc w:val="left"/>
-      </w:pPr>
-      <w:r>
-        <w:rPr>
-          <w:rFonts w:ascii="Times New Roman" w:hAnsi="Times New Roman" w:eastAsia="黑体" w:cs="Times New Roman"/>
-          <w:b/>
+      <w:r>
+        <w:rPr>
           <w:color w:val="000000"/>
         </w:rPr>
         <w:t>Kerje, S., Sharma, P., Gunnarsson, U., et al. 2004. The Dominant white, Dun and Smoky color variants in chicken are associated with insertion/deletion polymorphisms in the PMEL17 gene. Genetics 168:1507-1518. https://doi.org/10.1534/genetics.104.027995.</w:t>
       </w:r>
     </w:p>
     <w:p>
-      <w:pPr>
-        <w:pStyle w:val="Heading2"/>
-        <w:spacing w:before="240" w:after="120" w:line="312" w:lineRule="auto"/>
-        <w:jc w:val="left"/>
-      </w:pPr>
-      <w:r>
-        <w:rPr>
-          <w:rFonts w:ascii="Times New Roman" w:hAnsi="Times New Roman" w:eastAsia="黑体" w:cs="Times New Roman"/>
-          <w:b/>
+      <w:r>
+        <w:rPr>
           <w:color w:val="000000"/>
         </w:rPr>
         <w:t>Kim, D. K., Hong, Y. H., Lillehoj, H. S., and Lee, S. H. 2010. Genetic effects analysis of myeloid leukemia factor 2 and T cell receptor-β on resistance to coccidiosis in chickens. Poultry Science 89:20-27. https://doi.org/10.3382/ps.2009-00351.</w:t>
       </w:r>
     </w:p>
     <w:p>
-      <w:pPr>
-        <w:pStyle w:val="Heading2"/>
-        <w:spacing w:before="240" w:after="120" w:line="312" w:lineRule="auto"/>
-        <w:jc w:val="left"/>
-      </w:pPr>
-      <w:r>
-        <w:rPr>
-          <w:rFonts w:ascii="Times New Roman" w:hAnsi="Times New Roman" w:eastAsia="黑体" w:cs="Times New Roman"/>
-          <w:b/>
+      <w:r>
+        <w:rPr>
           <w:color w:val="000000"/>
         </w:rPr>
         <w:t>Lee, H. J., Lee, K. Y., Jung, K. M., et al. 2017. Precise gene editing of chicken Na+/H+ exchange type 1 (chNHE1) confers resistance to avian leukosis virus subgroup J (ALV-J). Developmental and Comparative Immunology 77:340-349. https://doi.org/10.1016/j.dci.2017.09.006.</w:t>
       </w:r>
     </w:p>
     <w:p>
-      <w:pPr>
-        <w:pStyle w:val="Heading2"/>
-        <w:spacing w:before="240" w:after="120" w:line="312" w:lineRule="auto"/>
-        <w:jc w:val="left"/>
-      </w:pPr>
-      <w:r>
-        <w:rPr>
-          <w:rFonts w:ascii="Times New Roman" w:hAnsi="Times New Roman" w:eastAsia="黑体" w:cs="Times New Roman"/>
-          <w:b/>
+      <w:r>
+        <w:rPr>
           <w:color w:val="000000"/>
         </w:rPr>
         <w:t>Li, D., Chen, G., Zhang, X., et al. 2018. Naturally occurring frameshift mutations in the tvb receptor gene are responsible for decreased susceptibility of chicken to infection with avian leukosis virus subgroups B, D, and E. Journal of Virology 92:e01770-17. https://doi.org/10.1128/JVI.01770-17.</w:t>
       </w:r>
     </w:p>
     <w:p>
-      <w:pPr>
-        <w:pStyle w:val="Heading2"/>
-        <w:spacing w:before="240" w:after="120" w:line="312" w:lineRule="auto"/>
-        <w:jc w:val="left"/>
-      </w:pPr>
-      <w:r>
-        <w:rPr>
-          <w:rFonts w:ascii="Times New Roman" w:hAnsi="Times New Roman" w:eastAsia="黑体" w:cs="Times New Roman"/>
-          <w:b/>
+      <w:r>
+        <w:rPr>
           <w:color w:val="000000"/>
         </w:rPr>
         <w:t>Li, G., Chen, S., Duan, Z., Qu, L., Xu, G., and Yang, N. 2013. Comparison of protoporphyrin IX content and related gene expression in the tissues of chickens laying brown-shelled eggs. Poultry Science 92:3120-3124. https://doi.org/10.3382/ps.2013-03484.</w:t>
       </w:r>
     </w:p>
     <w:p>
-      <w:pPr>
-        <w:pStyle w:val="Heading2"/>
-        <w:spacing w:before="240" w:after="120" w:line="312" w:lineRule="auto"/>
-        <w:jc w:val="left"/>
-      </w:pPr>
-      <w:r>
-        <w:rPr>
-          <w:rFonts w:ascii="Times New Roman" w:hAnsi="Times New Roman" w:eastAsia="黑体" w:cs="Times New Roman"/>
-          <w:b/>
+      <w:r>
+        <w:rPr>
           <w:color w:val="000000"/>
         </w:rPr>
         <w:t>Li, J., Lee, M. O., Davis, B. W., et al. 2020. Mutations upstream of the TBX5 and PITX1 transcription factor genes are associated with feathered legs in the domestic chicken. Molecular Biology and Evolution 37:2477-2486. https://doi.org/10.1093/molbev/msaa093.</w:t>
       </w:r>
     </w:p>
     <w:p>
-      <w:pPr>
-        <w:pStyle w:val="Heading2"/>
-        <w:spacing w:before="240" w:after="120" w:line="312" w:lineRule="auto"/>
-        <w:jc w:val="left"/>
-      </w:pPr>
-      <w:r>
-        <w:rPr>
-          <w:rFonts w:ascii="Times New Roman" w:hAnsi="Times New Roman" w:eastAsia="黑体" w:cs="Times New Roman"/>
-          <w:b/>
+      <w:r>
+        <w:rPr>
+          <w:color w:val="000000"/>
+        </w:rPr>
+        <w:t>Li, X., Chen, X., Wang, Q., Yang, N., and Sun, C. 2024. Integrating bioinformatics and machine learning for genomic prediction in chickens. Genes 15:690. https://doi.org/10.3390/genes15060690.</w:t>
+      </w:r>
+    </w:p>
+    <w:p>
+      <w:r>
+        <w:rPr>
+          <w:color w:val="000000"/>
+        </w:rPr>
+        <w:t>Liu, R., Luo, C., Wang, Z., et al. 2017. Assessment of the genomic prediction accuracy for feed efficiency traits in meat-type chickens. PLoS ONE 12:e0173620. https://doi.org/10.1371/journal.pone.0173620.</w:t>
+      </w:r>
+    </w:p>
+    <w:p>
+      <w:r>
+        <w:rPr>
           <w:color w:val="000000"/>
         </w:rPr>
         <w:t>Liu, W., Kaiser, M. G., and Lamont, S. J. 2003. Natural resistance-associated macrophage protein 1 gene polymorphisms and response to vaccine against or challenge with Salmonella enteritidis in young chicks. Poultry Science 82:259-266. https://doi.org/10.1093/ps/82.2.259.</w:t>
       </w:r>
     </w:p>
     <w:p>
-      <w:pPr>
-        <w:pStyle w:val="Heading2"/>
-        <w:spacing w:before="240" w:after="120" w:line="312" w:lineRule="auto"/>
-        <w:jc w:val="left"/>
-      </w:pPr>
-      <w:r>
-        <w:rPr>
-          <w:rFonts w:ascii="Times New Roman" w:hAnsi="Times New Roman" w:eastAsia="黑体" w:cs="Times New Roman"/>
-          <w:b/>
-          <w:color w:val="000000"/>
-        </w:rPr>
-        <w:t>Liu, R., Luo, C., Wang, Z., et al. 2017. Assessment of the genomic prediction accuracy for feed efficiency traits in meat-type chickens. PLoS ONE 12:e0173620. https://doi.org/10.1371/journal.pone.0173620.</w:t>
-      </w:r>
-    </w:p>
-    <w:p>
-      <w:pPr>
-        <w:pStyle w:val="Heading2"/>
-        <w:spacing w:before="240" w:after="120" w:line="312" w:lineRule="auto"/>
-        <w:jc w:val="left"/>
-      </w:pPr>
-      <w:r>
-        <w:rPr>
-          <w:rFonts w:ascii="Times New Roman" w:hAnsi="Times New Roman" w:eastAsia="黑体" w:cs="Times New Roman"/>
-          <w:b/>
+      <w:r>
+        <w:rPr>
           <w:color w:val="000000"/>
         </w:rPr>
         <w:t>Luo, C., Qu, H., Ma, J., et al. 2013. Genome-wide association study of antibody response to Newcastle disease virus in chicken. BMC Genetics 14:42. https://doi.org/10.1186/1471-2156-14-42.</w:t>
       </w:r>
     </w:p>
     <w:p>
-      <w:pPr>
-        <w:pStyle w:val="Heading2"/>
-        <w:spacing w:before="240" w:after="120" w:line="312" w:lineRule="auto"/>
-        <w:jc w:val="left"/>
-      </w:pPr>
-      <w:r>
-        <w:rPr>
-          <w:rFonts w:ascii="Times New Roman" w:hAnsi="Times New Roman" w:eastAsia="黑体" w:cs="Times New Roman"/>
-          <w:b/>
+      <w:r>
+        <w:rPr>
           <w:color w:val="000000"/>
         </w:rPr>
         <w:t>Luo, C., Qu, H., Ma, J., et al. 2014. A genome-wide association study identifies major loci affecting the immune response against infectious bronchitis virus in chicken. Infection, Genetics and Evolution 21:351-358. https://doi.org/10.1016/j.meegid.2013.12.004.</w:t>
       </w:r>
     </w:p>
     <w:p>
-      <w:pPr>
-        <w:pStyle w:val="Heading2"/>
-        <w:spacing w:before="240" w:after="120" w:line="312" w:lineRule="auto"/>
-        <w:jc w:val="left"/>
-      </w:pPr>
-      <w:r>
-        <w:rPr>
-          <w:rFonts w:ascii="Times New Roman" w:hAnsi="Times New Roman" w:eastAsia="黑体" w:cs="Times New Roman"/>
-          <w:b/>
+      <w:r>
+        <w:rPr>
           <w:color w:val="000000"/>
         </w:rPr>
         <w:t>MacLeod, I. M., Bowman, P. J., Vander Jagt, C. J., et al. 2016. Exploiting biological priors and sequence variants enhances QTL discovery and genomic prediction of complex traits. BMC Genomics 17:144. https://doi.org/10.1186/s12864-016-2443-6.</w:t>
       </w:r>
     </w:p>
     <w:p>
-      <w:pPr>
-        <w:pStyle w:val="Heading2"/>
-        <w:spacing w:before="240" w:after="120" w:line="312" w:lineRule="auto"/>
-        <w:jc w:val="left"/>
-      </w:pPr>
-      <w:r>
-        <w:rPr>
-          <w:rFonts w:ascii="Times New Roman" w:hAnsi="Times New Roman" w:eastAsia="黑体" w:cs="Times New Roman"/>
-          <w:b/>
+      <w:r>
+        <w:rPr>
           <w:color w:val="000000"/>
         </w:rPr>
         <w:t>McHugh, M. L. 2012. Interrater reliability: the kappa statistic. Biochemia Medica 22:276-282. https://doi.org/10.11613/BM.2012.031.</w:t>
       </w:r>
     </w:p>
     <w:p>
-      <w:pPr>
-        <w:pStyle w:val="Heading2"/>
-        <w:spacing w:before="240" w:after="120" w:line="312" w:lineRule="auto"/>
-        <w:jc w:val="left"/>
-      </w:pPr>
-      <w:r>
-        <w:rPr>
-          <w:rFonts w:ascii="Times New Roman" w:hAnsi="Times New Roman" w:eastAsia="黑体" w:cs="Times New Roman"/>
-          <w:b/>
+      <w:r>
+        <w:rPr>
           <w:color w:val="000000"/>
         </w:rPr>
         <w:t>Mebratie, W., Madsen, P., Hawken, R., Romé, H., Marois, D., Henshall, J., Bovenhuis, H., and Jensen, J. 2019. Genetic parameters for body weight and different definitions of residual feed intake in broiler chickens. Genetics Selection Evolution 51:53. https://doi.org/10.1186/s12711-019-0494-2.</w:t>
       </w:r>
     </w:p>
     <w:p>
-      <w:pPr>
-        <w:pStyle w:val="Heading2"/>
-        <w:spacing w:before="240" w:after="120" w:line="312" w:lineRule="auto"/>
-        <w:jc w:val="left"/>
-      </w:pPr>
-      <w:r>
-        <w:rPr>
-          <w:rFonts w:ascii="Times New Roman" w:hAnsi="Times New Roman" w:eastAsia="黑体" w:cs="Times New Roman"/>
-          <w:b/>
+      <w:r>
+        <w:rPr>
           <w:color w:val="000000"/>
         </w:rPr>
         <w:t>Ng, C. S., Wu, P., Foley, J., et al. 2012. The chicken frizzle feather is due to an α-keratin (KRT75) mutation that causes a defective rachis. PLoS Genetics 8:e1002748. https://doi.org/10.1371/journal.pgen.1002748.</w:t>
       </w:r>
     </w:p>
     <w:p>
-      <w:pPr>
-        <w:pStyle w:val="Heading2"/>
-        <w:spacing w:before="240" w:after="120" w:line="312" w:lineRule="auto"/>
-        <w:jc w:val="left"/>
-      </w:pPr>
-      <w:r>
-        <w:rPr>
-          <w:rFonts w:ascii="Times New Roman" w:hAnsi="Times New Roman" w:eastAsia="黑体" w:cs="Times New Roman"/>
-          <w:b/>
+      <w:r>
+        <w:rPr>
           <w:color w:val="000000"/>
         </w:rPr>
         <w:t>Rehm, H. L., Berg, J. S., Brooks, L. D., et al. 2015. ClinGen--the Clinical Genome Resource. New England Journal of Medicine 372:2235-2242. https://doi.org/10.1056/NEJMsr1406261.</w:t>
       </w:r>
     </w:p>
     <w:p>
-      <w:pPr>
-        <w:pStyle w:val="Heading2"/>
-        <w:spacing w:before="240" w:after="120" w:line="312" w:lineRule="auto"/>
-        <w:jc w:val="left"/>
-      </w:pPr>
-      <w:r>
-        <w:rPr>
-          <w:rFonts w:ascii="Times New Roman" w:hAnsi="Times New Roman" w:eastAsia="黑体" w:cs="Times New Roman"/>
-          <w:b/>
+      <w:r>
+        <w:rPr>
           <w:color w:val="000000"/>
         </w:rPr>
         <w:t>Rice, E. S., Alberdi, A., Alfieri, J., et al. 2023. A pangenome graph reference of 30 chicken genomes allows genotyping of large and complex structural variants. BMC Biology 21:267. https://doi.org/10.1186/s12915-023-01758-0.</w:t>
       </w:r>
     </w:p>
     <w:p>
-      <w:pPr>
-        <w:pStyle w:val="Heading2"/>
-        <w:spacing w:before="240" w:after="120" w:line="312" w:lineRule="auto"/>
-        <w:jc w:val="left"/>
-      </w:pPr>
-      <w:r>
-        <w:rPr>
-          <w:rFonts w:ascii="Times New Roman" w:hAnsi="Times New Roman" w:eastAsia="黑体" w:cs="Times New Roman"/>
-          <w:b/>
+      <w:r>
+        <w:rPr>
           <w:color w:val="000000"/>
         </w:rPr>
         <w:t>Richards, S., Aziz, N., Bale, S., et al. 2015. Standards and guidelines for the interpretation of sequence variants: a joint consensus recommendation of the American College of Medical Genetics and Genomics and the Association for Molecular Pathology. Genetics in Medicine 17:405-423. https://doi.org/10.1038/gim.2015.30.</w:t>
       </w:r>
     </w:p>
     <w:p>
-      <w:pPr>
-        <w:pStyle w:val="Heading2"/>
-        <w:spacing w:before="240" w:after="120" w:line="312" w:lineRule="auto"/>
-        <w:jc w:val="left"/>
-      </w:pPr>
-      <w:r>
-        <w:rPr>
-          <w:rFonts w:ascii="Times New Roman" w:hAnsi="Times New Roman" w:eastAsia="黑体" w:cs="Times New Roman"/>
-          <w:b/>
+      <w:r>
+        <w:rPr>
           <w:color w:val="000000"/>
         </w:rPr>
         <w:t>Rubin, C.-J., Zody, M. C., Eriksson, J., et al. 2010. Whole-genome resequencing reveals loci under selection during chicken domestication. Nature 464:587-591. https://doi.org/10.1038/nature08832.</w:t>
       </w:r>
     </w:p>
     <w:p>
-      <w:pPr>
-        <w:pStyle w:val="Heading2"/>
-        <w:spacing w:before="240" w:after="120" w:line="312" w:lineRule="auto"/>
-        <w:jc w:val="left"/>
-      </w:pPr>
-      <w:r>
-        <w:rPr>
-          <w:rFonts w:ascii="Times New Roman" w:hAnsi="Times New Roman" w:eastAsia="黑体" w:cs="Times New Roman"/>
-          <w:b/>
+      <w:r>
+        <w:rPr>
           <w:color w:val="000000"/>
         </w:rPr>
         <w:t>Samiullah, S., and Roberts, J. R. 2015. Eggshell color in brown-egg laying hens: a review. Poultry Science 94:2566-2575. https://doi.org/10.3382/ps/pev202.</w:t>
       </w:r>
     </w:p>
     <w:p>
-      <w:pPr>
-        <w:pStyle w:val="Heading2"/>
-        <w:spacing w:before="240" w:after="120" w:line="312" w:lineRule="auto"/>
-        <w:jc w:val="left"/>
-      </w:pPr>
-      <w:r>
-        <w:rPr>
-          <w:rFonts w:ascii="Times New Roman" w:hAnsi="Times New Roman" w:eastAsia="黑体" w:cs="Times New Roman"/>
-          <w:b/>
+      <w:r>
+        <w:rPr>
           <w:color w:val="000000"/>
         </w:rPr>
         <w:t>Shen, L., Bai, X., Zhao, L., et al. 2024. Integrative 3D genomics with multi-omics analysis and functional validation of genetic regulatory mechanisms of abdominal fat deposition in chickens. Nature Communications 15:9274. https://doi.org/10.1038/s41467-024-53692-6.</w:t>
       </w:r>
     </w:p>
     <w:p>
-      <w:pPr>
-        <w:pStyle w:val="Heading2"/>
-        <w:spacing w:before="240" w:after="120" w:line="312" w:lineRule="auto"/>
-        <w:jc w:val="left"/>
-      </w:pPr>
-      <w:r>
-        <w:rPr>
-          <w:rFonts w:ascii="Times New Roman" w:hAnsi="Times New Roman" w:eastAsia="黑体" w:cs="Times New Roman"/>
-          <w:b/>
+      <w:r>
+        <w:rPr>
           <w:color w:val="000000"/>
         </w:rPr>
         <w:t>Smith, J., Sadeyen, J.-R., Butter, C., Kaiser, P., and Burt, D. W. 2015. Analysis of the early immune response to infection by infectious bursal disease virus in chickens differing in their resistance to the disease. Journal of Virology 89:2469-2482. https://doi.org/10.1128/JVI.02828-14.</w:t>
       </w:r>
     </w:p>
     <w:p>
-      <w:pPr>
-        <w:pStyle w:val="Heading2"/>
-        <w:spacing w:before="240" w:after="120" w:line="312" w:lineRule="auto"/>
-        <w:jc w:val="left"/>
-      </w:pPr>
-      <w:r>
-        <w:rPr>
-          <w:rFonts w:ascii="Times New Roman" w:hAnsi="Times New Roman" w:eastAsia="黑体" w:cs="Times New Roman"/>
-          <w:b/>
+      <w:r>
+        <w:rPr>
           <w:color w:val="000000"/>
         </w:rPr>
         <w:t>Strande, N. T., Riggs, E. R., Buchanan, A. H., et al. 2017. Evaluating the clinical validity of gene-disease associations: an evidence-based framework developed by the Clinical Genome Resource. American Journal of Human Genetics 100:895-906. https://doi.org/10.1016/j.ajhg.2017.04.015.</w:t>
       </w:r>
     </w:p>
     <w:p>
-      <w:pPr>
-        <w:pStyle w:val="Heading2"/>
-        <w:spacing w:before="240" w:after="120" w:line="312" w:lineRule="auto"/>
-        <w:jc w:val="left"/>
-      </w:pPr>
-      <w:r>
-        <w:rPr>
-          <w:rFonts w:ascii="Times New Roman" w:hAnsi="Times New Roman" w:eastAsia="黑体" w:cs="Times New Roman"/>
-          <w:b/>
+      <w:r>
+        <w:rPr>
           <w:color w:val="000000"/>
         </w:rPr>
         <w:t>Tohidi, R., Idris, I. B., Malar Panandam, J., and Hair Bejo, M. 2013. The effects of polymorphisms in 7 candidate genes on resistance to Salmonella Enteritidis in native chickens. Poultry Science 92:900-909. https://doi.org/10.3382/ps.2012-02797.</w:t>
       </w:r>
     </w:p>
     <w:p>
-      <w:pPr>
-        <w:pStyle w:val="Heading2"/>
-        <w:spacing w:before="240" w:after="120" w:line="312" w:lineRule="auto"/>
-        <w:jc w:val="left"/>
-      </w:pPr>
-      <w:r>
-        <w:rPr>
-          <w:rFonts w:ascii="Times New Roman" w:hAnsi="Times New Roman" w:eastAsia="黑体" w:cs="Times New Roman"/>
-          <w:b/>
+      <w:r>
+        <w:rPr>
           <w:color w:val="000000"/>
         </w:rPr>
         <w:t>van de Lavoir, M.-C., Diamond, J. H., Leighton, P. A., et al. 2006. Germline transmission of genetically modified primordial germ cells. Nature 441:766-769. https://doi.org/10.1038/nature04831.</w:t>
       </w:r>
     </w:p>
     <w:p>
-      <w:pPr>
-        <w:pStyle w:val="Heading2"/>
-        <w:spacing w:before="240" w:after="120" w:line="312" w:lineRule="auto"/>
-        <w:jc w:val="left"/>
-      </w:pPr>
-      <w:r>
-        <w:rPr>
-          <w:rFonts w:ascii="Times New Roman" w:hAnsi="Times New Roman" w:eastAsia="黑体" w:cs="Times New Roman"/>
-          <w:b/>
+      <w:r>
+        <w:rPr>
+          <w:color w:val="000000"/>
+        </w:rPr>
+        <w:t>Wadood, A. A., and Zhang, X. 2024. The omics revolution in understanding chicken reproduction: a comprehensive review. Current Issues in Molecular Biology 46:6248-6266. https://doi.org/10.3390/cimb46060373.</w:t>
+      </w:r>
+    </w:p>
+    <w:p>
+      <w:r>
+        <w:rPr>
           <w:color w:val="000000"/>
         </w:rPr>
         <w:t>Wang, D., Zhu, Y., Dong, J., Zhi, Y., Wei, G., Kang, X., and Liu, X. 2025. Exploring the functional variations of key candidate genes affecting egg production by hypothalamic-pituitary-ovarian axis in chickens. Poultry Science 104:105027. https://doi.org/10.1016/j.psj.2025.105027.</w:t>
       </w:r>
     </w:p>
     <w:p>
-      <w:pPr>
-        <w:pStyle w:val="Heading2"/>
-        <w:spacing w:before="240" w:after="120" w:line="312" w:lineRule="auto"/>
-        <w:jc w:val="left"/>
-      </w:pPr>
-      <w:r>
-        <w:rPr>
-          <w:rFonts w:ascii="Times New Roman" w:hAnsi="Times New Roman" w:eastAsia="黑体" w:cs="Times New Roman"/>
-          <w:b/>
+      <w:r>
+        <w:rPr>
           <w:color w:val="000000"/>
         </w:rPr>
         <w:t>Wang, K., Hu, H., Tian, Y., et al. 2021. The chicken pan-genome reveals gene content variation and a promoter region deletion in IGF2BP1 affecting body size. Molecular Biology and Evolution 38:5066-5081. https://doi.org/10.1093/molbev/msab231.</w:t>
       </w:r>
     </w:p>
     <w:p>
-      <w:pPr>
-        <w:pStyle w:val="Heading2"/>
-        <w:spacing w:before="240" w:after="120" w:line="312" w:lineRule="auto"/>
-        <w:jc w:val="left"/>
-      </w:pPr>
-      <w:r>
-        <w:rPr>
-          <w:rFonts w:ascii="Times New Roman" w:hAnsi="Times New Roman" w:eastAsia="黑体" w:cs="Times New Roman"/>
-          <w:b/>
+      <w:r>
+        <w:rPr>
           <w:color w:val="000000"/>
         </w:rPr>
         <w:t>Wang, Y., Brahmakshatriya, V., Lupiani, B., et al. 2012. Associations of chicken Mx1 polymorphism with antiviral responses in avian influenza virus infected embryos and broilers. Poultry Science 91:3019-3024. https://doi.org/10.3382/ps.2012-02471.</w:t>
       </w:r>
     </w:p>
     <w:p>
-      <w:pPr>
-        <w:pStyle w:val="Heading2"/>
-        <w:spacing w:before="240" w:after="120" w:line="312" w:lineRule="auto"/>
-        <w:jc w:val="left"/>
-      </w:pPr>
-      <w:r>
-        <w:rPr>
-          <w:rFonts w:ascii="Times New Roman" w:hAnsi="Times New Roman" w:eastAsia="黑体" w:cs="Times New Roman"/>
-          <w:b/>
+      <w:r>
+        <w:rPr>
           <w:color w:val="000000"/>
         </w:rPr>
         <w:t>Wang, Y., Reid, A., Wilson, P. W., and Dunn, I. C. 2022. Identification of the core promoter and variants regulating chicken CCKAR expression. Genes 13:1083. https://doi.org/10.3390/genes13061083.</w:t>
       </w:r>
     </w:p>
     <w:p>
-      <w:pPr>
-        <w:pStyle w:val="Heading2"/>
-        <w:spacing w:before="240" w:after="120" w:line="312" w:lineRule="auto"/>
-        <w:jc w:val="left"/>
-      </w:pPr>
-      <w:r>
-        <w:rPr>
-          <w:rFonts w:ascii="Times New Roman" w:hAnsi="Times New Roman" w:eastAsia="黑体" w:cs="Times New Roman"/>
-          <w:b/>
+      <w:r>
+        <w:rPr>
+          <w:color w:val="000000"/>
+        </w:rPr>
+        <w:t>Wang, Z., and Zhou, Z. 2021. Research note: Fine mapping of sequence variants associated with body weight of Lueyang black-boned chicken in the CCKAR gene. Poultry Science 100:101448. https://doi.org/10.1016/j.psj.2021.101448.</w:t>
+      </w:r>
+    </w:p>
+    <w:p>
+      <w:r>
+        <w:rPr>
           <w:color w:val="000000"/>
         </w:rPr>
         <w:t>Wang, Z., Qu, L., Yao, J., et al. 2013. An EAV-HP insertion in 5 flanking region of SLCO1B3 causes blue eggshell in the chicken. PLoS Genetics 9:e1003183. https://doi.org/10.1371/journal.pgen.1003183.</w:t>
       </w:r>
     </w:p>
     <w:p>
-      <w:pPr>
-        <w:pStyle w:val="Heading2"/>
-        <w:spacing w:before="240" w:after="120" w:line="312" w:lineRule="auto"/>
-        <w:jc w:val="left"/>
-      </w:pPr>
-      <w:r>
-        <w:rPr>
-          <w:rFonts w:ascii="Times New Roman" w:hAnsi="Times New Roman" w:eastAsia="黑体" w:cs="Times New Roman"/>
-          <w:b/>
-          <w:color w:val="000000"/>
-        </w:rPr>
-        <w:t>Wang, Z., and Zhou, Z. 2021. Research note: Fine mapping of sequence variants associated with body weight of Lueyang black-boned chicken in the CCKAR gene. Poultry Science 100:101448. https://doi.org/10.1016/j.psj.2021.101448.</w:t>
-      </w:r>
-    </w:p>
-    <w:p>
-      <w:pPr>
-        <w:pStyle w:val="Heading2"/>
-        <w:spacing w:before="240" w:after="120" w:line="312" w:lineRule="auto"/>
-        <w:jc w:val="left"/>
-      </w:pPr>
-      <w:r>
-        <w:rPr>
-          <w:rFonts w:ascii="Times New Roman" w:hAnsi="Times New Roman" w:eastAsia="黑体" w:cs="Times New Roman"/>
-          <w:b/>
+      <w:r>
+        <w:rPr>
           <w:color w:val="000000"/>
         </w:rPr>
         <w:t>Whyte, J., Glover, J. D., Woodcock, M., et al. 2015. FGF, insulin, and SMAD signaling cooperate for avian primordial germ cell self-renewal. Stem Cell Reports 5:1171-1182. https://doi.org/10.1016/j.stemcr.2015.10.008.</w:t>
       </w:r>
     </w:p>
     <w:p>
-      <w:pPr>
-        <w:pStyle w:val="Heading2"/>
-        <w:spacing w:before="240" w:after="120" w:line="312" w:lineRule="auto"/>
-        <w:jc w:val="left"/>
-      </w:pPr>
-      <w:r>
-        <w:rPr>
-          <w:rFonts w:ascii="Times New Roman" w:hAnsi="Times New Roman" w:eastAsia="黑体" w:cs="Times New Roman"/>
-          <w:b/>
+      <w:r>
+        <w:rPr>
           <w:color w:val="000000"/>
         </w:rPr>
         <w:t>Wolc, A. 2014. Understanding genomic selection in poultry breeding. World's Poultry Science Journal 70:309-314. https://doi.org/10.1017/S0043933914000324.</w:t>
       </w:r>
     </w:p>
     <w:p>
-      <w:pPr>
-        <w:pStyle w:val="Heading2"/>
-        <w:spacing w:before="240" w:after="120" w:line="312" w:lineRule="auto"/>
-        <w:jc w:val="left"/>
-      </w:pPr>
-      <w:r>
-        <w:rPr>
-          <w:rFonts w:ascii="Times New Roman" w:hAnsi="Times New Roman" w:eastAsia="黑体" w:cs="Times New Roman"/>
-          <w:b/>
+      <w:r>
+        <w:rPr>
           <w:color w:val="000000"/>
         </w:rPr>
         <w:t>Wolc, A., Kranis, A., Arango, J., et al. 2016. Implementation of genomic selection in the poultry industry. Animal Frontiers 6:23-31. https://doi.org/10.2527/af.2016-0004.</w:t>
       </w:r>
     </w:p>
     <w:p>
-      <w:pPr>
-        <w:pStyle w:val="Heading2"/>
-        <w:spacing w:before="240" w:after="120" w:line="312" w:lineRule="auto"/>
-        <w:jc w:val="left"/>
-      </w:pPr>
-      <w:r>
-        <w:rPr>
-          <w:rFonts w:ascii="Times New Roman" w:hAnsi="Times New Roman" w:eastAsia="黑体" w:cs="Times New Roman"/>
-          <w:b/>
+      <w:r>
+        <w:rPr>
           <w:color w:val="000000"/>
         </w:rPr>
         <w:t>Wright, D., Boije, H., Meadows, J. R. S., et al. 2009. Copy number variation in intron 1 of SOX5 causes the pea-comb phenotype in chickens. PLoS Genetics 5:e1000512. https://doi.org/10.1371/journal.pgen.1000512.</w:t>
       </w:r>
     </w:p>
     <w:p>
-      <w:pPr>
-        <w:pStyle w:val="Heading2"/>
-        <w:spacing w:before="240" w:after="120" w:line="312" w:lineRule="auto"/>
-        <w:jc w:val="left"/>
-      </w:pPr>
-      <w:r>
-        <w:rPr>
-          <w:rFonts w:ascii="Times New Roman" w:hAnsi="Times New Roman" w:eastAsia="黑体" w:cs="Times New Roman"/>
-          <w:b/>
+      <w:r>
+        <w:rPr>
           <w:color w:val="000000"/>
         </w:rPr>
         <w:t>Xu, H., Nie, Q., and Zhang, X. 2013. Overview of genomic insights into chicken growth traits based on genome-wide association study and microRNA regulation. Current Genomics 14:137-146. https://doi.org/10.2174/1389202911314020006.</w:t>
       </w:r>
     </w:p>
     <w:p>
-      <w:pPr>
-        <w:pStyle w:val="Heading2"/>
-        <w:spacing w:before="240" w:after="120" w:line="312" w:lineRule="auto"/>
-        <w:jc w:val="left"/>
-      </w:pPr>
-      <w:r>
-        <w:rPr>
-          <w:rFonts w:ascii="Times New Roman" w:hAnsi="Times New Roman" w:eastAsia="黑体" w:cs="Times New Roman"/>
-          <w:b/>
+      <w:r>
+        <w:rPr>
+          <w:color w:val="000000"/>
+        </w:rPr>
+        <w:t>Yan, Y., Zhu, S., Jia, M., et al. 2024. Advances in single-cell transcriptomics in animal research. Journal of Animal Science and Biotechnology 15:102. https://doi.org/10.1186/s40104-024-01063-y.</w:t>
+      </w:r>
+    </w:p>
+    <w:p>
+      <w:r>
+        <w:rPr>
           <w:color w:val="000000"/>
         </w:rPr>
         <w:t>Yang, L., Xu, L., Wang, X., et al. 2021. Genome-wide association study and genomic prediction for growth traits in yellow-plumage chicken using genotyping-by-sequencing. Genetics Selection Evolution 53:82. https://doi.org/10.1186/s12711-021-00672-9.</w:t>
       </w:r>
     </w:p>
     <w:p>
-      <w:pPr>
-        <w:pStyle w:val="Heading2"/>
-        <w:spacing w:before="240" w:after="120" w:line="312" w:lineRule="auto"/>
-        <w:jc w:val="left"/>
-      </w:pPr>
-      <w:r>
-        <w:rPr>
-          <w:rFonts w:ascii="Times New Roman" w:hAnsi="Times New Roman" w:eastAsia="黑体" w:cs="Times New Roman"/>
-          <w:b/>
+      <w:r>
+        <w:rPr>
           <w:color w:val="000000"/>
         </w:rPr>
         <w:t>Zhang, M., Li, F., Sun, J.-W., et al. 2019. LncRNA IMFNCR promotes intramuscular adipocyte differentiation by sponging miR-128-3p and miR-27b-3p. Frontiers in Genetics 10:42. https://doi.org/10.3389/fgene.2019.00042.</w:t>
       </w:r>
     </w:p>
     <w:p>
-      <w:pPr>
-        <w:pStyle w:val="Heading2"/>
-        <w:spacing w:before="240" w:after="120" w:line="312" w:lineRule="auto"/>
-        <w:jc w:val="left"/>
-      </w:pPr>
-      <w:r>
-        <w:rPr>
-          <w:rFonts w:ascii="Times New Roman" w:hAnsi="Times New Roman" w:eastAsia="黑体" w:cs="Times New Roman"/>
-          <w:b/>
+      <w:r>
+        <w:rPr>
           <w:color w:val="000000"/>
         </w:rPr>
         <w:t>Zheng, J., Li, J., Zhang, X., et al. 2022. Identification of crucial genes and metabolites regulating the eggshell brownness in chicken. BMC Genomics 23:805. https://doi.org/10.1186/s12864-022-08987-7.</w:t>
       </w:r>
     </w:p>
     <w:p>
-      <w:pPr>
-        <w:pStyle w:val="Heading2"/>
-        <w:spacing w:before="240" w:after="120" w:line="312" w:lineRule="auto"/>
-        <w:jc w:val="left"/>
-      </w:pPr>
-      <w:r>
-        <w:rPr>
-          <w:rFonts w:ascii="Times New Roman" w:hAnsi="Times New Roman" w:eastAsia="黑体" w:cs="Times New Roman"/>
-          <w:b/>
+      <w:r>
+        <w:rPr>
           <w:color w:val="000000"/>
         </w:rPr>
         <w:t>Zhu, Z., Zhang, F., Hu, H., et al. 2016. Integration of summary data from GWAS and eQTL studies predicts complex trait gene targets. Nature Genetics 48:481-487. https://doi.org/10.1038/ng.3538.</w:t>
       </w:r>
     </w:p>
-    <w:p>
-      <w:pPr>
-        <w:sectPr>
-          <w:footerReference w:type="default" r:id="rId9"/>
-          <w:pgSz w:w="11906" w:h="16838"/>
-          <w:pgMar w:top="1440" w:bottom="1440" w:left="1587" w:right="1587" w:header="850" w:footer="850"/>
-        </w:sectPr>
-      </w:pPr>
-    </w:p>
+    <w:p/>
     <w:p>
       <w:pPr>
         <w:spacing w:before="120" w:after="80"/>

</xml_diff>